<commit_message>
Updated info in the Requirements doc.
</commit_message>
<xml_diff>
--- a/Requirements&Design.docx
+++ b/Requirements&Design.docx
@@ -386,7 +386,7 @@
       <w:pPr>
         <w:pStyle w:val="Heading1"/>
         <w:rPr>
-          <w:rFonts w:ascii="inherit" w:hAnsi="inherit" w:cs="Lucida Grande" w:hint="eastAsia"/>
+          <w:bdr w:val="none" w:sz="0" w:space="0" w:color="auto" w:frame="1"/>
         </w:rPr>
       </w:pPr>
       <w:r>
@@ -417,7 +417,24 @@
     </w:p>
     <w:p>
       <w:pPr>
+        <w:rPr>
+          <w:rFonts w:hint="eastAsia"/>
+        </w:rPr>
+      </w:pPr>
+    </w:p>
+    <w:p>
+      <w:pPr>
         <w:shd w:val="clear" w:color="auto" w:fill="FFFFFF"/>
+        <w:rPr>
+          <w:rFonts w:ascii="Arial" w:hAnsi="Arial" w:cs="Arial"/>
+          <w:iCs/>
+          <w:color w:val="000000"/>
+          <w:sz w:val="20"/>
+          <w:szCs w:val="20"/>
+          <w:bdr w:val="none" w:sz="0" w:space="0" w:color="auto" w:frame="1"/>
+        </w:rPr>
+      </w:pPr>
+      <w:r>
         <w:rPr>
           <w:rFonts w:ascii="Arial" w:hAnsi="Arial" w:cs="Arial"/>
           <w:i/>
@@ -426,19 +443,579 @@
           <w:szCs w:val="20"/>
           <w:bdr w:val="none" w:sz="0" w:space="0" w:color="auto" w:frame="1"/>
         </w:rPr>
-      </w:pPr>
-      <w:r>
-        <w:rPr>
-          <w:rFonts w:ascii="Arial" w:hAnsi="Arial" w:cs="Arial"/>
-          <w:i/>
-          <w:color w:val="000000"/>
+        <w:t xml:space="preserve"> </w:t>
+      </w:r>
+      <w:r>
+        <w:rPr>
+          <w:rFonts w:ascii="Arial" w:hAnsi="Arial" w:cs="Arial"/>
+          <w:iCs/>
+          <w:color w:val="000000" w:themeColor="text1"/>
           <w:sz w:val="20"/>
           <w:szCs w:val="20"/>
           <w:bdr w:val="none" w:sz="0" w:space="0" w:color="auto" w:frame="1"/>
         </w:rPr>
+        <w:t xml:space="preserve">Our application is a Magic: The Gathering card tracker which will allow users </w:t>
+      </w:r>
+      <w:r>
+        <w:rPr>
+          <w:rFonts w:ascii="Arial" w:hAnsi="Arial" w:cs="Arial"/>
+          <w:iCs/>
+          <w:color w:val="000000" w:themeColor="text1"/>
+          <w:sz w:val="20"/>
+          <w:szCs w:val="20"/>
+          <w:bdr w:val="none" w:sz="0" w:space="0" w:color="auto" w:frame="1"/>
+        </w:rPr>
+        <w:t>to be notified when their tracked cards reach a price that goes below a certain threshold.</w:t>
+      </w:r>
+      <w:r>
+        <w:rPr>
+          <w:rFonts w:ascii="Arial" w:hAnsi="Arial" w:cs="Arial"/>
+          <w:iCs/>
+          <w:color w:val="000000" w:themeColor="text1"/>
+          <w:sz w:val="20"/>
+          <w:szCs w:val="20"/>
+          <w:bdr w:val="none" w:sz="0" w:space="0" w:color="auto" w:frame="1"/>
+        </w:rPr>
+        <w:t xml:space="preserve"> Users will be able to sign up, and login using an email and password and then search for cards to track using various search information.</w:t>
+      </w:r>
+      <w:r>
+        <w:rPr>
+          <w:rFonts w:ascii="Arial" w:hAnsi="Arial" w:cs="Arial"/>
+          <w:iCs/>
+          <w:color w:val="000000" w:themeColor="text1"/>
+          <w:sz w:val="20"/>
+          <w:szCs w:val="20"/>
+          <w:bdr w:val="none" w:sz="0" w:space="0" w:color="auto" w:frame="1"/>
+        </w:rPr>
         <w:t xml:space="preserve"> </w:t>
       </w:r>
       <w:r>
+        <w:rPr>
+          <w:rFonts w:ascii="Arial" w:hAnsi="Arial" w:cs="Arial"/>
+          <w:iCs/>
+          <w:color w:val="000000" w:themeColor="text1"/>
+          <w:sz w:val="20"/>
+          <w:szCs w:val="20"/>
+          <w:bdr w:val="none" w:sz="0" w:space="0" w:color="auto" w:frame="1"/>
+        </w:rPr>
+        <w:t xml:space="preserve">It will be interacted with using a web browser interface </w:t>
+      </w:r>
+      <w:r>
+        <w:rPr>
+          <w:rFonts w:ascii="Arial" w:hAnsi="Arial" w:cs="Arial"/>
+          <w:iCs/>
+          <w:color w:val="000000" w:themeColor="text1"/>
+          <w:sz w:val="20"/>
+          <w:szCs w:val="20"/>
+          <w:bdr w:val="none" w:sz="0" w:space="0" w:color="auto" w:frame="1"/>
+        </w:rPr>
+        <w:t>with a supposed smooth and fast feel.</w:t>
+      </w:r>
+    </w:p>
+    <w:p>
+      <w:pPr>
+        <w:pStyle w:val="Heading1"/>
+        <w:rPr>
+          <w:bdr w:val="none" w:sz="0" w:space="0" w:color="auto" w:frame="1"/>
+        </w:rPr>
+      </w:pPr>
+      <w:r>
+        <w:rPr>
+          <w:bdr w:val="none" w:sz="0" w:space="0" w:color="auto" w:frame="1"/>
+        </w:rPr>
+        <w:t>Functional Requirements</w:t>
+      </w:r>
+      <w:r>
+        <w:rPr>
+          <w:bdr w:val="none" w:sz="0" w:space="0" w:color="auto" w:frame="1"/>
+        </w:rPr>
+        <w:t xml:space="preserve"> </w:t>
+      </w:r>
+      <w:r>
+        <w:rPr>
+          <w:bdr w:val="none" w:sz="0" w:space="0" w:color="auto" w:frame="1"/>
+        </w:rPr>
+        <w:t>(</w:t>
+      </w:r>
+      <w:r>
+        <w:rPr>
+          <w:bdr w:val="none" w:sz="0" w:space="0" w:color="auto" w:frame="1"/>
+        </w:rPr>
+        <w:t>10</w:t>
+      </w:r>
+      <w:r>
+        <w:rPr>
+          <w:bdr w:val="none" w:sz="0" w:space="0" w:color="auto" w:frame="1"/>
+        </w:rPr>
+        <w:t xml:space="preserve"> points)</w:t>
+      </w:r>
+    </w:p>
+    <w:p>
+      <w:pPr>
+        <w:rPr>
+          <w:rFonts w:hint="eastAsia"/>
+        </w:rPr>
+      </w:pPr>
+    </w:p>
+    <w:p>
+      <w:pPr>
+        <w:pStyle w:val="ListParagraph"/>
+        <w:numPr>
+          <w:ilvl w:val="0"/>
+          <w:numId w:val="41"/>
+        </w:numPr>
+        <w:shd w:val="clear" w:color="auto" w:fill="FFFFFF"/>
+        <w:rPr>
+          <w:rFonts w:ascii="Arial" w:hAnsi="Arial" w:cs="Arial"/>
+          <w:iCs/>
+          <w:color w:val="000000" w:themeColor="text1"/>
+          <w:sz w:val="20"/>
+          <w:szCs w:val="20"/>
+          <w:bdr w:val="none" w:sz="0" w:space="0" w:color="auto" w:frame="1"/>
+        </w:rPr>
+      </w:pPr>
+      <w:r>
+        <w:rPr>
+          <w:rFonts w:ascii="Arial" w:hAnsi="Arial" w:cs="Arial"/>
+          <w:iCs/>
+          <w:color w:val="000000" w:themeColor="text1"/>
+          <w:sz w:val="20"/>
+          <w:szCs w:val="20"/>
+          <w:bdr w:val="none" w:sz="0" w:space="0" w:color="auto" w:frame="1"/>
+        </w:rPr>
+        <w:t xml:space="preserve">After entering account information in the login process shouldn’t take more </w:t>
+      </w:r>
+      <w:r>
+        <w:rPr>
+          <w:rFonts w:ascii="Arial" w:hAnsi="Arial" w:cs="Arial"/>
+          <w:iCs/>
+          <w:color w:val="000000" w:themeColor="text1"/>
+          <w:sz w:val="20"/>
+          <w:szCs w:val="20"/>
+          <w:bdr w:val="none" w:sz="0" w:space="0" w:color="auto" w:frame="1"/>
+        </w:rPr>
+        <w:t>than</w:t>
+      </w:r>
+      <w:r>
+        <w:rPr>
+          <w:rFonts w:ascii="Arial" w:hAnsi="Arial" w:cs="Arial"/>
+          <w:iCs/>
+          <w:color w:val="000000" w:themeColor="text1"/>
+          <w:sz w:val="20"/>
+          <w:szCs w:val="20"/>
+          <w:bdr w:val="none" w:sz="0" w:space="0" w:color="auto" w:frame="1"/>
+        </w:rPr>
+        <w:t xml:space="preserve"> 3 seconds</w:t>
+      </w:r>
+      <w:r>
+        <w:rPr>
+          <w:rFonts w:ascii="Arial" w:hAnsi="Arial" w:cs="Arial"/>
+          <w:iCs/>
+          <w:color w:val="000000" w:themeColor="text1"/>
+          <w:sz w:val="20"/>
+          <w:szCs w:val="20"/>
+          <w:bdr w:val="none" w:sz="0" w:space="0" w:color="auto" w:frame="1"/>
+        </w:rPr>
+        <w:t>.</w:t>
+      </w:r>
+    </w:p>
+    <w:p>
+      <w:pPr>
+        <w:pStyle w:val="ListParagraph"/>
+        <w:numPr>
+          <w:ilvl w:val="0"/>
+          <w:numId w:val="41"/>
+        </w:numPr>
+        <w:shd w:val="clear" w:color="auto" w:fill="FFFFFF"/>
+        <w:rPr>
+          <w:rFonts w:ascii="Arial" w:hAnsi="Arial" w:cs="Arial"/>
+          <w:iCs/>
+          <w:color w:val="000000" w:themeColor="text1"/>
+          <w:sz w:val="20"/>
+          <w:szCs w:val="20"/>
+          <w:bdr w:val="none" w:sz="0" w:space="0" w:color="auto" w:frame="1"/>
+        </w:rPr>
+      </w:pPr>
+      <w:r>
+        <w:rPr>
+          <w:rFonts w:ascii="Arial" w:hAnsi="Arial" w:cs="Arial"/>
+          <w:iCs/>
+          <w:color w:val="000000" w:themeColor="text1"/>
+          <w:sz w:val="20"/>
+          <w:szCs w:val="20"/>
+          <w:bdr w:val="none" w:sz="0" w:space="0" w:color="auto" w:frame="1"/>
+        </w:rPr>
+        <w:t xml:space="preserve">After entering account information </w:t>
+      </w:r>
+      <w:r>
+        <w:rPr>
+          <w:rFonts w:ascii="Arial" w:hAnsi="Arial" w:cs="Arial"/>
+          <w:iCs/>
+          <w:color w:val="000000" w:themeColor="text1"/>
+          <w:sz w:val="20"/>
+          <w:szCs w:val="20"/>
+          <w:bdr w:val="none" w:sz="0" w:space="0" w:color="auto" w:frame="1"/>
+        </w:rPr>
+        <w:t xml:space="preserve">in the </w:t>
+      </w:r>
+      <w:r>
+        <w:rPr>
+          <w:rFonts w:ascii="Arial" w:hAnsi="Arial" w:cs="Arial"/>
+          <w:iCs/>
+          <w:color w:val="000000" w:themeColor="text1"/>
+          <w:sz w:val="20"/>
+          <w:szCs w:val="20"/>
+          <w:bdr w:val="none" w:sz="0" w:space="0" w:color="auto" w:frame="1"/>
+        </w:rPr>
+        <w:t>creation</w:t>
+      </w:r>
+      <w:r>
+        <w:rPr>
+          <w:rFonts w:ascii="Arial" w:hAnsi="Arial" w:cs="Arial"/>
+          <w:iCs/>
+          <w:color w:val="000000" w:themeColor="text1"/>
+          <w:sz w:val="20"/>
+          <w:szCs w:val="20"/>
+          <w:bdr w:val="none" w:sz="0" w:space="0" w:color="auto" w:frame="1"/>
+        </w:rPr>
+        <w:t xml:space="preserve"> account process shouldn’t take more than 5 seconds</w:t>
+      </w:r>
+      <w:r>
+        <w:rPr>
+          <w:rFonts w:ascii="Arial" w:hAnsi="Arial" w:cs="Arial"/>
+          <w:iCs/>
+          <w:color w:val="000000" w:themeColor="text1"/>
+          <w:sz w:val="20"/>
+          <w:szCs w:val="20"/>
+          <w:bdr w:val="none" w:sz="0" w:space="0" w:color="auto" w:frame="1"/>
+        </w:rPr>
+        <w:t>.</w:t>
+      </w:r>
+    </w:p>
+    <w:p>
+      <w:pPr>
+        <w:pStyle w:val="ListParagraph"/>
+        <w:numPr>
+          <w:ilvl w:val="0"/>
+          <w:numId w:val="41"/>
+        </w:numPr>
+        <w:shd w:val="clear" w:color="auto" w:fill="FFFFFF"/>
+        <w:rPr>
+          <w:rFonts w:ascii="Arial" w:hAnsi="Arial" w:cs="Arial"/>
+          <w:iCs/>
+          <w:color w:val="000000" w:themeColor="text1"/>
+          <w:sz w:val="20"/>
+          <w:szCs w:val="20"/>
+          <w:bdr w:val="none" w:sz="0" w:space="0" w:color="auto" w:frame="1"/>
+        </w:rPr>
+      </w:pPr>
+      <w:r>
+        <w:rPr>
+          <w:rFonts w:ascii="Arial" w:hAnsi="Arial" w:cs="Arial"/>
+          <w:iCs/>
+          <w:color w:val="000000" w:themeColor="text1"/>
+          <w:sz w:val="20"/>
+          <w:szCs w:val="20"/>
+          <w:bdr w:val="none" w:sz="0" w:space="0" w:color="auto" w:frame="1"/>
+        </w:rPr>
+        <w:t>The query to search for a certain card shouldn’t take longer than 7 seconds.</w:t>
+      </w:r>
+    </w:p>
+    <w:p>
+      <w:pPr>
+        <w:pStyle w:val="ListParagraph"/>
+        <w:numPr>
+          <w:ilvl w:val="0"/>
+          <w:numId w:val="41"/>
+        </w:numPr>
+        <w:shd w:val="clear" w:color="auto" w:fill="FFFFFF"/>
+        <w:rPr>
+          <w:rFonts w:ascii="Arial" w:hAnsi="Arial" w:cs="Arial"/>
+          <w:iCs/>
+          <w:color w:val="000000" w:themeColor="text1"/>
+          <w:sz w:val="20"/>
+          <w:szCs w:val="20"/>
+          <w:bdr w:val="none" w:sz="0" w:space="0" w:color="auto" w:frame="1"/>
+        </w:rPr>
+      </w:pPr>
+      <w:r>
+        <w:rPr>
+          <w:rFonts w:ascii="Arial" w:hAnsi="Arial" w:cs="Arial"/>
+          <w:iCs/>
+          <w:color w:val="000000" w:themeColor="text1"/>
+          <w:sz w:val="20"/>
+          <w:szCs w:val="20"/>
+          <w:bdr w:val="none" w:sz="0" w:space="0" w:color="auto" w:frame="1"/>
+        </w:rPr>
+        <w:t xml:space="preserve">The time it takes to add or remove a card from the </w:t>
+      </w:r>
+      <w:r>
+        <w:rPr>
+          <w:rFonts w:ascii="Arial" w:hAnsi="Arial" w:cs="Arial"/>
+          <w:iCs/>
+          <w:color w:val="000000" w:themeColor="text1"/>
+          <w:sz w:val="20"/>
+          <w:szCs w:val="20"/>
+          <w:bdr w:val="none" w:sz="0" w:space="0" w:color="auto" w:frame="1"/>
+        </w:rPr>
+        <w:t>user’s list should feel instant.</w:t>
+      </w:r>
+    </w:p>
+    <w:p>
+      <w:pPr>
+        <w:pStyle w:val="Heading1"/>
+        <w:rPr>
+          <w:bdr w:val="none" w:sz="0" w:space="0" w:color="auto" w:frame="1"/>
+        </w:rPr>
+      </w:pPr>
+      <w:r>
+        <w:rPr>
+          <w:bdr w:val="none" w:sz="0" w:space="0" w:color="auto" w:frame="1"/>
+        </w:rPr>
+        <w:t>Non-functional Requirements </w:t>
+      </w:r>
+      <w:r>
+        <w:rPr>
+          <w:bdr w:val="none" w:sz="0" w:space="0" w:color="auto" w:frame="1"/>
+        </w:rPr>
+        <w:t>(</w:t>
+      </w:r>
+      <w:r>
+        <w:rPr>
+          <w:bdr w:val="none" w:sz="0" w:space="0" w:color="auto" w:frame="1"/>
+        </w:rPr>
+        <w:t>10</w:t>
+      </w:r>
+      <w:r>
+        <w:rPr>
+          <w:bdr w:val="none" w:sz="0" w:space="0" w:color="auto" w:frame="1"/>
+        </w:rPr>
+        <w:t xml:space="preserve"> points)</w:t>
+      </w:r>
+    </w:p>
+    <w:p>
+      <w:pPr>
+        <w:rPr>
+          <w:rFonts w:hint="eastAsia"/>
+        </w:rPr>
+      </w:pPr>
+    </w:p>
+    <w:p>
+      <w:pPr>
+        <w:pStyle w:val="ListParagraph"/>
+        <w:numPr>
+          <w:ilvl w:val="0"/>
+          <w:numId w:val="40"/>
+        </w:numPr>
+        <w:shd w:val="clear" w:color="auto" w:fill="FFFFFF"/>
+        <w:rPr>
+          <w:rFonts w:ascii="Arial" w:hAnsi="Arial" w:cs="Arial"/>
+          <w:iCs/>
+          <w:color w:val="000000" w:themeColor="text1"/>
+          <w:sz w:val="20"/>
+          <w:szCs w:val="20"/>
+          <w:bdr w:val="none" w:sz="0" w:space="0" w:color="auto" w:frame="1"/>
+        </w:rPr>
+      </w:pPr>
+      <w:r>
+        <w:rPr>
+          <w:rFonts w:ascii="Arial" w:hAnsi="Arial" w:cs="Arial"/>
+          <w:iCs/>
+          <w:color w:val="000000" w:themeColor="text1"/>
+          <w:sz w:val="20"/>
+          <w:szCs w:val="20"/>
+          <w:bdr w:val="none" w:sz="0" w:space="0" w:color="auto" w:frame="1"/>
+        </w:rPr>
+        <w:t>Users should be able to login to the application or create an account using an email</w:t>
+      </w:r>
+      <w:r>
+        <w:rPr>
+          <w:rFonts w:ascii="Arial" w:hAnsi="Arial" w:cs="Arial"/>
+          <w:iCs/>
+          <w:color w:val="000000" w:themeColor="text1"/>
+          <w:sz w:val="20"/>
+          <w:szCs w:val="20"/>
+          <w:bdr w:val="none" w:sz="0" w:space="0" w:color="auto" w:frame="1"/>
+        </w:rPr>
+        <w:t>.</w:t>
+      </w:r>
+    </w:p>
+    <w:p>
+      <w:pPr>
+        <w:pStyle w:val="ListParagraph"/>
+        <w:numPr>
+          <w:ilvl w:val="0"/>
+          <w:numId w:val="40"/>
+        </w:numPr>
+        <w:shd w:val="clear" w:color="auto" w:fill="FFFFFF"/>
+        <w:rPr>
+          <w:rFonts w:ascii="Arial" w:hAnsi="Arial" w:cs="Arial"/>
+          <w:iCs/>
+          <w:color w:val="000000" w:themeColor="text1"/>
+          <w:sz w:val="20"/>
+          <w:szCs w:val="20"/>
+          <w:bdr w:val="none" w:sz="0" w:space="0" w:color="auto" w:frame="1"/>
+        </w:rPr>
+      </w:pPr>
+      <w:r>
+        <w:rPr>
+          <w:rFonts w:ascii="Arial" w:hAnsi="Arial" w:cs="Arial"/>
+          <w:iCs/>
+          <w:color w:val="000000" w:themeColor="text1"/>
+          <w:sz w:val="20"/>
+          <w:szCs w:val="20"/>
+          <w:bdr w:val="none" w:sz="0" w:space="0" w:color="auto" w:frame="1"/>
+        </w:rPr>
+        <w:t xml:space="preserve">Users should be able to search for cards </w:t>
+      </w:r>
+      <w:r>
+        <w:rPr>
+          <w:rFonts w:ascii="Arial" w:hAnsi="Arial" w:cs="Arial"/>
+          <w:iCs/>
+          <w:color w:val="000000" w:themeColor="text1"/>
+          <w:sz w:val="20"/>
+          <w:szCs w:val="20"/>
+          <w:bdr w:val="none" w:sz="0" w:space="0" w:color="auto" w:frame="1"/>
+        </w:rPr>
+        <w:t>to add to their list of tracked cards by using certain information like name.</w:t>
+      </w:r>
+    </w:p>
+    <w:p>
+      <w:pPr>
+        <w:pStyle w:val="ListParagraph"/>
+        <w:numPr>
+          <w:ilvl w:val="0"/>
+          <w:numId w:val="40"/>
+        </w:numPr>
+        <w:shd w:val="clear" w:color="auto" w:fill="FFFFFF"/>
+        <w:rPr>
+          <w:rFonts w:ascii="Arial" w:hAnsi="Arial" w:cs="Arial"/>
+          <w:iCs/>
+          <w:color w:val="000000" w:themeColor="text1"/>
+          <w:sz w:val="20"/>
+          <w:szCs w:val="20"/>
+          <w:bdr w:val="none" w:sz="0" w:space="0" w:color="auto" w:frame="1"/>
+        </w:rPr>
+      </w:pPr>
+      <w:r>
+        <w:rPr>
+          <w:rFonts w:ascii="Arial" w:hAnsi="Arial" w:cs="Arial"/>
+          <w:iCs/>
+          <w:color w:val="000000" w:themeColor="text1"/>
+          <w:sz w:val="20"/>
+          <w:szCs w:val="20"/>
+          <w:bdr w:val="none" w:sz="0" w:space="0" w:color="auto" w:frame="1"/>
+        </w:rPr>
+        <w:t xml:space="preserve">Card price data should periodically be refreshed </w:t>
+      </w:r>
+      <w:r>
+        <w:rPr>
+          <w:rFonts w:ascii="Arial" w:hAnsi="Arial" w:cs="Arial"/>
+          <w:iCs/>
+          <w:color w:val="000000" w:themeColor="text1"/>
+          <w:sz w:val="20"/>
+          <w:szCs w:val="20"/>
+          <w:bdr w:val="none" w:sz="0" w:space="0" w:color="auto" w:frame="1"/>
+        </w:rPr>
+        <w:t>to allow</w:t>
+      </w:r>
+      <w:r>
+        <w:rPr>
+          <w:rFonts w:ascii="Arial" w:hAnsi="Arial" w:cs="Arial"/>
+          <w:iCs/>
+          <w:color w:val="000000" w:themeColor="text1"/>
+          <w:sz w:val="20"/>
+          <w:szCs w:val="20"/>
+          <w:bdr w:val="none" w:sz="0" w:space="0" w:color="auto" w:frame="1"/>
+        </w:rPr>
+        <w:t xml:space="preserve"> users to receive alerts without requiring </w:t>
+      </w:r>
+      <w:r>
+        <w:rPr>
+          <w:rFonts w:ascii="Arial" w:hAnsi="Arial" w:cs="Arial"/>
+          <w:iCs/>
+          <w:color w:val="000000" w:themeColor="text1"/>
+          <w:sz w:val="20"/>
+          <w:szCs w:val="20"/>
+          <w:bdr w:val="none" w:sz="0" w:space="0" w:color="auto" w:frame="1"/>
+        </w:rPr>
+        <w:t>manual querying.</w:t>
+      </w:r>
+    </w:p>
+    <w:p>
+      <w:pPr>
+        <w:pStyle w:val="ListParagraph"/>
+        <w:numPr>
+          <w:ilvl w:val="0"/>
+          <w:numId w:val="40"/>
+        </w:numPr>
+        <w:shd w:val="clear" w:color="auto" w:fill="FFFFFF"/>
+        <w:rPr>
+          <w:rFonts w:ascii="Lucida Grande" w:hAnsi="Lucida Grande" w:cs="Lucida Grande"/>
+          <w:iCs/>
+          <w:color w:val="000000" w:themeColor="text1"/>
+        </w:rPr>
+      </w:pPr>
+      <w:r>
+        <w:rPr>
+          <w:rFonts w:ascii="Arial" w:hAnsi="Arial" w:cs="Arial"/>
+          <w:iCs/>
+          <w:color w:val="000000" w:themeColor="text1"/>
+          <w:sz w:val="20"/>
+          <w:szCs w:val="20"/>
+          <w:bdr w:val="none" w:sz="0" w:space="0" w:color="auto" w:frame="1"/>
+        </w:rPr>
+        <w:t>Users should be able to easily remove cards from their list.</w:t>
+      </w:r>
+    </w:p>
+    <w:p>
+      <w:pPr>
+        <w:pStyle w:val="Heading1"/>
+        <w:rPr>
+          <w:bdr w:val="none" w:sz="0" w:space="0" w:color="auto" w:frame="1"/>
+        </w:rPr>
+      </w:pPr>
+      <w:r>
+        <w:rPr>
+          <w:bdr w:val="none" w:sz="0" w:space="0" w:color="auto" w:frame="1"/>
+        </w:rPr>
+        <w:t xml:space="preserve">Use Case </w:t>
+      </w:r>
+      <w:r>
+        <w:rPr>
+          <w:bdr w:val="none" w:sz="0" w:space="0" w:color="auto" w:frame="1"/>
+        </w:rPr>
+        <w:t>Diagram</w:t>
+      </w:r>
+      <w:r>
+        <w:rPr>
+          <w:bdr w:val="none" w:sz="0" w:space="0" w:color="auto" w:frame="1"/>
+        </w:rPr>
+        <w:t> </w:t>
+      </w:r>
+      <w:r>
+        <w:rPr>
+          <w:bdr w:val="none" w:sz="0" w:space="0" w:color="auto" w:frame="1"/>
+        </w:rPr>
+        <w:t>(1</w:t>
+      </w:r>
+      <w:r>
+        <w:rPr>
+          <w:bdr w:val="none" w:sz="0" w:space="0" w:color="auto" w:frame="1"/>
+        </w:rPr>
+        <w:t>0</w:t>
+      </w:r>
+      <w:r>
+        <w:rPr>
+          <w:bdr w:val="none" w:sz="0" w:space="0" w:color="auto" w:frame="1"/>
+        </w:rPr>
+        <w:t xml:space="preserve"> points)</w:t>
+      </w:r>
+    </w:p>
+    <w:p/>
+    <w:p>
+      <w:pPr>
+        <w:shd w:val="clear" w:color="auto" w:fill="FFFFFF"/>
         <w:rPr>
           <w:rFonts w:ascii="Arial" w:hAnsi="Arial" w:cs="Arial"/>
           <w:i/>
@@ -447,9 +1024,7 @@
           <w:szCs w:val="20"/>
           <w:bdr w:val="none" w:sz="0" w:space="0" w:color="auto" w:frame="1"/>
         </w:rPr>
-        <w:t xml:space="preserve">Give a general overview of the system in </w:t>
-      </w:r>
-      <w:proofErr w:type="gramStart"/>
+      </w:pPr>
       <w:r>
         <w:rPr>
           <w:rFonts w:ascii="Arial" w:hAnsi="Arial" w:cs="Arial"/>
@@ -459,10 +1034,104 @@
           <w:szCs w:val="20"/>
           <w:bdr w:val="none" w:sz="0" w:space="0" w:color="auto" w:frame="1"/>
         </w:rPr>
-        <w:t>1-2 paragraphs</w:t>
-      </w:r>
-      <w:proofErr w:type="gramEnd"/>
-      <w:r>
+        <w:drawing>
+          <wp:inline distT="0" distB="0" distL="0" distR="0" wp14:anchorId="2AE43620" wp14:editId="0E9B5848">
+            <wp:extent cx="3648075" cy="3411626"/>
+            <wp:effectExtent l="0" t="0" r="0" b="0"/>
+            <wp:docPr id="992023220" name="Picture 1"/>
+            <wp:cNvGraphicFramePr>
+              <a:graphicFrameLocks xmlns:a="http://schemas.openxmlformats.org/drawingml/2006/main" noChangeAspect="1"/>
+            </wp:cNvGraphicFramePr>
+            <a:graphic xmlns:a="http://schemas.openxmlformats.org/drawingml/2006/main">
+              <a:graphicData uri="http://schemas.openxmlformats.org/drawingml/2006/picture">
+                <pic:pic xmlns:pic="http://schemas.openxmlformats.org/drawingml/2006/picture">
+                  <pic:nvPicPr>
+                    <pic:cNvPr id="992023220" name=""/>
+                    <pic:cNvPicPr/>
+                  </pic:nvPicPr>
+                  <pic:blipFill>
+                    <a:blip r:embed="rId5"/>
+                    <a:stretch>
+                      <a:fillRect/>
+                    </a:stretch>
+                  </pic:blipFill>
+                  <pic:spPr>
+                    <a:xfrm>
+                      <a:off x="0" y="0"/>
+                      <a:ext cx="3656507" cy="3419512"/>
+                    </a:xfrm>
+                    <a:prstGeom prst="rect">
+                      <a:avLst/>
+                    </a:prstGeom>
+                  </pic:spPr>
+                </pic:pic>
+              </a:graphicData>
+            </a:graphic>
+          </wp:inline>
+        </w:drawing>
+      </w:r>
+    </w:p>
+    <w:p>
+      <w:pPr>
+        <w:pStyle w:val="Heading1"/>
+        <w:rPr>
+          <w:bdr w:val="none" w:sz="0" w:space="0" w:color="auto" w:frame="1"/>
+        </w:rPr>
+      </w:pPr>
+      <w:r>
+        <w:rPr>
+          <w:bdr w:val="none" w:sz="0" w:space="0" w:color="auto" w:frame="1"/>
+        </w:rPr>
+        <w:lastRenderedPageBreak/>
+        <w:t>Class Diagram</w:t>
+      </w:r>
+      <w:r>
+        <w:rPr>
+          <w:bdr w:val="none" w:sz="0" w:space="0" w:color="auto" w:frame="1"/>
+        </w:rPr>
+        <w:t> </w:t>
+      </w:r>
+      <w:r>
+        <w:rPr>
+          <w:bdr w:val="none" w:sz="0" w:space="0" w:color="auto" w:frame="1"/>
+        </w:rPr>
+        <w:t>and/</w:t>
+      </w:r>
+      <w:r>
+        <w:rPr>
+          <w:bdr w:val="none" w:sz="0" w:space="0" w:color="auto" w:frame="1"/>
+        </w:rPr>
+        <w:t>or</w:t>
+      </w:r>
+      <w:r>
+        <w:rPr>
+          <w:bdr w:val="none" w:sz="0" w:space="0" w:color="auto" w:frame="1"/>
+        </w:rPr>
+        <w:t xml:space="preserve"> Sequence Diagram</w:t>
+      </w:r>
+      <w:r>
+        <w:rPr>
+          <w:bdr w:val="none" w:sz="0" w:space="0" w:color="auto" w:frame="1"/>
+        </w:rPr>
+        <w:t>s</w:t>
+      </w:r>
+      <w:r>
+        <w:rPr>
+          <w:bdr w:val="none" w:sz="0" w:space="0" w:color="auto" w:frame="1"/>
+        </w:rPr>
+        <w:t xml:space="preserve"> (15 points)</w:t>
+      </w:r>
+    </w:p>
+    <w:p>
+      <w:pPr>
+        <w:rPr>
+          <w:rFonts w:hint="eastAsia"/>
+        </w:rPr>
+      </w:pPr>
+    </w:p>
+    <w:p>
+      <w:pPr>
+        <w:shd w:val="clear" w:color="auto" w:fill="FFFFFF"/>
         <w:rPr>
           <w:rFonts w:ascii="Arial" w:hAnsi="Arial" w:cs="Arial"/>
           <w:i/>
@@ -471,9 +1140,7 @@
           <w:szCs w:val="20"/>
           <w:bdr w:val="none" w:sz="0" w:space="0" w:color="auto" w:frame="1"/>
         </w:rPr>
-        <w:t xml:space="preserve"> (</w:t>
-      </w:r>
-      <w:proofErr w:type="gramStart"/>
+      </w:pPr>
       <w:r>
         <w:rPr>
           <w:rFonts w:ascii="Arial" w:hAnsi="Arial" w:cs="Arial"/>
@@ -483,9 +1150,42 @@
           <w:szCs w:val="20"/>
           <w:bdr w:val="none" w:sz="0" w:space="0" w:color="auto" w:frame="1"/>
         </w:rPr>
-        <w:t>similar to</w:t>
-      </w:r>
-      <w:proofErr w:type="gramEnd"/>
+        <w:drawing>
+          <wp:inline distT="0" distB="0" distL="0" distR="0" wp14:anchorId="4A6516AD" wp14:editId="1DA913C2">
+            <wp:extent cx="5486400" cy="2760345"/>
+            <wp:effectExtent l="0" t="0" r="0" b="1905"/>
+            <wp:docPr id="26961240" name="Picture 1"/>
+            <wp:cNvGraphicFramePr>
+              <a:graphicFrameLocks xmlns:a="http://schemas.openxmlformats.org/drawingml/2006/main" noChangeAspect="1"/>
+            </wp:cNvGraphicFramePr>
+            <a:graphic xmlns:a="http://schemas.openxmlformats.org/drawingml/2006/main">
+              <a:graphicData uri="http://schemas.openxmlformats.org/drawingml/2006/picture">
+                <pic:pic xmlns:pic="http://schemas.openxmlformats.org/drawingml/2006/picture">
+                  <pic:nvPicPr>
+                    <pic:cNvPr id="26961240" name=""/>
+                    <pic:cNvPicPr/>
+                  </pic:nvPicPr>
+                  <pic:blipFill>
+                    <a:blip r:embed="rId6"/>
+                    <a:stretch>
+                      <a:fillRect/>
+                    </a:stretch>
+                  </pic:blipFill>
+                  <pic:spPr>
+                    <a:xfrm>
+                      <a:off x="0" y="0"/>
+                      <a:ext cx="5486400" cy="2760345"/>
+                    </a:xfrm>
+                    <a:prstGeom prst="rect">
+                      <a:avLst/>
+                    </a:prstGeom>
+                  </pic:spPr>
+                </pic:pic>
+              </a:graphicData>
+            </a:graphic>
+          </wp:inline>
+        </w:drawing>
+      </w:r>
       <w:r>
         <w:rPr>
           <w:rFonts w:ascii="Arial" w:hAnsi="Arial" w:cs="Arial"/>
@@ -495,54 +1195,103 @@
           <w:szCs w:val="20"/>
           <w:bdr w:val="none" w:sz="0" w:space="0" w:color="auto" w:frame="1"/>
         </w:rPr>
-        <w:t xml:space="preserve"> the one in the project proposal).</w:t>
+        <w:t xml:space="preserve"> </w:t>
       </w:r>
     </w:p>
     <w:p>
       <w:pPr>
         <w:pStyle w:val="Heading1"/>
-        <w:rPr>
-          <w:rFonts w:ascii="inherit" w:hAnsi="inherit" w:cs="Lucida Grande" w:hint="eastAsia"/>
-        </w:rPr>
-      </w:pPr>
-      <w:r>
-        <w:rPr>
-          <w:bdr w:val="none" w:sz="0" w:space="0" w:color="auto" w:frame="1"/>
-        </w:rPr>
-        <w:t>Functional Requirements</w:t>
-      </w:r>
-      <w:r>
-        <w:rPr>
-          <w:bdr w:val="none" w:sz="0" w:space="0" w:color="auto" w:frame="1"/>
-        </w:rPr>
-        <w:t xml:space="preserve"> </w:t>
-      </w:r>
-      <w:r>
-        <w:rPr>
-          <w:bdr w:val="none" w:sz="0" w:space="0" w:color="auto" w:frame="1"/>
-        </w:rPr>
-        <w:t>(</w:t>
-      </w:r>
-      <w:r>
-        <w:rPr>
-          <w:bdr w:val="none" w:sz="0" w:space="0" w:color="auto" w:frame="1"/>
-        </w:rPr>
-        <w:t>10</w:t>
-      </w:r>
-      <w:r>
-        <w:rPr>
-          <w:bdr w:val="none" w:sz="0" w:space="0" w:color="auto" w:frame="1"/>
-        </w:rPr>
-        <w:t xml:space="preserve"> points)</w:t>
+      </w:pPr>
+      <w:r>
+        <w:t>Operating Environment</w:t>
+      </w:r>
+      <w:r>
+        <w:t> </w:t>
+      </w:r>
+      <w:r>
+        <w:t>(5 points)</w:t>
+      </w:r>
+    </w:p>
+    <w:p/>
+    <w:p>
+      <w:pPr>
+        <w:shd w:val="clear" w:color="auto" w:fill="FFFFFF"/>
+        <w:rPr>
+          <w:rFonts w:ascii="Arial" w:hAnsi="Arial" w:cs="Arial"/>
+          <w:color w:val="000000" w:themeColor="text1"/>
+          <w:sz w:val="20"/>
+          <w:szCs w:val="20"/>
+          <w:bdr w:val="none" w:sz="0" w:space="0" w:color="auto" w:frame="1"/>
+        </w:rPr>
+      </w:pPr>
+      <w:r>
+        <w:rPr>
+          <w:rFonts w:ascii="Arial" w:hAnsi="Arial" w:cs="Arial"/>
+          <w:color w:val="000000" w:themeColor="text1"/>
+          <w:sz w:val="20"/>
+          <w:szCs w:val="20"/>
+          <w:bdr w:val="none" w:sz="0" w:space="0" w:color="auto" w:frame="1"/>
+        </w:rPr>
+        <w:t xml:space="preserve">The software is a web application that will most likely be referenceable by any web browser. The front-end setup will mainly be developed for large screen sizes like </w:t>
+      </w:r>
+      <w:r>
+        <w:rPr>
+          <w:rFonts w:ascii="Arial" w:hAnsi="Arial" w:cs="Arial"/>
+          <w:color w:val="000000" w:themeColor="text1"/>
+          <w:sz w:val="20"/>
+          <w:szCs w:val="20"/>
+          <w:bdr w:val="none" w:sz="0" w:space="0" w:color="auto" w:frame="1"/>
+        </w:rPr>
+        <w:t xml:space="preserve">computers and not setup with mobile screens in mind. If we choose to deploy the web </w:t>
+      </w:r>
+      <w:r>
+        <w:rPr>
+          <w:rFonts w:ascii="Arial" w:hAnsi="Arial" w:cs="Arial"/>
+          <w:color w:val="000000" w:themeColor="text1"/>
+          <w:sz w:val="20"/>
+          <w:szCs w:val="20"/>
+          <w:bdr w:val="none" w:sz="0" w:space="0" w:color="auto" w:frame="1"/>
+        </w:rPr>
+        <w:t>application,</w:t>
+      </w:r>
+      <w:r>
+        <w:rPr>
+          <w:rFonts w:ascii="Arial" w:hAnsi="Arial" w:cs="Arial"/>
+          <w:color w:val="000000" w:themeColor="text1"/>
+          <w:sz w:val="20"/>
+          <w:szCs w:val="20"/>
+          <w:bdr w:val="none" w:sz="0" w:space="0" w:color="auto" w:frame="1"/>
+        </w:rPr>
+        <w:t xml:space="preserve"> it will most likely run on a Linux cloud server.</w:t>
       </w:r>
     </w:p>
     <w:p>
       <w:pPr>
+        <w:pStyle w:val="Heading1"/>
+        <w:rPr>
+          <w:bdr w:val="none" w:sz="0" w:space="0" w:color="auto" w:frame="1"/>
+        </w:rPr>
+      </w:pPr>
+      <w:r>
+        <w:rPr>
+          <w:bdr w:val="none" w:sz="0" w:space="0" w:color="auto" w:frame="1"/>
+        </w:rPr>
+        <w:t xml:space="preserve">Assumptions and Dependencies </w:t>
+      </w:r>
+      <w:r>
+        <w:rPr>
+          <w:bdr w:val="none" w:sz="0" w:space="0" w:color="auto" w:frame="1"/>
+        </w:rPr>
+        <w:t>(5 points)</w:t>
+      </w:r>
+    </w:p>
+    <w:p/>
+    <w:p>
+      <w:pPr>
         <w:shd w:val="clear" w:color="auto" w:fill="FFFFFF"/>
         <w:rPr>
           <w:rFonts w:ascii="Arial" w:hAnsi="Arial" w:cs="Arial"/>
-          <w:i/>
-          <w:color w:val="EE0000"/>
+          <w:color w:val="000000" w:themeColor="text1"/>
           <w:sz w:val="20"/>
           <w:szCs w:val="20"/>
           <w:bdr w:val="none" w:sz="0" w:space="0" w:color="auto" w:frame="1"/>
@@ -551,2132 +1300,103 @@
       <w:r>
         <w:rPr>
           <w:rFonts w:ascii="Arial" w:hAnsi="Arial" w:cs="Arial"/>
-          <w:i/>
-          <w:color w:val="EE0000"/>
+          <w:color w:val="000000" w:themeColor="text1"/>
           <w:sz w:val="20"/>
           <w:szCs w:val="20"/>
           <w:bdr w:val="none" w:sz="0" w:space="0" w:color="auto" w:frame="1"/>
         </w:rPr>
-        <w:t>List</w:t>
-      </w:r>
-      <w:r>
-        <w:rPr>
-          <w:rFonts w:ascii="Arial" w:hAnsi="Arial" w:cs="Arial"/>
-          <w:i/>
-          <w:color w:val="EE0000"/>
+        <w:t xml:space="preserve">The product </w:t>
+      </w:r>
+      <w:r>
+        <w:rPr>
+          <w:rFonts w:ascii="Arial" w:hAnsi="Arial" w:cs="Arial"/>
+          <w:color w:val="000000" w:themeColor="text1"/>
           <w:sz w:val="20"/>
           <w:szCs w:val="20"/>
           <w:bdr w:val="none" w:sz="0" w:space="0" w:color="auto" w:frame="1"/>
         </w:rPr>
-        <w:t xml:space="preserve"> the </w:t>
-      </w:r>
-      <w:r>
-        <w:rPr>
-          <w:rFonts w:ascii="Arial" w:hAnsi="Arial" w:cs="Arial"/>
-          <w:b/>
-          <w:i/>
-          <w:color w:val="EE0000"/>
+        <w:t xml:space="preserve">will </w:t>
+      </w:r>
+      <w:r>
+        <w:rPr>
+          <w:rFonts w:ascii="Arial" w:hAnsi="Arial" w:cs="Arial"/>
+          <w:color w:val="000000" w:themeColor="text1"/>
           <w:sz w:val="20"/>
           <w:szCs w:val="20"/>
           <w:bdr w:val="none" w:sz="0" w:space="0" w:color="auto" w:frame="1"/>
         </w:rPr>
-        <w:t>functional requirements</w:t>
-      </w:r>
-      <w:r>
-        <w:rPr>
-          <w:rFonts w:ascii="Arial" w:hAnsi="Arial" w:cs="Arial"/>
-          <w:i/>
-          <w:color w:val="EE0000"/>
+        <w:t>only work assuming the required external APIs for card prices stay available. The hosting for the database systems is not determined yet.</w:t>
+      </w:r>
+      <w:r>
+        <w:rPr>
+          <w:rFonts w:ascii="Arial" w:hAnsi="Arial" w:cs="Arial"/>
+          <w:color w:val="000000" w:themeColor="text1"/>
           <w:sz w:val="20"/>
           <w:szCs w:val="20"/>
           <w:bdr w:val="none" w:sz="0" w:space="0" w:color="auto" w:frame="1"/>
         </w:rPr>
-        <w:t xml:space="preserve"> in sentences identified by numbers</w:t>
-      </w:r>
-      <w:r>
-        <w:rPr>
-          <w:rFonts w:ascii="Arial" w:hAnsi="Arial" w:cs="Arial"/>
-          <w:i/>
-          <w:color w:val="EE0000"/>
+        <w:t xml:space="preserve"> We will</w:t>
+      </w:r>
+      <w:r>
+        <w:rPr>
+          <w:rFonts w:ascii="Arial" w:hAnsi="Arial" w:cs="Arial"/>
+          <w:color w:val="000000" w:themeColor="text1"/>
           <w:sz w:val="20"/>
           <w:szCs w:val="20"/>
           <w:bdr w:val="none" w:sz="0" w:space="0" w:color="auto" w:frame="1"/>
         </w:rPr>
-        <w:t xml:space="preserve"> and for each requirement state if it is of high, medium, or low priority</w:t>
-      </w:r>
-      <w:r>
-        <w:rPr>
-          <w:rFonts w:ascii="Arial" w:hAnsi="Arial" w:cs="Arial"/>
-          <w:i/>
-          <w:color w:val="EE0000"/>
+        <w:t xml:space="preserve"> most likely be using Flask with Python and then NodeJS packages for handling </w:t>
+      </w:r>
+      <w:r>
+        <w:rPr>
+          <w:rFonts w:ascii="Arial" w:hAnsi="Arial" w:cs="Arial"/>
+          <w:color w:val="000000" w:themeColor="text1"/>
           <w:sz w:val="20"/>
           <w:szCs w:val="20"/>
           <w:bdr w:val="none" w:sz="0" w:space="0" w:color="auto" w:frame="1"/>
         </w:rPr>
-        <w:t xml:space="preserve">. Each </w:t>
-      </w:r>
-      <w:r>
-        <w:rPr>
-          <w:rFonts w:ascii="Arial" w:hAnsi="Arial" w:cs="Arial"/>
-          <w:i/>
-          <w:color w:val="EE0000"/>
+        <w:t>communication</w:t>
+      </w:r>
+      <w:r>
+        <w:rPr>
+          <w:rFonts w:ascii="Arial" w:hAnsi="Arial" w:cs="Arial"/>
+          <w:color w:val="000000" w:themeColor="text1"/>
           <w:sz w:val="20"/>
           <w:szCs w:val="20"/>
           <w:bdr w:val="none" w:sz="0" w:space="0" w:color="auto" w:frame="1"/>
         </w:rPr>
-        <w:t xml:space="preserve">functional </w:t>
-      </w:r>
-      <w:r>
-        <w:rPr>
-          <w:rFonts w:ascii="Arial" w:hAnsi="Arial" w:cs="Arial"/>
-          <w:i/>
-          <w:color w:val="EE0000"/>
+        <w:t xml:space="preserve"> between the front and back end.</w:t>
+      </w:r>
+      <w:r>
+        <w:rPr>
+          <w:rFonts w:ascii="Arial" w:hAnsi="Arial" w:cs="Arial"/>
+          <w:color w:val="000000" w:themeColor="text1"/>
           <w:sz w:val="20"/>
           <w:szCs w:val="20"/>
           <w:bdr w:val="none" w:sz="0" w:space="0" w:color="auto" w:frame="1"/>
         </w:rPr>
-        <w:t xml:space="preserve">requirement is something that the system shall do. </w:t>
-      </w:r>
-      <w:r>
-        <w:rPr>
-          <w:rFonts w:ascii="Arial" w:hAnsi="Arial" w:cs="Arial"/>
-          <w:i/>
-          <w:color w:val="EE0000"/>
+        <w:t xml:space="preserve"> If we choose to deploy the app for </w:t>
+      </w:r>
+      <w:r>
+        <w:rPr>
+          <w:rFonts w:ascii="Arial" w:hAnsi="Arial" w:cs="Arial"/>
+          <w:color w:val="000000" w:themeColor="text1"/>
           <w:sz w:val="20"/>
           <w:szCs w:val="20"/>
           <w:bdr w:val="none" w:sz="0" w:space="0" w:color="auto" w:frame="1"/>
         </w:rPr>
-        <w:t xml:space="preserve">Include all the details required such that there can be no misinterpretations of the requirements when read. </w:t>
-      </w:r>
-      <w:r>
-        <w:rPr>
-          <w:rFonts w:ascii="Arial" w:hAnsi="Arial" w:cs="Arial"/>
-          <w:i/>
-          <w:color w:val="EE0000"/>
+        <w:t>handling the periodic API price checks we will use a Linux server from a host like AWS, Azure, or DigitalOcean.</w:t>
+      </w:r>
+      <w:r>
+        <w:rPr>
+          <w:rFonts w:ascii="Arial" w:hAnsi="Arial" w:cs="Arial"/>
+          <w:color w:val="000000" w:themeColor="text1"/>
           <w:sz w:val="20"/>
           <w:szCs w:val="20"/>
           <w:bdr w:val="none" w:sz="0" w:space="0" w:color="auto" w:frame="1"/>
         </w:rPr>
-        <w:t>B</w:t>
-      </w:r>
-      <w:r>
-        <w:rPr>
-          <w:rFonts w:ascii="Arial" w:hAnsi="Arial" w:cs="Arial"/>
-          <w:i/>
-          <w:color w:val="EE0000"/>
-          <w:sz w:val="20"/>
-          <w:szCs w:val="20"/>
-          <w:bdr w:val="none" w:sz="0" w:space="0" w:color="auto" w:frame="1"/>
-        </w:rPr>
-        <w:t xml:space="preserve">e very specific about what </w:t>
-      </w:r>
-      <w:r>
-        <w:rPr>
-          <w:rFonts w:ascii="Arial" w:hAnsi="Arial" w:cs="Arial"/>
-          <w:i/>
-          <w:color w:val="EE0000"/>
-          <w:sz w:val="20"/>
-          <w:szCs w:val="20"/>
-          <w:bdr w:val="none" w:sz="0" w:space="0" w:color="auto" w:frame="1"/>
-        </w:rPr>
-        <w:t>the system needs to do</w:t>
-      </w:r>
-      <w:r>
-        <w:rPr>
-          <w:rFonts w:ascii="Arial" w:hAnsi="Arial" w:cs="Arial"/>
-          <w:i/>
-          <w:color w:val="EE0000"/>
-          <w:sz w:val="20"/>
-          <w:szCs w:val="20"/>
-          <w:bdr w:val="none" w:sz="0" w:space="0" w:color="auto" w:frame="1"/>
-        </w:rPr>
-        <w:t xml:space="preserve"> (not how, just </w:t>
-      </w:r>
-      <w:r>
-        <w:rPr>
-          <w:rFonts w:ascii="Arial" w:hAnsi="Arial" w:cs="Arial"/>
-          <w:i/>
-          <w:color w:val="EE0000"/>
-          <w:sz w:val="20"/>
-          <w:szCs w:val="20"/>
-          <w:u w:val="single"/>
-          <w:bdr w:val="none" w:sz="0" w:space="0" w:color="auto" w:frame="1"/>
-        </w:rPr>
-        <w:t>what</w:t>
-      </w:r>
-      <w:r>
-        <w:rPr>
-          <w:rFonts w:ascii="Arial" w:hAnsi="Arial" w:cs="Arial"/>
-          <w:i/>
-          <w:color w:val="EE0000"/>
-          <w:sz w:val="20"/>
-          <w:szCs w:val="20"/>
-          <w:bdr w:val="none" w:sz="0" w:space="0" w:color="auto" w:frame="1"/>
-        </w:rPr>
-        <w:t>).</w:t>
-      </w:r>
-      <w:r>
-        <w:rPr>
-          <w:rFonts w:ascii="Arial" w:hAnsi="Arial" w:cs="Arial"/>
-          <w:i/>
-          <w:color w:val="EE0000"/>
-          <w:sz w:val="20"/>
-          <w:szCs w:val="20"/>
-          <w:bdr w:val="none" w:sz="0" w:space="0" w:color="auto" w:frame="1"/>
-        </w:rPr>
         <w:t xml:space="preserve"> </w:t>
       </w:r>
-      <w:r>
-        <w:rPr>
-          <w:rFonts w:ascii="Arial" w:hAnsi="Arial" w:cs="Arial"/>
-          <w:i/>
-          <w:color w:val="EE0000"/>
-          <w:sz w:val="20"/>
-          <w:szCs w:val="20"/>
-          <w:bdr w:val="none" w:sz="0" w:space="0" w:color="auto" w:frame="1"/>
-        </w:rPr>
-        <w:t>You may provide a brief design rationale for any requirement which you feel requires explanation for how and/or why the requirement was derived.</w:t>
-      </w:r>
-    </w:p>
-    <w:p>
-      <w:pPr>
-        <w:pStyle w:val="Heading1"/>
-        <w:rPr>
-          <w:rFonts w:ascii="inherit" w:hAnsi="inherit" w:cs="Lucida Grande" w:hint="eastAsia"/>
-        </w:rPr>
-      </w:pPr>
-      <w:r>
-        <w:rPr>
-          <w:bdr w:val="none" w:sz="0" w:space="0" w:color="auto" w:frame="1"/>
-        </w:rPr>
-        <w:t>Non-functional Requirements </w:t>
-      </w:r>
-      <w:r>
-        <w:rPr>
-          <w:bdr w:val="none" w:sz="0" w:space="0" w:color="auto" w:frame="1"/>
-        </w:rPr>
-        <w:t>(</w:t>
-      </w:r>
-      <w:r>
-        <w:rPr>
-          <w:bdr w:val="none" w:sz="0" w:space="0" w:color="auto" w:frame="1"/>
-        </w:rPr>
-        <w:t>10</w:t>
-      </w:r>
-      <w:r>
-        <w:rPr>
-          <w:bdr w:val="none" w:sz="0" w:space="0" w:color="auto" w:frame="1"/>
-        </w:rPr>
-        <w:t xml:space="preserve"> points)</w:t>
-      </w:r>
-    </w:p>
-    <w:p>
-      <w:pPr>
-        <w:shd w:val="clear" w:color="auto" w:fill="FFFFFF"/>
-        <w:rPr>
-          <w:rFonts w:ascii="Lucida Grande" w:hAnsi="Lucida Grande" w:cs="Lucida Grande"/>
-          <w:i/>
-          <w:color w:val="EE0000"/>
-        </w:rPr>
-      </w:pPr>
-      <w:r>
-        <w:rPr>
-          <w:rFonts w:ascii="Arial" w:hAnsi="Arial" w:cs="Arial"/>
-          <w:i/>
-          <w:color w:val="EE0000"/>
-          <w:sz w:val="20"/>
-          <w:szCs w:val="20"/>
-          <w:bdr w:val="none" w:sz="0" w:space="0" w:color="auto" w:frame="1"/>
-        </w:rPr>
-        <w:t>List t</w:t>
-      </w:r>
-      <w:r>
-        <w:rPr>
-          <w:rFonts w:ascii="Arial" w:hAnsi="Arial" w:cs="Arial"/>
-          <w:i/>
-          <w:color w:val="EE0000"/>
-          <w:sz w:val="20"/>
-          <w:szCs w:val="20"/>
-          <w:bdr w:val="none" w:sz="0" w:space="0" w:color="auto" w:frame="1"/>
-        </w:rPr>
-        <w:t xml:space="preserve">he </w:t>
-      </w:r>
-      <w:r>
-        <w:rPr>
-          <w:rFonts w:ascii="Arial" w:hAnsi="Arial" w:cs="Arial"/>
-          <w:b/>
-          <w:i/>
-          <w:color w:val="EE0000"/>
-          <w:sz w:val="20"/>
-          <w:szCs w:val="20"/>
-          <w:bdr w:val="none" w:sz="0" w:space="0" w:color="auto" w:frame="1"/>
-        </w:rPr>
-        <w:t>non-functional requirements</w:t>
-      </w:r>
-      <w:r>
-        <w:rPr>
-          <w:rFonts w:ascii="Arial" w:hAnsi="Arial" w:cs="Arial"/>
-          <w:i/>
-          <w:color w:val="EE0000"/>
-          <w:sz w:val="20"/>
-          <w:szCs w:val="20"/>
-          <w:bdr w:val="none" w:sz="0" w:space="0" w:color="auto" w:frame="1"/>
-        </w:rPr>
-        <w:t xml:space="preserve"> </w:t>
-      </w:r>
-      <w:r>
-        <w:rPr>
-          <w:rFonts w:ascii="Arial" w:hAnsi="Arial" w:cs="Arial"/>
-          <w:i/>
-          <w:color w:val="EE0000"/>
-          <w:sz w:val="20"/>
-          <w:szCs w:val="20"/>
-          <w:bdr w:val="none" w:sz="0" w:space="0" w:color="auto" w:frame="1"/>
-        </w:rPr>
-        <w:t xml:space="preserve">of the system </w:t>
-      </w:r>
-      <w:r>
-        <w:rPr>
-          <w:rFonts w:ascii="Arial" w:hAnsi="Arial" w:cs="Arial"/>
-          <w:i/>
-          <w:color w:val="EE0000"/>
-          <w:sz w:val="20"/>
-          <w:szCs w:val="20"/>
-          <w:bdr w:val="none" w:sz="0" w:space="0" w:color="auto" w:frame="1"/>
-        </w:rPr>
-        <w:t>(</w:t>
-      </w:r>
-      <w:r>
-        <w:rPr>
-          <w:rFonts w:ascii="Arial" w:hAnsi="Arial" w:cs="Arial"/>
-          <w:i/>
-          <w:color w:val="EE0000"/>
-          <w:sz w:val="20"/>
-          <w:szCs w:val="20"/>
-          <w:bdr w:val="none" w:sz="0" w:space="0" w:color="auto" w:frame="1"/>
-        </w:rPr>
-        <w:t xml:space="preserve">any requirement </w:t>
-      </w:r>
-      <w:r>
-        <w:rPr>
-          <w:rFonts w:ascii="Arial" w:hAnsi="Arial" w:cs="Arial"/>
-          <w:i/>
-          <w:color w:val="EE0000"/>
-          <w:sz w:val="20"/>
-          <w:szCs w:val="20"/>
-          <w:bdr w:val="none" w:sz="0" w:space="0" w:color="auto" w:frame="1"/>
-        </w:rPr>
-        <w:t xml:space="preserve">referring to a property of the system, such as </w:t>
-      </w:r>
-      <w:r>
-        <w:rPr>
-          <w:rFonts w:ascii="Arial" w:hAnsi="Arial" w:cs="Arial"/>
-          <w:i/>
-          <w:color w:val="EE0000"/>
-          <w:sz w:val="20"/>
-          <w:szCs w:val="20"/>
-          <w:bdr w:val="none" w:sz="0" w:space="0" w:color="auto" w:frame="1"/>
-        </w:rPr>
-        <w:t>security, safety, software quality, performance, reliability, etc.)</w:t>
-      </w:r>
-      <w:r>
-        <w:rPr>
-          <w:rFonts w:ascii="Arial" w:hAnsi="Arial" w:cs="Arial"/>
-          <w:i/>
-          <w:color w:val="EE0000"/>
-          <w:sz w:val="20"/>
-          <w:szCs w:val="20"/>
-          <w:bdr w:val="none" w:sz="0" w:space="0" w:color="auto" w:frame="1"/>
-        </w:rPr>
-        <w:t xml:space="preserve"> You may provide a brief rationale for any requirement which you feel requires explanation as to how and/or why the requirement was derived.</w:t>
-      </w:r>
-    </w:p>
-    <w:p>
-      <w:pPr>
-        <w:pStyle w:val="Heading1"/>
-        <w:rPr>
-          <w:rFonts w:ascii="inherit" w:hAnsi="inherit" w:cs="Lucida Grande" w:hint="eastAsia"/>
-        </w:rPr>
-      </w:pPr>
-      <w:r>
-        <w:rPr>
-          <w:bdr w:val="none" w:sz="0" w:space="0" w:color="auto" w:frame="1"/>
-        </w:rPr>
-        <w:t xml:space="preserve">Use Case </w:t>
-      </w:r>
-      <w:r>
-        <w:rPr>
-          <w:bdr w:val="none" w:sz="0" w:space="0" w:color="auto" w:frame="1"/>
-        </w:rPr>
-        <w:t>Diagram</w:t>
-      </w:r>
-      <w:r>
-        <w:rPr>
-          <w:bdr w:val="none" w:sz="0" w:space="0" w:color="auto" w:frame="1"/>
-        </w:rPr>
-        <w:t> </w:t>
-      </w:r>
-      <w:r>
-        <w:rPr>
-          <w:bdr w:val="none" w:sz="0" w:space="0" w:color="auto" w:frame="1"/>
-        </w:rPr>
-        <w:t>(1</w:t>
-      </w:r>
-      <w:r>
-        <w:rPr>
-          <w:bdr w:val="none" w:sz="0" w:space="0" w:color="auto" w:frame="1"/>
-        </w:rPr>
-        <w:t>0</w:t>
-      </w:r>
-      <w:r>
-        <w:rPr>
-          <w:bdr w:val="none" w:sz="0" w:space="0" w:color="auto" w:frame="1"/>
-        </w:rPr>
-        <w:t xml:space="preserve"> points)</w:t>
-      </w:r>
-    </w:p>
-    <w:p>
-      <w:pPr>
-        <w:shd w:val="clear" w:color="auto" w:fill="FFFFFF"/>
-        <w:rPr>
-          <w:rFonts w:ascii="Arial" w:hAnsi="Arial" w:cs="Arial"/>
-          <w:i/>
-          <w:color w:val="EE0000"/>
-          <w:sz w:val="20"/>
-          <w:szCs w:val="20"/>
-          <w:bdr w:val="none" w:sz="0" w:space="0" w:color="auto" w:frame="1"/>
-        </w:rPr>
-      </w:pPr>
-      <w:r>
-        <w:rPr>
-          <w:rFonts w:ascii="Arial" w:hAnsi="Arial" w:cs="Arial"/>
-          <w:i/>
-          <w:color w:val="EE0000"/>
-          <w:sz w:val="20"/>
-          <w:szCs w:val="20"/>
-          <w:bdr w:val="none" w:sz="0" w:space="0" w:color="auto" w:frame="1"/>
-        </w:rPr>
-        <w:t xml:space="preserve">This section presents the </w:t>
-      </w:r>
-      <w:r>
-        <w:rPr>
-          <w:rFonts w:ascii="Arial" w:hAnsi="Arial" w:cs="Arial"/>
-          <w:b/>
-          <w:i/>
-          <w:color w:val="EE0000"/>
-          <w:sz w:val="20"/>
-          <w:szCs w:val="20"/>
-          <w:bdr w:val="none" w:sz="0" w:space="0" w:color="auto" w:frame="1"/>
-        </w:rPr>
-        <w:t>use case diagram</w:t>
-      </w:r>
-      <w:r>
-        <w:rPr>
-          <w:rFonts w:ascii="Arial" w:hAnsi="Arial" w:cs="Arial"/>
-          <w:i/>
-          <w:color w:val="EE0000"/>
-          <w:sz w:val="20"/>
-          <w:szCs w:val="20"/>
-          <w:bdr w:val="none" w:sz="0" w:space="0" w:color="auto" w:frame="1"/>
-        </w:rPr>
-        <w:t xml:space="preserve"> </w:t>
-      </w:r>
-      <w:r>
-        <w:rPr>
-          <w:rFonts w:ascii="Arial" w:hAnsi="Arial" w:cs="Arial"/>
-          <w:i/>
-          <w:color w:val="EE0000"/>
-          <w:sz w:val="20"/>
-          <w:szCs w:val="20"/>
-          <w:bdr w:val="none" w:sz="0" w:space="0" w:color="auto" w:frame="1"/>
-        </w:rPr>
-        <w:t xml:space="preserve">and the </w:t>
-      </w:r>
-      <w:r>
-        <w:rPr>
-          <w:rFonts w:ascii="Arial" w:hAnsi="Arial" w:cs="Arial"/>
-          <w:b/>
-          <w:bCs/>
-          <w:i/>
-          <w:color w:val="EE0000"/>
-          <w:sz w:val="20"/>
-          <w:szCs w:val="20"/>
-          <w:bdr w:val="none" w:sz="0" w:space="0" w:color="auto" w:frame="1"/>
-        </w:rPr>
-        <w:t>textual descriptions</w:t>
-      </w:r>
-      <w:r>
-        <w:rPr>
-          <w:rFonts w:ascii="Arial" w:hAnsi="Arial" w:cs="Arial"/>
-          <w:i/>
-          <w:color w:val="EE0000"/>
-          <w:sz w:val="20"/>
-          <w:szCs w:val="20"/>
-          <w:bdr w:val="none" w:sz="0" w:space="0" w:color="auto" w:frame="1"/>
-        </w:rPr>
-        <w:t xml:space="preserve"> of the use cases </w:t>
-      </w:r>
-      <w:r>
-        <w:rPr>
-          <w:rFonts w:ascii="Arial" w:hAnsi="Arial" w:cs="Arial"/>
-          <w:i/>
-          <w:color w:val="EE0000"/>
-          <w:sz w:val="20"/>
-          <w:szCs w:val="20"/>
-          <w:bdr w:val="none" w:sz="0" w:space="0" w:color="auto" w:frame="1"/>
-        </w:rPr>
-        <w:t xml:space="preserve">for the system under development. The use case diagram should contain all the use cases </w:t>
-      </w:r>
-      <w:r>
-        <w:rPr>
-          <w:rFonts w:ascii="Arial" w:hAnsi="Arial" w:cs="Arial"/>
-          <w:i/>
-          <w:color w:val="EE0000"/>
-          <w:sz w:val="20"/>
-          <w:szCs w:val="20"/>
-          <w:bdr w:val="none" w:sz="0" w:space="0" w:color="auto" w:frame="1"/>
-        </w:rPr>
-        <w:t xml:space="preserve">and relationships between them </w:t>
-      </w:r>
-      <w:r>
-        <w:rPr>
-          <w:rFonts w:ascii="Arial" w:hAnsi="Arial" w:cs="Arial"/>
-          <w:i/>
-          <w:color w:val="EE0000"/>
-          <w:sz w:val="20"/>
-          <w:szCs w:val="20"/>
-          <w:bdr w:val="none" w:sz="0" w:space="0" w:color="auto" w:frame="1"/>
-        </w:rPr>
-        <w:t>needed to describe the functionality to be developed.</w:t>
-      </w:r>
-      <w:r>
-        <w:rPr>
-          <w:rFonts w:ascii="Arial" w:hAnsi="Arial" w:cs="Arial"/>
-          <w:i/>
-          <w:color w:val="EE0000"/>
-          <w:sz w:val="20"/>
-          <w:szCs w:val="20"/>
-          <w:bdr w:val="none" w:sz="0" w:space="0" w:color="auto" w:frame="1"/>
-        </w:rPr>
-        <w:t xml:space="preserve"> If you discover new use cases between two </w:t>
-      </w:r>
-      <w:r>
-        <w:rPr>
-          <w:rFonts w:ascii="Arial" w:hAnsi="Arial" w:cs="Arial"/>
-          <w:i/>
-          <w:color w:val="EE0000"/>
-          <w:sz w:val="20"/>
-          <w:szCs w:val="20"/>
-          <w:bdr w:val="none" w:sz="0" w:space="0" w:color="auto" w:frame="1"/>
-        </w:rPr>
-        <w:t>increment</w:t>
-      </w:r>
-      <w:r>
-        <w:rPr>
-          <w:rFonts w:ascii="Arial" w:hAnsi="Arial" w:cs="Arial"/>
-          <w:i/>
-          <w:color w:val="EE0000"/>
-          <w:sz w:val="20"/>
-          <w:szCs w:val="20"/>
-          <w:bdr w:val="none" w:sz="0" w:space="0" w:color="auto" w:frame="1"/>
-        </w:rPr>
-        <w:t xml:space="preserve">s, update the diagram for your </w:t>
-      </w:r>
-      <w:r>
-        <w:rPr>
-          <w:rFonts w:ascii="Arial" w:hAnsi="Arial" w:cs="Arial"/>
-          <w:i/>
-          <w:color w:val="EE0000"/>
-          <w:sz w:val="20"/>
-          <w:szCs w:val="20"/>
-          <w:bdr w:val="none" w:sz="0" w:space="0" w:color="auto" w:frame="1"/>
-        </w:rPr>
-        <w:t>future</w:t>
-      </w:r>
-      <w:r>
-        <w:rPr>
-          <w:rFonts w:ascii="Arial" w:hAnsi="Arial" w:cs="Arial"/>
-          <w:i/>
-          <w:color w:val="EE0000"/>
-          <w:sz w:val="20"/>
-          <w:szCs w:val="20"/>
-          <w:bdr w:val="none" w:sz="0" w:space="0" w:color="auto" w:frame="1"/>
-        </w:rPr>
-        <w:t xml:space="preserve"> </w:t>
-      </w:r>
-      <w:r>
-        <w:rPr>
-          <w:rFonts w:ascii="Arial" w:hAnsi="Arial" w:cs="Arial"/>
-          <w:i/>
-          <w:color w:val="EE0000"/>
-          <w:sz w:val="20"/>
-          <w:szCs w:val="20"/>
-          <w:bdr w:val="none" w:sz="0" w:space="0" w:color="auto" w:frame="1"/>
-        </w:rPr>
-        <w:t>increments</w:t>
-      </w:r>
-      <w:r>
-        <w:rPr>
-          <w:rFonts w:ascii="Arial" w:hAnsi="Arial" w:cs="Arial"/>
-          <w:i/>
-          <w:color w:val="EE0000"/>
-          <w:sz w:val="20"/>
-          <w:szCs w:val="20"/>
-          <w:bdr w:val="none" w:sz="0" w:space="0" w:color="auto" w:frame="1"/>
-        </w:rPr>
-        <w:t>.</w:t>
-      </w:r>
-      <w:r>
-        <w:rPr>
-          <w:rFonts w:ascii="Arial" w:hAnsi="Arial" w:cs="Arial"/>
-          <w:i/>
-          <w:color w:val="EE0000"/>
-          <w:sz w:val="20"/>
-          <w:szCs w:val="20"/>
-          <w:bdr w:val="none" w:sz="0" w:space="0" w:color="auto" w:frame="1"/>
-        </w:rPr>
-        <w:t xml:space="preserve"> </w:t>
-      </w:r>
-    </w:p>
-    <w:p>
-      <w:pPr>
-        <w:shd w:val="clear" w:color="auto" w:fill="FFFFFF"/>
-        <w:rPr>
-          <w:rFonts w:ascii="Arial" w:hAnsi="Arial" w:cs="Arial"/>
-          <w:i/>
-          <w:color w:val="EE0000"/>
-          <w:sz w:val="20"/>
-          <w:szCs w:val="20"/>
-          <w:bdr w:val="none" w:sz="0" w:space="0" w:color="auto" w:frame="1"/>
-        </w:rPr>
-      </w:pPr>
-      <w:r>
-        <w:rPr>
-          <w:rFonts w:ascii="Arial" w:hAnsi="Arial" w:cs="Arial"/>
-          <w:b/>
-          <w:bCs/>
-          <w:i/>
-          <w:color w:val="EE0000"/>
-          <w:sz w:val="20"/>
-          <w:szCs w:val="20"/>
-          <w:bdr w:val="none" w:sz="0" w:space="0" w:color="auto" w:frame="1"/>
-        </w:rPr>
-        <w:t xml:space="preserve">Textual descriptions of </w:t>
-      </w:r>
-      <w:r>
-        <w:rPr>
-          <w:rFonts w:ascii="Arial" w:hAnsi="Arial" w:cs="Arial"/>
-          <w:b/>
-          <w:bCs/>
-          <w:i/>
-          <w:color w:val="EE0000"/>
-          <w:sz w:val="20"/>
-          <w:szCs w:val="20"/>
-          <w:bdr w:val="none" w:sz="0" w:space="0" w:color="auto" w:frame="1"/>
-        </w:rPr>
-        <w:t xml:space="preserve">use </w:t>
-      </w:r>
-      <w:r>
-        <w:rPr>
-          <w:rFonts w:ascii="Arial" w:hAnsi="Arial" w:cs="Arial"/>
-          <w:b/>
-          <w:bCs/>
-          <w:i/>
-          <w:color w:val="EE0000"/>
-          <w:sz w:val="20"/>
-          <w:szCs w:val="20"/>
-          <w:bdr w:val="none" w:sz="0" w:space="0" w:color="auto" w:frame="1"/>
-        </w:rPr>
-        <w:t>case</w:t>
-      </w:r>
-      <w:r>
-        <w:rPr>
-          <w:rFonts w:ascii="Arial" w:hAnsi="Arial" w:cs="Arial"/>
-          <w:b/>
-          <w:bCs/>
-          <w:i/>
-          <w:color w:val="EE0000"/>
-          <w:sz w:val="20"/>
-          <w:szCs w:val="20"/>
-          <w:bdr w:val="none" w:sz="0" w:space="0" w:color="auto" w:frame="1"/>
-        </w:rPr>
-        <w:t>s</w:t>
-      </w:r>
-      <w:r>
-        <w:rPr>
-          <w:rFonts w:ascii="Arial" w:hAnsi="Arial" w:cs="Arial"/>
-          <w:i/>
-          <w:color w:val="EE0000"/>
-          <w:sz w:val="20"/>
-          <w:szCs w:val="20"/>
-          <w:bdr w:val="none" w:sz="0" w:space="0" w:color="auto" w:frame="1"/>
-        </w:rPr>
-        <w:t xml:space="preserve">: For the first increment, the textual descriptions for </w:t>
-      </w:r>
-      <w:r>
-        <w:rPr>
-          <w:rFonts w:ascii="Arial" w:hAnsi="Arial" w:cs="Arial"/>
-          <w:i/>
-          <w:color w:val="EE0000"/>
-          <w:sz w:val="20"/>
-          <w:szCs w:val="20"/>
-          <w:bdr w:val="none" w:sz="0" w:space="0" w:color="auto" w:frame="1"/>
-        </w:rPr>
-        <w:t xml:space="preserve">the </w:t>
-      </w:r>
-      <w:r>
-        <w:rPr>
-          <w:rFonts w:ascii="Arial" w:hAnsi="Arial" w:cs="Arial"/>
-          <w:i/>
-          <w:color w:val="EE0000"/>
-          <w:sz w:val="20"/>
-          <w:szCs w:val="20"/>
-          <w:bdr w:val="none" w:sz="0" w:space="0" w:color="auto" w:frame="1"/>
-        </w:rPr>
-        <w:t xml:space="preserve">use cases are not required. However, </w:t>
-      </w:r>
-      <w:r>
-        <w:rPr>
-          <w:rFonts w:ascii="Arial" w:hAnsi="Arial" w:cs="Arial"/>
-          <w:i/>
-          <w:color w:val="EE0000"/>
-          <w:sz w:val="20"/>
-          <w:szCs w:val="20"/>
-          <w:bdr w:val="none" w:sz="0" w:space="0" w:color="auto" w:frame="1"/>
-        </w:rPr>
-        <w:t>the textual descriptions for all use cases discovered for your system</w:t>
-      </w:r>
-      <w:r>
-        <w:rPr>
-          <w:rFonts w:ascii="Arial" w:hAnsi="Arial" w:cs="Arial"/>
-          <w:i/>
-          <w:color w:val="EE0000"/>
-          <w:sz w:val="20"/>
-          <w:szCs w:val="20"/>
-          <w:bdr w:val="none" w:sz="0" w:space="0" w:color="auto" w:frame="1"/>
-        </w:rPr>
-        <w:t xml:space="preserve"> are required for </w:t>
-      </w:r>
-      <w:r>
-        <w:rPr>
-          <w:rFonts w:ascii="Arial" w:hAnsi="Arial" w:cs="Arial"/>
-          <w:i/>
-          <w:color w:val="EE0000"/>
-          <w:sz w:val="20"/>
-          <w:szCs w:val="20"/>
-          <w:bdr w:val="none" w:sz="0" w:space="0" w:color="auto" w:frame="1"/>
-        </w:rPr>
-        <w:t>the second and third iterations.</w:t>
-      </w:r>
-    </w:p>
-    <w:p>
-      <w:pPr>
-        <w:pStyle w:val="Heading1"/>
-        <w:rPr>
-          <w:rFonts w:ascii="inherit" w:hAnsi="inherit" w:cs="Lucida Grande" w:hint="eastAsia"/>
-        </w:rPr>
-      </w:pPr>
-      <w:r>
-        <w:rPr>
-          <w:bdr w:val="none" w:sz="0" w:space="0" w:color="auto" w:frame="1"/>
-        </w:rPr>
-        <w:t>Class Diagram</w:t>
-      </w:r>
-      <w:r>
-        <w:rPr>
-          <w:bdr w:val="none" w:sz="0" w:space="0" w:color="auto" w:frame="1"/>
-        </w:rPr>
-        <w:t> </w:t>
-      </w:r>
-      <w:r>
-        <w:rPr>
-          <w:bdr w:val="none" w:sz="0" w:space="0" w:color="auto" w:frame="1"/>
-        </w:rPr>
-        <w:t>and/</w:t>
-      </w:r>
-      <w:r>
-        <w:rPr>
-          <w:bdr w:val="none" w:sz="0" w:space="0" w:color="auto" w:frame="1"/>
-        </w:rPr>
-        <w:t>or</w:t>
-      </w:r>
-      <w:r>
-        <w:rPr>
-          <w:bdr w:val="none" w:sz="0" w:space="0" w:color="auto" w:frame="1"/>
-        </w:rPr>
-        <w:t xml:space="preserve"> Sequence Diagram</w:t>
-      </w:r>
-      <w:r>
-        <w:rPr>
-          <w:bdr w:val="none" w:sz="0" w:space="0" w:color="auto" w:frame="1"/>
-        </w:rPr>
-        <w:t>s</w:t>
-      </w:r>
-      <w:r>
-        <w:rPr>
-          <w:bdr w:val="none" w:sz="0" w:space="0" w:color="auto" w:frame="1"/>
-        </w:rPr>
-        <w:t xml:space="preserve"> (15 points)</w:t>
-      </w:r>
-    </w:p>
-    <w:p>
-      <w:pPr>
-        <w:shd w:val="clear" w:color="auto" w:fill="FFFFFF"/>
-        <w:rPr>
-          <w:rFonts w:ascii="Arial" w:hAnsi="Arial" w:cs="Arial"/>
-          <w:i/>
-          <w:color w:val="EE0000"/>
-          <w:sz w:val="20"/>
-          <w:szCs w:val="20"/>
-          <w:bdr w:val="none" w:sz="0" w:space="0" w:color="auto" w:frame="1"/>
-        </w:rPr>
-      </w:pPr>
-      <w:r>
-        <w:rPr>
-          <w:rFonts w:ascii="Arial" w:hAnsi="Arial" w:cs="Arial"/>
-          <w:i/>
-          <w:color w:val="EE0000"/>
-          <w:sz w:val="20"/>
-          <w:szCs w:val="20"/>
-          <w:bdr w:val="none" w:sz="0" w:space="0" w:color="auto" w:frame="1"/>
-        </w:rPr>
-        <w:t xml:space="preserve">This section presents a high-level overview of the anticipated system architecture using a </w:t>
-      </w:r>
-      <w:r>
-        <w:rPr>
-          <w:rFonts w:ascii="Arial" w:hAnsi="Arial" w:cs="Arial"/>
-          <w:b/>
-          <w:i/>
-          <w:color w:val="EE0000"/>
-          <w:sz w:val="20"/>
-          <w:szCs w:val="20"/>
-          <w:bdr w:val="none" w:sz="0" w:space="0" w:color="auto" w:frame="1"/>
-        </w:rPr>
-        <w:t>class</w:t>
-      </w:r>
-      <w:r>
-        <w:rPr>
-          <w:rFonts w:ascii="Arial" w:hAnsi="Arial" w:cs="Arial"/>
-          <w:i/>
-          <w:color w:val="EE0000"/>
-          <w:sz w:val="20"/>
-          <w:szCs w:val="20"/>
-          <w:bdr w:val="none" w:sz="0" w:space="0" w:color="auto" w:frame="1"/>
-        </w:rPr>
-        <w:t xml:space="preserve"> </w:t>
-      </w:r>
-      <w:r>
-        <w:rPr>
-          <w:rFonts w:ascii="Arial" w:hAnsi="Arial" w:cs="Arial"/>
-          <w:b/>
-          <w:i/>
-          <w:color w:val="EE0000"/>
-          <w:sz w:val="20"/>
-          <w:szCs w:val="20"/>
-          <w:bdr w:val="none" w:sz="0" w:space="0" w:color="auto" w:frame="1"/>
-        </w:rPr>
-        <w:t>diagram</w:t>
-      </w:r>
-      <w:r>
-        <w:rPr>
-          <w:rFonts w:ascii="Arial" w:hAnsi="Arial" w:cs="Arial"/>
-          <w:b/>
-          <w:i/>
-          <w:color w:val="EE0000"/>
-          <w:sz w:val="20"/>
-          <w:szCs w:val="20"/>
-          <w:bdr w:val="none" w:sz="0" w:space="0" w:color="auto" w:frame="1"/>
-        </w:rPr>
-        <w:t xml:space="preserve"> </w:t>
-      </w:r>
-      <w:r>
-        <w:rPr>
-          <w:rFonts w:ascii="Arial" w:hAnsi="Arial" w:cs="Arial"/>
-          <w:bCs/>
-          <w:i/>
-          <w:color w:val="EE0000"/>
-          <w:sz w:val="20"/>
-          <w:szCs w:val="20"/>
-          <w:bdr w:val="none" w:sz="0" w:space="0" w:color="auto" w:frame="1"/>
-        </w:rPr>
-        <w:t>and</w:t>
-      </w:r>
-      <w:r>
-        <w:rPr>
-          <w:rFonts w:ascii="Arial" w:hAnsi="Arial" w:cs="Arial"/>
-          <w:bCs/>
-          <w:i/>
-          <w:color w:val="EE0000"/>
-          <w:sz w:val="20"/>
-          <w:szCs w:val="20"/>
-          <w:bdr w:val="none" w:sz="0" w:space="0" w:color="auto" w:frame="1"/>
-        </w:rPr>
-        <w:t>/or</w:t>
-      </w:r>
-      <w:r>
-        <w:rPr>
-          <w:rFonts w:ascii="Arial" w:hAnsi="Arial" w:cs="Arial"/>
-          <w:b/>
-          <w:i/>
-          <w:color w:val="EE0000"/>
-          <w:sz w:val="20"/>
-          <w:szCs w:val="20"/>
-          <w:bdr w:val="none" w:sz="0" w:space="0" w:color="auto" w:frame="1"/>
-        </w:rPr>
-        <w:t xml:space="preserve"> sequence diagram</w:t>
-      </w:r>
-      <w:r>
-        <w:rPr>
-          <w:rFonts w:ascii="Arial" w:hAnsi="Arial" w:cs="Arial"/>
-          <w:b/>
-          <w:i/>
-          <w:color w:val="EE0000"/>
-          <w:sz w:val="20"/>
-          <w:szCs w:val="20"/>
-          <w:bdr w:val="none" w:sz="0" w:space="0" w:color="auto" w:frame="1"/>
-        </w:rPr>
-        <w:t>s</w:t>
-      </w:r>
-      <w:r>
-        <w:rPr>
-          <w:rFonts w:ascii="Arial" w:hAnsi="Arial" w:cs="Arial"/>
-          <w:i/>
-          <w:color w:val="EE0000"/>
-          <w:sz w:val="20"/>
-          <w:szCs w:val="20"/>
-          <w:bdr w:val="none" w:sz="0" w:space="0" w:color="auto" w:frame="1"/>
-        </w:rPr>
-        <w:t xml:space="preserve">. </w:t>
-      </w:r>
-    </w:p>
-    <w:p>
-      <w:pPr>
-        <w:shd w:val="clear" w:color="auto" w:fill="FFFFFF"/>
-        <w:rPr>
-          <w:rFonts w:ascii="Arial" w:hAnsi="Arial" w:cs="Arial"/>
-          <w:i/>
-          <w:color w:val="EE0000"/>
-          <w:sz w:val="10"/>
-          <w:szCs w:val="10"/>
-          <w:bdr w:val="none" w:sz="0" w:space="0" w:color="auto" w:frame="1"/>
-        </w:rPr>
-      </w:pPr>
-    </w:p>
-    <w:p>
-      <w:pPr>
-        <w:shd w:val="clear" w:color="auto" w:fill="FFFFFF"/>
-        <w:rPr>
-          <w:rFonts w:ascii="Arial" w:hAnsi="Arial" w:cs="Arial"/>
-          <w:b/>
-          <w:bCs/>
-          <w:i/>
-          <w:color w:val="EE0000"/>
-          <w:sz w:val="20"/>
-          <w:szCs w:val="20"/>
-          <w:bdr w:val="none" w:sz="0" w:space="0" w:color="auto" w:frame="1"/>
-        </w:rPr>
-      </w:pPr>
-      <w:r>
-        <w:rPr>
-          <w:rFonts w:ascii="Arial" w:hAnsi="Arial" w:cs="Arial"/>
-          <w:i/>
-          <w:color w:val="EE0000"/>
-          <w:sz w:val="20"/>
-          <w:szCs w:val="20"/>
-          <w:bdr w:val="none" w:sz="0" w:space="0" w:color="auto" w:frame="1"/>
-        </w:rPr>
-        <w:t xml:space="preserve">If the main </w:t>
-      </w:r>
-      <w:r>
-        <w:rPr>
-          <w:rFonts w:ascii="Arial" w:hAnsi="Arial" w:cs="Arial"/>
-          <w:b/>
-          <w:bCs/>
-          <w:i/>
-          <w:color w:val="EE0000"/>
-          <w:sz w:val="20"/>
-          <w:szCs w:val="20"/>
-          <w:bdr w:val="none" w:sz="0" w:space="0" w:color="auto" w:frame="1"/>
-        </w:rPr>
-        <w:t>paradigm</w:t>
-      </w:r>
-      <w:r>
-        <w:rPr>
-          <w:rFonts w:ascii="Arial" w:hAnsi="Arial" w:cs="Arial"/>
-          <w:i/>
-          <w:color w:val="EE0000"/>
-          <w:sz w:val="20"/>
-          <w:szCs w:val="20"/>
-          <w:bdr w:val="none" w:sz="0" w:space="0" w:color="auto" w:frame="1"/>
-        </w:rPr>
-        <w:t xml:space="preserve"> used in your project is </w:t>
-      </w:r>
-      <w:r>
-        <w:rPr>
-          <w:rFonts w:ascii="Arial" w:hAnsi="Arial" w:cs="Arial"/>
-          <w:b/>
-          <w:bCs/>
-          <w:i/>
-          <w:color w:val="EE0000"/>
-          <w:sz w:val="20"/>
-          <w:szCs w:val="20"/>
-          <w:bdr w:val="none" w:sz="0" w:space="0" w:color="auto" w:frame="1"/>
-        </w:rPr>
-        <w:t>Object Oriented</w:t>
-      </w:r>
-      <w:r>
-        <w:rPr>
-          <w:rFonts w:ascii="Arial" w:hAnsi="Arial" w:cs="Arial"/>
-          <w:i/>
-          <w:color w:val="EE0000"/>
-          <w:sz w:val="20"/>
-          <w:szCs w:val="20"/>
-          <w:bdr w:val="none" w:sz="0" w:space="0" w:color="auto" w:frame="1"/>
-        </w:rPr>
-        <w:t xml:space="preserve"> (i.e., you have classes or something that </w:t>
-      </w:r>
-      <w:r>
-        <w:rPr>
-          <w:rFonts w:ascii="Arial" w:hAnsi="Arial" w:cs="Arial"/>
-          <w:i/>
-          <w:color w:val="EE0000"/>
-          <w:sz w:val="20"/>
-          <w:szCs w:val="20"/>
-          <w:bdr w:val="none" w:sz="0" w:space="0" w:color="auto" w:frame="1"/>
-        </w:rPr>
-        <w:t>acts</w:t>
-      </w:r>
-      <w:r>
-        <w:rPr>
-          <w:rFonts w:ascii="Arial" w:hAnsi="Arial" w:cs="Arial"/>
-          <w:i/>
-          <w:color w:val="EE0000"/>
-          <w:sz w:val="20"/>
-          <w:szCs w:val="20"/>
-          <w:bdr w:val="none" w:sz="0" w:space="0" w:color="auto" w:frame="1"/>
-        </w:rPr>
-        <w:t xml:space="preserve"> similar to classes in your system), then draw the </w:t>
-      </w:r>
-      <w:r>
-        <w:rPr>
-          <w:rFonts w:ascii="Arial" w:hAnsi="Arial" w:cs="Arial"/>
-          <w:b/>
-          <w:bCs/>
-          <w:i/>
-          <w:color w:val="EE0000"/>
-          <w:sz w:val="20"/>
-          <w:szCs w:val="20"/>
-          <w:bdr w:val="none" w:sz="0" w:space="0" w:color="auto" w:frame="1"/>
-        </w:rPr>
-        <w:t>Class Diagram</w:t>
-      </w:r>
-      <w:r>
-        <w:rPr>
-          <w:rFonts w:ascii="Arial" w:hAnsi="Arial" w:cs="Arial"/>
-          <w:i/>
-          <w:color w:val="EE0000"/>
-          <w:sz w:val="20"/>
-          <w:szCs w:val="20"/>
-          <w:bdr w:val="none" w:sz="0" w:space="0" w:color="auto" w:frame="1"/>
-        </w:rPr>
-        <w:t xml:space="preserve"> </w:t>
-      </w:r>
-      <w:r>
-        <w:rPr>
-          <w:rFonts w:ascii="Arial" w:hAnsi="Arial" w:cs="Arial"/>
-          <w:b/>
-          <w:bCs/>
-          <w:i/>
-          <w:color w:val="EE0000"/>
-          <w:sz w:val="20"/>
-          <w:szCs w:val="20"/>
-          <w:bdr w:val="none" w:sz="0" w:space="0" w:color="auto" w:frame="1"/>
-        </w:rPr>
-        <w:t>of the entire system and Sequence Diagram</w:t>
-      </w:r>
-      <w:r>
-        <w:rPr>
-          <w:rFonts w:ascii="Arial" w:hAnsi="Arial" w:cs="Arial"/>
-          <w:b/>
-          <w:bCs/>
-          <w:i/>
-          <w:color w:val="EE0000"/>
-          <w:sz w:val="20"/>
-          <w:szCs w:val="20"/>
-          <w:bdr w:val="none" w:sz="0" w:space="0" w:color="auto" w:frame="1"/>
-        </w:rPr>
-        <w:t>s</w:t>
-      </w:r>
-      <w:r>
-        <w:rPr>
-          <w:rFonts w:ascii="Arial" w:hAnsi="Arial" w:cs="Arial"/>
-          <w:b/>
-          <w:bCs/>
-          <w:i/>
-          <w:color w:val="EE0000"/>
-          <w:sz w:val="20"/>
-          <w:szCs w:val="20"/>
-          <w:bdr w:val="none" w:sz="0" w:space="0" w:color="auto" w:frame="1"/>
-        </w:rPr>
-        <w:t xml:space="preserve"> </w:t>
-      </w:r>
-      <w:r>
-        <w:rPr>
-          <w:rFonts w:ascii="Arial" w:hAnsi="Arial" w:cs="Arial"/>
-          <w:b/>
-          <w:bCs/>
-          <w:i/>
-          <w:color w:val="EE0000"/>
-          <w:sz w:val="20"/>
-          <w:szCs w:val="20"/>
-          <w:bdr w:val="none" w:sz="0" w:space="0" w:color="auto" w:frame="1"/>
-        </w:rPr>
-        <w:t>for the</w:t>
-      </w:r>
-      <w:r>
-        <w:rPr>
-          <w:rFonts w:ascii="Arial" w:hAnsi="Arial" w:cs="Arial"/>
-          <w:b/>
-          <w:bCs/>
-          <w:i/>
-          <w:color w:val="EE0000"/>
-          <w:sz w:val="20"/>
-          <w:szCs w:val="20"/>
-          <w:bdr w:val="none" w:sz="0" w:space="0" w:color="auto" w:frame="1"/>
-        </w:rPr>
-        <w:t xml:space="preserve"> three</w:t>
-      </w:r>
-      <w:r>
-        <w:rPr>
-          <w:rFonts w:ascii="Arial" w:hAnsi="Arial" w:cs="Arial"/>
-          <w:b/>
-          <w:bCs/>
-          <w:i/>
-          <w:color w:val="EE0000"/>
-          <w:sz w:val="20"/>
-          <w:szCs w:val="20"/>
-          <w:bdr w:val="none" w:sz="0" w:space="0" w:color="auto" w:frame="1"/>
-        </w:rPr>
-        <w:t xml:space="preserve"> (3)</w:t>
-      </w:r>
-      <w:r>
-        <w:rPr>
-          <w:rFonts w:ascii="Arial" w:hAnsi="Arial" w:cs="Arial"/>
-          <w:b/>
-          <w:bCs/>
-          <w:i/>
-          <w:color w:val="EE0000"/>
-          <w:sz w:val="20"/>
-          <w:szCs w:val="20"/>
-          <w:bdr w:val="none" w:sz="0" w:space="0" w:color="auto" w:frame="1"/>
-        </w:rPr>
-        <w:t xml:space="preserve"> most important use cases in your system. </w:t>
-      </w:r>
-    </w:p>
-    <w:p>
-      <w:pPr>
-        <w:shd w:val="clear" w:color="auto" w:fill="FFFFFF"/>
-        <w:rPr>
-          <w:rFonts w:ascii="Arial" w:hAnsi="Arial" w:cs="Arial"/>
-          <w:i/>
-          <w:color w:val="EE0000"/>
-          <w:sz w:val="10"/>
-          <w:szCs w:val="10"/>
-          <w:bdr w:val="none" w:sz="0" w:space="0" w:color="auto" w:frame="1"/>
-        </w:rPr>
-      </w:pPr>
-    </w:p>
-    <w:p>
-      <w:pPr>
-        <w:shd w:val="clear" w:color="auto" w:fill="FFFFFF"/>
-        <w:rPr>
-          <w:rFonts w:ascii="Arial" w:hAnsi="Arial" w:cs="Arial"/>
-          <w:i/>
-          <w:color w:val="EE0000"/>
-          <w:sz w:val="20"/>
-          <w:szCs w:val="20"/>
-          <w:bdr w:val="none" w:sz="0" w:space="0" w:color="auto" w:frame="1"/>
-        </w:rPr>
-      </w:pPr>
-      <w:r>
-        <w:rPr>
-          <w:rFonts w:ascii="Arial" w:hAnsi="Arial" w:cs="Arial"/>
-          <w:i/>
-          <w:color w:val="EE0000"/>
-          <w:sz w:val="20"/>
-          <w:szCs w:val="20"/>
-          <w:bdr w:val="none" w:sz="0" w:space="0" w:color="auto" w:frame="1"/>
-        </w:rPr>
-        <w:t xml:space="preserve">If the main </w:t>
-      </w:r>
-      <w:r>
-        <w:rPr>
-          <w:rFonts w:ascii="Arial" w:hAnsi="Arial" w:cs="Arial"/>
-          <w:b/>
-          <w:bCs/>
-          <w:i/>
-          <w:color w:val="EE0000"/>
-          <w:sz w:val="20"/>
-          <w:szCs w:val="20"/>
-          <w:bdr w:val="none" w:sz="0" w:space="0" w:color="auto" w:frame="1"/>
-        </w:rPr>
-        <w:t>paradigm</w:t>
-      </w:r>
-      <w:r>
-        <w:rPr>
-          <w:rFonts w:ascii="Arial" w:hAnsi="Arial" w:cs="Arial"/>
-          <w:i/>
-          <w:color w:val="EE0000"/>
-          <w:sz w:val="20"/>
-          <w:szCs w:val="20"/>
-          <w:bdr w:val="none" w:sz="0" w:space="0" w:color="auto" w:frame="1"/>
-        </w:rPr>
-        <w:t xml:space="preserve"> in your system is </w:t>
-      </w:r>
-      <w:r>
-        <w:rPr>
-          <w:rFonts w:ascii="Arial" w:hAnsi="Arial" w:cs="Arial"/>
-          <w:b/>
-          <w:bCs/>
-          <w:i/>
-          <w:color w:val="EE0000"/>
-          <w:sz w:val="20"/>
-          <w:szCs w:val="20"/>
-          <w:u w:val="single"/>
-          <w:bdr w:val="none" w:sz="0" w:space="0" w:color="auto" w:frame="1"/>
-        </w:rPr>
-        <w:t>not</w:t>
-      </w:r>
-      <w:r>
-        <w:rPr>
-          <w:rFonts w:ascii="Arial" w:hAnsi="Arial" w:cs="Arial"/>
-          <w:b/>
-          <w:bCs/>
-          <w:i/>
-          <w:color w:val="EE0000"/>
-          <w:sz w:val="20"/>
-          <w:szCs w:val="20"/>
-          <w:bdr w:val="none" w:sz="0" w:space="0" w:color="auto" w:frame="1"/>
-        </w:rPr>
-        <w:t xml:space="preserve"> Object Oriented</w:t>
-      </w:r>
-      <w:r>
-        <w:rPr>
-          <w:rFonts w:ascii="Arial" w:hAnsi="Arial" w:cs="Arial"/>
-          <w:i/>
-          <w:color w:val="EE0000"/>
-          <w:sz w:val="20"/>
-          <w:szCs w:val="20"/>
-          <w:bdr w:val="none" w:sz="0" w:space="0" w:color="auto" w:frame="1"/>
-        </w:rPr>
-        <w:t xml:space="preserve"> (i.e., you </w:t>
-      </w:r>
-      <w:r>
-        <w:rPr>
-          <w:rFonts w:ascii="Arial" w:hAnsi="Arial" w:cs="Arial"/>
-          <w:b/>
-          <w:bCs/>
-          <w:i/>
-          <w:color w:val="EE0000"/>
-          <w:sz w:val="20"/>
-          <w:szCs w:val="20"/>
-          <w:u w:val="single"/>
-          <w:bdr w:val="none" w:sz="0" w:space="0" w:color="auto" w:frame="1"/>
-        </w:rPr>
-        <w:t>do not</w:t>
-      </w:r>
-      <w:r>
-        <w:rPr>
-          <w:rFonts w:ascii="Arial" w:hAnsi="Arial" w:cs="Arial"/>
-          <w:b/>
-          <w:bCs/>
-          <w:i/>
-          <w:color w:val="EE0000"/>
-          <w:sz w:val="20"/>
-          <w:szCs w:val="20"/>
-          <w:bdr w:val="none" w:sz="0" w:space="0" w:color="auto" w:frame="1"/>
-        </w:rPr>
-        <w:t xml:space="preserve"> </w:t>
-      </w:r>
-      <w:r>
-        <w:rPr>
-          <w:rFonts w:ascii="Arial" w:hAnsi="Arial" w:cs="Arial"/>
-          <w:i/>
-          <w:color w:val="EE0000"/>
-          <w:sz w:val="20"/>
-          <w:szCs w:val="20"/>
-          <w:bdr w:val="none" w:sz="0" w:space="0" w:color="auto" w:frame="1"/>
-        </w:rPr>
-        <w:t>have classes</w:t>
-      </w:r>
-      <w:r>
-        <w:rPr>
-          <w:rFonts w:ascii="Arial" w:hAnsi="Arial" w:cs="Arial"/>
-          <w:b/>
-          <w:bCs/>
-          <w:i/>
-          <w:color w:val="EE0000"/>
-          <w:sz w:val="20"/>
-          <w:szCs w:val="20"/>
-          <w:bdr w:val="none" w:sz="0" w:space="0" w:color="auto" w:frame="1"/>
-        </w:rPr>
-        <w:t xml:space="preserve"> </w:t>
-      </w:r>
-      <w:r>
-        <w:rPr>
-          <w:rFonts w:ascii="Arial" w:hAnsi="Arial" w:cs="Arial"/>
-          <w:i/>
-          <w:color w:val="EE0000"/>
-          <w:sz w:val="20"/>
-          <w:szCs w:val="20"/>
-          <w:bdr w:val="none" w:sz="0" w:space="0" w:color="auto" w:frame="1"/>
-        </w:rPr>
-        <w:t xml:space="preserve">or anything similar to classes in your system) then only draw </w:t>
-      </w:r>
-      <w:r>
-        <w:rPr>
-          <w:rFonts w:ascii="Arial" w:hAnsi="Arial" w:cs="Arial"/>
-          <w:b/>
-          <w:bCs/>
-          <w:i/>
-          <w:color w:val="EE0000"/>
-          <w:sz w:val="20"/>
-          <w:szCs w:val="20"/>
-          <w:bdr w:val="none" w:sz="0" w:space="0" w:color="auto" w:frame="1"/>
-        </w:rPr>
-        <w:t>Sequence Diagram</w:t>
-      </w:r>
-      <w:r>
-        <w:rPr>
-          <w:rFonts w:ascii="Arial" w:hAnsi="Arial" w:cs="Arial"/>
-          <w:b/>
-          <w:bCs/>
-          <w:i/>
-          <w:color w:val="EE0000"/>
-          <w:sz w:val="20"/>
-          <w:szCs w:val="20"/>
-          <w:bdr w:val="none" w:sz="0" w:space="0" w:color="auto" w:frame="1"/>
-        </w:rPr>
-        <w:t>s</w:t>
-      </w:r>
-      <w:r>
-        <w:rPr>
-          <w:rFonts w:ascii="Arial" w:hAnsi="Arial" w:cs="Arial"/>
-          <w:i/>
-          <w:color w:val="EE0000"/>
-          <w:sz w:val="20"/>
-          <w:szCs w:val="20"/>
-          <w:bdr w:val="none" w:sz="0" w:space="0" w:color="auto" w:frame="1"/>
-        </w:rPr>
-        <w:t xml:space="preserve">, </w:t>
-      </w:r>
-      <w:r>
-        <w:rPr>
-          <w:rFonts w:ascii="Arial" w:hAnsi="Arial" w:cs="Arial"/>
-          <w:b/>
-          <w:bCs/>
-          <w:i/>
-          <w:color w:val="EE0000"/>
-          <w:sz w:val="20"/>
-          <w:szCs w:val="20"/>
-          <w:bdr w:val="none" w:sz="0" w:space="0" w:color="auto" w:frame="1"/>
-        </w:rPr>
-        <w:t xml:space="preserve">but for </w:t>
-      </w:r>
-      <w:r>
-        <w:rPr>
-          <w:rFonts w:ascii="Arial" w:hAnsi="Arial" w:cs="Arial"/>
-          <w:b/>
-          <w:bCs/>
-          <w:i/>
-          <w:color w:val="EE0000"/>
-          <w:sz w:val="20"/>
-          <w:szCs w:val="20"/>
-          <w:u w:val="single"/>
-          <w:bdr w:val="none" w:sz="0" w:space="0" w:color="auto" w:frame="1"/>
-        </w:rPr>
-        <w:t>all</w:t>
-      </w:r>
-      <w:r>
-        <w:rPr>
-          <w:rFonts w:ascii="Arial" w:hAnsi="Arial" w:cs="Arial"/>
-          <w:b/>
-          <w:bCs/>
-          <w:i/>
-          <w:color w:val="EE0000"/>
-          <w:sz w:val="20"/>
-          <w:szCs w:val="20"/>
-          <w:bdr w:val="none" w:sz="0" w:space="0" w:color="auto" w:frame="1"/>
-        </w:rPr>
-        <w:t xml:space="preserve"> the use cases of </w:t>
-      </w:r>
-      <w:r>
-        <w:rPr>
-          <w:rFonts w:ascii="Arial" w:hAnsi="Arial" w:cs="Arial"/>
-          <w:b/>
-          <w:bCs/>
-          <w:i/>
-          <w:color w:val="EE0000"/>
-          <w:sz w:val="20"/>
-          <w:szCs w:val="20"/>
-          <w:bdr w:val="none" w:sz="0" w:space="0" w:color="auto" w:frame="1"/>
-        </w:rPr>
-        <w:t>your</w:t>
-      </w:r>
-      <w:r>
-        <w:rPr>
-          <w:rFonts w:ascii="Arial" w:hAnsi="Arial" w:cs="Arial"/>
-          <w:b/>
-          <w:bCs/>
-          <w:i/>
-          <w:color w:val="EE0000"/>
-          <w:sz w:val="20"/>
-          <w:szCs w:val="20"/>
-          <w:bdr w:val="none" w:sz="0" w:space="0" w:color="auto" w:frame="1"/>
-        </w:rPr>
-        <w:t xml:space="preserve"> system.</w:t>
-      </w:r>
-      <w:r>
-        <w:rPr>
-          <w:rFonts w:ascii="Arial" w:hAnsi="Arial" w:cs="Arial"/>
-          <w:i/>
-          <w:color w:val="EE0000"/>
-          <w:sz w:val="20"/>
-          <w:szCs w:val="20"/>
-          <w:bdr w:val="none" w:sz="0" w:space="0" w:color="auto" w:frame="1"/>
-        </w:rPr>
-        <w:t xml:space="preserve"> </w:t>
-      </w:r>
-      <w:r>
-        <w:rPr>
-          <w:rFonts w:ascii="Arial" w:hAnsi="Arial" w:cs="Arial"/>
-          <w:i/>
-          <w:color w:val="EE0000"/>
-          <w:sz w:val="20"/>
-          <w:szCs w:val="20"/>
-          <w:bdr w:val="none" w:sz="0" w:space="0" w:color="auto" w:frame="1"/>
-        </w:rPr>
-        <w:t xml:space="preserve">In this case, we will use a modified version of Sequence Diagrams, where instead of objects, the lifelines will represent the </w:t>
-      </w:r>
-      <w:r>
-        <w:rPr>
-          <w:rFonts w:ascii="Arial" w:hAnsi="Arial" w:cs="Arial"/>
-          <w:i/>
-          <w:color w:val="EE0000"/>
-          <w:sz w:val="20"/>
-          <w:szCs w:val="20"/>
-          <w:u w:val="single"/>
-          <w:bdr w:val="none" w:sz="0" w:space="0" w:color="auto" w:frame="1"/>
-        </w:rPr>
-        <w:t>functions</w:t>
-      </w:r>
-      <w:r>
-        <w:rPr>
-          <w:rFonts w:ascii="Arial" w:hAnsi="Arial" w:cs="Arial"/>
-          <w:i/>
-          <w:color w:val="EE0000"/>
-          <w:sz w:val="20"/>
-          <w:szCs w:val="20"/>
-          <w:bdr w:val="none" w:sz="0" w:space="0" w:color="auto" w:frame="1"/>
-        </w:rPr>
-        <w:t xml:space="preserve"> in the system involved in the action sequence. </w:t>
-      </w:r>
-    </w:p>
-    <w:p>
-      <w:pPr>
-        <w:shd w:val="clear" w:color="auto" w:fill="FFFFFF"/>
-        <w:rPr>
-          <w:rFonts w:ascii="Arial" w:hAnsi="Arial" w:cs="Arial"/>
-          <w:i/>
-          <w:color w:val="EE0000"/>
-          <w:sz w:val="10"/>
-          <w:szCs w:val="10"/>
-          <w:bdr w:val="none" w:sz="0" w:space="0" w:color="auto" w:frame="1"/>
-        </w:rPr>
-      </w:pPr>
-    </w:p>
-    <w:p>
-      <w:pPr>
-        <w:shd w:val="clear" w:color="auto" w:fill="FFFFFF"/>
-        <w:rPr>
-          <w:rFonts w:ascii="Arial" w:hAnsi="Arial" w:cs="Arial"/>
-          <w:i/>
-          <w:color w:val="EE0000"/>
-          <w:sz w:val="20"/>
-          <w:szCs w:val="20"/>
-          <w:bdr w:val="none" w:sz="0" w:space="0" w:color="auto" w:frame="1"/>
-        </w:rPr>
-      </w:pPr>
-      <w:r>
-        <w:rPr>
-          <w:rFonts w:ascii="Arial" w:hAnsi="Arial" w:cs="Arial"/>
-          <w:b/>
-          <w:bCs/>
-          <w:i/>
-          <w:color w:val="EE0000"/>
-          <w:sz w:val="20"/>
-          <w:szCs w:val="20"/>
-          <w:bdr w:val="none" w:sz="0" w:space="0" w:color="auto" w:frame="1"/>
-        </w:rPr>
-        <w:t>Class Diagrams</w:t>
-      </w:r>
-      <w:r>
-        <w:rPr>
-          <w:rFonts w:ascii="Arial" w:hAnsi="Arial" w:cs="Arial"/>
-          <w:i/>
-          <w:color w:val="EE0000"/>
-          <w:sz w:val="20"/>
-          <w:szCs w:val="20"/>
-          <w:bdr w:val="none" w:sz="0" w:space="0" w:color="auto" w:frame="1"/>
-        </w:rPr>
-        <w:t xml:space="preserve"> </w:t>
-      </w:r>
-      <w:r>
-        <w:rPr>
-          <w:rFonts w:ascii="Arial" w:hAnsi="Arial" w:cs="Arial"/>
-          <w:i/>
-          <w:color w:val="EE0000"/>
-          <w:sz w:val="20"/>
-          <w:szCs w:val="20"/>
-          <w:bdr w:val="none" w:sz="0" w:space="0" w:color="auto" w:frame="1"/>
-        </w:rPr>
-        <w:t xml:space="preserve">show the </w:t>
-      </w:r>
-      <w:r>
-        <w:rPr>
-          <w:rFonts w:ascii="Arial" w:hAnsi="Arial" w:cs="Arial"/>
-          <w:b/>
-          <w:i/>
-          <w:color w:val="EE0000"/>
-          <w:sz w:val="20"/>
-          <w:szCs w:val="20"/>
-          <w:bdr w:val="none" w:sz="0" w:space="0" w:color="auto" w:frame="1"/>
-        </w:rPr>
-        <w:t>fundamental objects/classes</w:t>
-      </w:r>
-      <w:r>
-        <w:rPr>
-          <w:rFonts w:ascii="Arial" w:hAnsi="Arial" w:cs="Arial"/>
-          <w:i/>
-          <w:color w:val="EE0000"/>
-          <w:sz w:val="20"/>
-          <w:szCs w:val="20"/>
-          <w:bdr w:val="none" w:sz="0" w:space="0" w:color="auto" w:frame="1"/>
-        </w:rPr>
-        <w:t xml:space="preserve"> that must be modeled with the system to satisfy its requirements</w:t>
-      </w:r>
-      <w:r>
-        <w:rPr>
-          <w:rFonts w:ascii="Arial" w:hAnsi="Arial" w:cs="Arial"/>
-          <w:i/>
-          <w:color w:val="EE0000"/>
-          <w:sz w:val="20"/>
-          <w:szCs w:val="20"/>
-          <w:bdr w:val="none" w:sz="0" w:space="0" w:color="auto" w:frame="1"/>
-        </w:rPr>
-        <w:t xml:space="preserve"> and </w:t>
-      </w:r>
-      <w:r>
-        <w:rPr>
-          <w:rFonts w:ascii="Arial" w:hAnsi="Arial" w:cs="Arial"/>
-          <w:b/>
-          <w:i/>
-          <w:color w:val="EE0000"/>
-          <w:sz w:val="20"/>
-          <w:szCs w:val="20"/>
-          <w:bdr w:val="none" w:sz="0" w:space="0" w:color="auto" w:frame="1"/>
-        </w:rPr>
-        <w:t xml:space="preserve">the relationships </w:t>
-      </w:r>
-      <w:r>
-        <w:rPr>
-          <w:rFonts w:ascii="Arial" w:hAnsi="Arial" w:cs="Arial"/>
-          <w:i/>
-          <w:color w:val="EE0000"/>
-          <w:sz w:val="20"/>
-          <w:szCs w:val="20"/>
-          <w:bdr w:val="none" w:sz="0" w:space="0" w:color="auto" w:frame="1"/>
-        </w:rPr>
-        <w:t>between them</w:t>
-      </w:r>
-      <w:r>
-        <w:rPr>
-          <w:rFonts w:ascii="Arial" w:hAnsi="Arial" w:cs="Arial"/>
-          <w:i/>
-          <w:color w:val="EE0000"/>
-          <w:sz w:val="20"/>
-          <w:szCs w:val="20"/>
-          <w:bdr w:val="none" w:sz="0" w:space="0" w:color="auto" w:frame="1"/>
-        </w:rPr>
-        <w:t xml:space="preserve">. Each class </w:t>
-      </w:r>
-      <w:r>
-        <w:rPr>
-          <w:rFonts w:ascii="Arial" w:hAnsi="Arial" w:cs="Arial"/>
-          <w:i/>
-          <w:color w:val="EE0000"/>
-          <w:sz w:val="20"/>
-          <w:szCs w:val="20"/>
-          <w:bdr w:val="none" w:sz="0" w:space="0" w:color="auto" w:frame="1"/>
-        </w:rPr>
-        <w:t xml:space="preserve">rectangle </w:t>
-      </w:r>
-      <w:r>
-        <w:rPr>
-          <w:rFonts w:ascii="Arial" w:hAnsi="Arial" w:cs="Arial"/>
-          <w:i/>
-          <w:color w:val="EE0000"/>
-          <w:sz w:val="20"/>
-          <w:szCs w:val="20"/>
-          <w:bdr w:val="none" w:sz="0" w:space="0" w:color="auto" w:frame="1"/>
-        </w:rPr>
-        <w:t xml:space="preserve">on the diagram </w:t>
-      </w:r>
-      <w:r>
-        <w:rPr>
-          <w:rFonts w:ascii="Arial" w:hAnsi="Arial" w:cs="Arial"/>
-          <w:b/>
-          <w:i/>
-          <w:color w:val="EE0000"/>
-          <w:sz w:val="20"/>
-          <w:szCs w:val="20"/>
-          <w:bdr w:val="none" w:sz="0" w:space="0" w:color="auto" w:frame="1"/>
-        </w:rPr>
-        <w:t xml:space="preserve">must </w:t>
-      </w:r>
-      <w:r>
-        <w:rPr>
-          <w:rFonts w:ascii="Arial" w:hAnsi="Arial" w:cs="Arial"/>
-          <w:b/>
-          <w:i/>
-          <w:color w:val="EE0000"/>
-          <w:sz w:val="20"/>
-          <w:szCs w:val="20"/>
-          <w:bdr w:val="none" w:sz="0" w:space="0" w:color="auto" w:frame="1"/>
-        </w:rPr>
-        <w:t xml:space="preserve">also </w:t>
-      </w:r>
-      <w:r>
-        <w:rPr>
-          <w:rFonts w:ascii="Arial" w:hAnsi="Arial" w:cs="Arial"/>
-          <w:b/>
-          <w:i/>
-          <w:color w:val="EE0000"/>
-          <w:sz w:val="20"/>
-          <w:szCs w:val="20"/>
-          <w:bdr w:val="none" w:sz="0" w:space="0" w:color="auto" w:frame="1"/>
-        </w:rPr>
-        <w:t xml:space="preserve">include the attributes </w:t>
-      </w:r>
-      <w:r>
-        <w:rPr>
-          <w:rFonts w:ascii="Arial" w:hAnsi="Arial" w:cs="Arial"/>
-          <w:b/>
-          <w:i/>
-          <w:color w:val="EE0000"/>
-          <w:sz w:val="20"/>
-          <w:szCs w:val="20"/>
-          <w:bdr w:val="none" w:sz="0" w:space="0" w:color="auto" w:frame="1"/>
-        </w:rPr>
-        <w:t xml:space="preserve">and the methods of </w:t>
-      </w:r>
-      <w:r>
-        <w:rPr>
-          <w:rFonts w:ascii="Arial" w:hAnsi="Arial" w:cs="Arial"/>
-          <w:b/>
-          <w:i/>
-          <w:color w:val="EE0000"/>
-          <w:sz w:val="20"/>
-          <w:szCs w:val="20"/>
-          <w:bdr w:val="none" w:sz="0" w:space="0" w:color="auto" w:frame="1"/>
-        </w:rPr>
-        <w:t>the class</w:t>
-      </w:r>
-      <w:r>
-        <w:rPr>
-          <w:rFonts w:ascii="Arial" w:hAnsi="Arial" w:cs="Arial"/>
-          <w:b/>
-          <w:i/>
-          <w:color w:val="EE0000"/>
-          <w:sz w:val="20"/>
-          <w:szCs w:val="20"/>
-          <w:bdr w:val="none" w:sz="0" w:space="0" w:color="auto" w:frame="1"/>
-        </w:rPr>
-        <w:t xml:space="preserve"> </w:t>
-      </w:r>
-      <w:r>
-        <w:rPr>
-          <w:rFonts w:ascii="Arial" w:hAnsi="Arial" w:cs="Arial"/>
-          <w:i/>
-          <w:color w:val="EE0000"/>
-          <w:sz w:val="20"/>
-          <w:szCs w:val="20"/>
-          <w:bdr w:val="none" w:sz="0" w:space="0" w:color="auto" w:frame="1"/>
-        </w:rPr>
-        <w:t xml:space="preserve">(they can be refined between </w:t>
-      </w:r>
-      <w:r>
-        <w:rPr>
-          <w:rFonts w:ascii="Arial" w:hAnsi="Arial" w:cs="Arial"/>
-          <w:i/>
-          <w:color w:val="EE0000"/>
-          <w:sz w:val="20"/>
-          <w:szCs w:val="20"/>
-          <w:bdr w:val="none" w:sz="0" w:space="0" w:color="auto" w:frame="1"/>
-        </w:rPr>
-        <w:t>increment</w:t>
-      </w:r>
-      <w:r>
-        <w:rPr>
-          <w:rFonts w:ascii="Arial" w:hAnsi="Arial" w:cs="Arial"/>
-          <w:i/>
-          <w:color w:val="EE0000"/>
-          <w:sz w:val="20"/>
-          <w:szCs w:val="20"/>
-          <w:bdr w:val="none" w:sz="0" w:space="0" w:color="auto" w:frame="1"/>
-        </w:rPr>
-        <w:t>s)</w:t>
-      </w:r>
-      <w:r>
-        <w:rPr>
-          <w:rFonts w:ascii="Arial" w:hAnsi="Arial" w:cs="Arial"/>
-          <w:i/>
-          <w:color w:val="EE0000"/>
-          <w:sz w:val="20"/>
-          <w:szCs w:val="20"/>
-          <w:bdr w:val="none" w:sz="0" w:space="0" w:color="auto" w:frame="1"/>
-        </w:rPr>
-        <w:t>.</w:t>
-      </w:r>
-      <w:r>
-        <w:rPr>
-          <w:rFonts w:ascii="Arial" w:hAnsi="Arial" w:cs="Arial"/>
-          <w:i/>
-          <w:color w:val="EE0000"/>
-          <w:sz w:val="20"/>
-          <w:szCs w:val="20"/>
-          <w:bdr w:val="none" w:sz="0" w:space="0" w:color="auto" w:frame="1"/>
-        </w:rPr>
-        <w:t xml:space="preserve"> </w:t>
-      </w:r>
-      <w:r>
-        <w:rPr>
-          <w:rFonts w:ascii="Arial" w:hAnsi="Arial" w:cs="Arial"/>
-          <w:i/>
-          <w:color w:val="EE0000"/>
-          <w:sz w:val="20"/>
-          <w:szCs w:val="20"/>
-          <w:bdr w:val="none" w:sz="0" w:space="0" w:color="auto" w:frame="1"/>
-        </w:rPr>
-        <w:t xml:space="preserve"> All the </w:t>
-      </w:r>
-      <w:r>
-        <w:rPr>
-          <w:rFonts w:ascii="Arial" w:hAnsi="Arial" w:cs="Arial"/>
-          <w:b/>
-          <w:i/>
-          <w:color w:val="EE0000"/>
-          <w:sz w:val="20"/>
-          <w:szCs w:val="20"/>
-          <w:bdr w:val="none" w:sz="0" w:space="0" w:color="auto" w:frame="1"/>
-        </w:rPr>
-        <w:t>relationships between classes and their multiplicity</w:t>
-      </w:r>
-      <w:r>
-        <w:rPr>
-          <w:rFonts w:ascii="Arial" w:hAnsi="Arial" w:cs="Arial"/>
-          <w:i/>
-          <w:color w:val="EE0000"/>
-          <w:sz w:val="20"/>
-          <w:szCs w:val="20"/>
-          <w:bdr w:val="none" w:sz="0" w:space="0" w:color="auto" w:frame="1"/>
-        </w:rPr>
-        <w:t xml:space="preserve"> must be shown on the class diagram. </w:t>
-      </w:r>
-    </w:p>
-    <w:p>
-      <w:pPr>
-        <w:shd w:val="clear" w:color="auto" w:fill="FFFFFF"/>
-        <w:rPr>
-          <w:rFonts w:ascii="Arial" w:hAnsi="Arial" w:cs="Arial"/>
-          <w:i/>
-          <w:color w:val="EE0000"/>
-          <w:sz w:val="10"/>
-          <w:szCs w:val="10"/>
-          <w:bdr w:val="none" w:sz="0" w:space="0" w:color="auto" w:frame="1"/>
-        </w:rPr>
-      </w:pPr>
-    </w:p>
-    <w:p>
-      <w:pPr>
-        <w:shd w:val="clear" w:color="auto" w:fill="FFFFFF"/>
-        <w:rPr>
-          <w:rFonts w:ascii="Arial" w:hAnsi="Arial" w:cs="Arial"/>
-          <w:i/>
-          <w:color w:val="EE0000"/>
-          <w:sz w:val="20"/>
-          <w:szCs w:val="20"/>
-          <w:bdr w:val="none" w:sz="0" w:space="0" w:color="auto" w:frame="1"/>
-        </w:rPr>
-      </w:pPr>
-      <w:r>
-        <w:rPr>
-          <w:rFonts w:ascii="Arial" w:hAnsi="Arial" w:cs="Arial"/>
-          <w:i/>
-          <w:color w:val="EE0000"/>
-          <w:sz w:val="20"/>
-          <w:szCs w:val="20"/>
-          <w:bdr w:val="none" w:sz="0" w:space="0" w:color="auto" w:frame="1"/>
-        </w:rPr>
-        <w:t xml:space="preserve">A </w:t>
-      </w:r>
-      <w:r>
-        <w:rPr>
-          <w:rFonts w:cs="Arial"/>
-          <w:b/>
-          <w:bCs/>
-          <w:i/>
-          <w:color w:val="EE0000"/>
-          <w:sz w:val="20"/>
-          <w:szCs w:val="20"/>
-          <w:bdr w:val="none" w:sz="0" w:space="0" w:color="auto" w:frame="1"/>
-        </w:rPr>
-        <w:t>S</w:t>
-      </w:r>
-      <w:r>
-        <w:rPr>
-          <w:rFonts w:ascii="Arial" w:hAnsi="Arial" w:cs="Arial"/>
-          <w:b/>
-          <w:bCs/>
-          <w:i/>
-          <w:color w:val="EE0000"/>
-          <w:sz w:val="20"/>
-          <w:szCs w:val="20"/>
-          <w:bdr w:val="none" w:sz="0" w:space="0" w:color="auto" w:frame="1"/>
-        </w:rPr>
-        <w:t xml:space="preserve">equence </w:t>
-      </w:r>
-      <w:r>
-        <w:rPr>
-          <w:rFonts w:cs="Arial"/>
-          <w:b/>
-          <w:bCs/>
-          <w:i/>
-          <w:color w:val="EE0000"/>
-          <w:sz w:val="20"/>
-          <w:szCs w:val="20"/>
-          <w:bdr w:val="none" w:sz="0" w:space="0" w:color="auto" w:frame="1"/>
-        </w:rPr>
-        <w:t>D</w:t>
-      </w:r>
-      <w:r>
-        <w:rPr>
-          <w:rFonts w:ascii="Arial" w:hAnsi="Arial" w:cs="Arial"/>
-          <w:b/>
-          <w:bCs/>
-          <w:i/>
-          <w:color w:val="EE0000"/>
-          <w:sz w:val="20"/>
-          <w:szCs w:val="20"/>
-          <w:bdr w:val="none" w:sz="0" w:space="0" w:color="auto" w:frame="1"/>
-        </w:rPr>
-        <w:t>iagram</w:t>
-      </w:r>
-      <w:r>
-        <w:rPr>
-          <w:rFonts w:ascii="Arial" w:hAnsi="Arial" w:cs="Arial"/>
-          <w:i/>
-          <w:color w:val="EE0000"/>
-          <w:sz w:val="20"/>
-          <w:szCs w:val="20"/>
-          <w:bdr w:val="none" w:sz="0" w:space="0" w:color="auto" w:frame="1"/>
-        </w:rPr>
-        <w:t xml:space="preserve"> simply depicts </w:t>
-      </w:r>
-      <w:r>
-        <w:rPr>
-          <w:rFonts w:ascii="Arial" w:hAnsi="Arial" w:cs="Arial"/>
-          <w:b/>
-          <w:bCs/>
-          <w:i/>
-          <w:color w:val="EE0000"/>
-          <w:sz w:val="20"/>
-          <w:szCs w:val="20"/>
-          <w:bdr w:val="none" w:sz="0" w:space="0" w:color="auto" w:frame="1"/>
-        </w:rPr>
-        <w:t>interaction</w:t>
-      </w:r>
-      <w:r>
-        <w:rPr>
-          <w:rFonts w:ascii="Arial" w:hAnsi="Arial" w:cs="Arial"/>
-          <w:i/>
-          <w:color w:val="EE0000"/>
-          <w:sz w:val="20"/>
-          <w:szCs w:val="20"/>
-          <w:bdr w:val="none" w:sz="0" w:space="0" w:color="auto" w:frame="1"/>
-        </w:rPr>
-        <w:t xml:space="preserve"> </w:t>
-      </w:r>
-      <w:r>
-        <w:rPr>
-          <w:rFonts w:ascii="Arial" w:hAnsi="Arial" w:cs="Arial"/>
-          <w:b/>
-          <w:bCs/>
-          <w:i/>
-          <w:color w:val="EE0000"/>
-          <w:sz w:val="20"/>
-          <w:szCs w:val="20"/>
-          <w:bdr w:val="none" w:sz="0" w:space="0" w:color="auto" w:frame="1"/>
-        </w:rPr>
-        <w:t>between objects</w:t>
-      </w:r>
-      <w:r>
-        <w:rPr>
-          <w:rFonts w:ascii="Arial" w:hAnsi="Arial" w:cs="Arial"/>
-          <w:i/>
-          <w:color w:val="EE0000"/>
-          <w:sz w:val="20"/>
-          <w:szCs w:val="20"/>
-          <w:bdr w:val="none" w:sz="0" w:space="0" w:color="auto" w:frame="1"/>
-        </w:rPr>
-        <w:t xml:space="preserve"> (or </w:t>
-      </w:r>
-      <w:r>
-        <w:rPr>
-          <w:rFonts w:ascii="Arial" w:hAnsi="Arial" w:cs="Arial"/>
-          <w:b/>
-          <w:bCs/>
-          <w:i/>
-          <w:color w:val="EE0000"/>
-          <w:sz w:val="20"/>
-          <w:szCs w:val="20"/>
-          <w:bdr w:val="none" w:sz="0" w:space="0" w:color="auto" w:frame="1"/>
-        </w:rPr>
-        <w:t>functions</w:t>
-      </w:r>
-      <w:r>
-        <w:rPr>
-          <w:rFonts w:ascii="Arial" w:hAnsi="Arial" w:cs="Arial"/>
-          <w:b/>
-          <w:bCs/>
-          <w:i/>
-          <w:color w:val="EE0000"/>
-          <w:sz w:val="20"/>
-          <w:szCs w:val="20"/>
-          <w:bdr w:val="none" w:sz="0" w:space="0" w:color="auto" w:frame="1"/>
-        </w:rPr>
-        <w:t xml:space="preserve"> -</w:t>
-      </w:r>
-      <w:r>
-        <w:rPr>
-          <w:rFonts w:ascii="Arial" w:hAnsi="Arial" w:cs="Arial"/>
-          <w:i/>
-          <w:color w:val="EE0000"/>
-          <w:sz w:val="20"/>
-          <w:szCs w:val="20"/>
-          <w:bdr w:val="none" w:sz="0" w:space="0" w:color="auto" w:frame="1"/>
-        </w:rPr>
-        <w:t xml:space="preserve"> in our case</w:t>
-      </w:r>
-      <w:r>
-        <w:rPr>
-          <w:rFonts w:ascii="Arial" w:hAnsi="Arial" w:cs="Arial"/>
-          <w:i/>
-          <w:color w:val="EE0000"/>
-          <w:sz w:val="20"/>
-          <w:szCs w:val="20"/>
-          <w:bdr w:val="none" w:sz="0" w:space="0" w:color="auto" w:frame="1"/>
-        </w:rPr>
-        <w:t xml:space="preserve"> -</w:t>
-      </w:r>
-      <w:r>
-        <w:rPr>
-          <w:rFonts w:ascii="Arial" w:hAnsi="Arial" w:cs="Arial"/>
-          <w:i/>
-          <w:color w:val="EE0000"/>
-          <w:sz w:val="20"/>
-          <w:szCs w:val="20"/>
-          <w:bdr w:val="none" w:sz="0" w:space="0" w:color="auto" w:frame="1"/>
-        </w:rPr>
-        <w:t xml:space="preserve"> for non</w:t>
-      </w:r>
-      <w:r>
-        <w:rPr>
-          <w:rFonts w:ascii="Arial" w:hAnsi="Arial" w:cs="Arial"/>
-          <w:i/>
-          <w:color w:val="EE0000"/>
-          <w:sz w:val="20"/>
-          <w:szCs w:val="20"/>
-          <w:bdr w:val="none" w:sz="0" w:space="0" w:color="auto" w:frame="1"/>
-        </w:rPr>
-        <w:t>-</w:t>
-      </w:r>
-      <w:r>
-        <w:rPr>
-          <w:rFonts w:ascii="Arial" w:hAnsi="Arial" w:cs="Arial"/>
-          <w:i/>
-          <w:color w:val="EE0000"/>
-          <w:sz w:val="20"/>
-          <w:szCs w:val="20"/>
-          <w:bdr w:val="none" w:sz="0" w:space="0" w:color="auto" w:frame="1"/>
-        </w:rPr>
-        <w:t>OOP systems)</w:t>
-      </w:r>
-      <w:r>
-        <w:rPr>
-          <w:rFonts w:ascii="Arial" w:hAnsi="Arial" w:cs="Arial"/>
-          <w:i/>
-          <w:color w:val="EE0000"/>
-          <w:sz w:val="20"/>
-          <w:szCs w:val="20"/>
-          <w:bdr w:val="none" w:sz="0" w:space="0" w:color="auto" w:frame="1"/>
-        </w:rPr>
-        <w:t xml:space="preserve"> in a sequential order</w:t>
-      </w:r>
-      <w:r>
-        <w:rPr>
-          <w:rFonts w:ascii="Arial" w:hAnsi="Arial" w:cs="Arial"/>
-          <w:i/>
-          <w:color w:val="EE0000"/>
-          <w:sz w:val="20"/>
-          <w:szCs w:val="20"/>
-          <w:bdr w:val="none" w:sz="0" w:space="0" w:color="auto" w:frame="1"/>
-        </w:rPr>
-        <w:t xml:space="preserve">, </w:t>
-      </w:r>
-      <w:r>
-        <w:rPr>
-          <w:rFonts w:ascii="Arial" w:hAnsi="Arial" w:cs="Arial"/>
-          <w:i/>
-          <w:color w:val="EE0000"/>
-          <w:sz w:val="20"/>
-          <w:szCs w:val="20"/>
-          <w:bdr w:val="none" w:sz="0" w:space="0" w:color="auto" w:frame="1"/>
-        </w:rPr>
-        <w:t>i.e. the order in which these interactions take place.</w:t>
-      </w:r>
-      <w:r>
-        <w:rPr>
-          <w:rFonts w:ascii="Arial" w:hAnsi="Arial" w:cs="Arial"/>
-          <w:i/>
-          <w:color w:val="EE0000"/>
-          <w:sz w:val="20"/>
-          <w:szCs w:val="20"/>
-          <w:bdr w:val="none" w:sz="0" w:space="0" w:color="auto" w:frame="1"/>
-        </w:rPr>
-        <w:t xml:space="preserve"> </w:t>
-      </w:r>
-      <w:r>
-        <w:rPr>
-          <w:rFonts w:ascii="Arial" w:hAnsi="Arial" w:cs="Arial"/>
-          <w:i/>
-          <w:color w:val="EE0000"/>
-          <w:sz w:val="20"/>
-          <w:szCs w:val="20"/>
-          <w:bdr w:val="none" w:sz="0" w:space="0" w:color="auto" w:frame="1"/>
-        </w:rPr>
-        <w:t xml:space="preserve">Sequence diagrams describe how and in what order the objects in a system function. </w:t>
-      </w:r>
-    </w:p>
-    <w:p>
-      <w:pPr>
-        <w:pStyle w:val="Heading1"/>
-      </w:pPr>
-      <w:r>
-        <w:t>Operating Environment</w:t>
-      </w:r>
-      <w:r>
-        <w:t> </w:t>
-      </w:r>
-      <w:r>
-        <w:t>(5 points)</w:t>
-      </w:r>
-    </w:p>
-    <w:p>
-      <w:pPr>
-        <w:shd w:val="clear" w:color="auto" w:fill="FFFFFF"/>
-        <w:rPr>
-          <w:rFonts w:ascii="Arial" w:hAnsi="Arial" w:cs="Arial"/>
-          <w:i/>
-          <w:iCs/>
-          <w:color w:val="EE0000"/>
-          <w:sz w:val="20"/>
-          <w:szCs w:val="20"/>
-          <w:bdr w:val="none" w:sz="0" w:space="0" w:color="auto" w:frame="1"/>
-        </w:rPr>
-      </w:pPr>
-      <w:r>
-        <w:rPr>
-          <w:rFonts w:ascii="Arial" w:hAnsi="Arial" w:cs="Arial"/>
-          <w:i/>
-          <w:iCs/>
-          <w:color w:val="EE0000"/>
-          <w:sz w:val="20"/>
-          <w:szCs w:val="20"/>
-          <w:bdr w:val="none" w:sz="0" w:space="0" w:color="auto" w:frame="1"/>
-        </w:rPr>
-        <w:t>Describe the environment in which the software will operate, including the hardware platform, operating system and versions, and any other software components or applications with which it must peacefully coexist.</w:t>
-      </w:r>
-    </w:p>
-    <w:p>
-      <w:pPr>
-        <w:pStyle w:val="Heading1"/>
-        <w:rPr>
-          <w:bdr w:val="none" w:sz="0" w:space="0" w:color="auto" w:frame="1"/>
-        </w:rPr>
-      </w:pPr>
-      <w:r>
-        <w:rPr>
-          <w:bdr w:val="none" w:sz="0" w:space="0" w:color="auto" w:frame="1"/>
-        </w:rPr>
-        <w:lastRenderedPageBreak/>
-        <w:t xml:space="preserve">Assumptions and Dependencies </w:t>
-      </w:r>
-      <w:r>
-        <w:rPr>
-          <w:bdr w:val="none" w:sz="0" w:space="0" w:color="auto" w:frame="1"/>
-        </w:rPr>
-        <w:t>(5 points)</w:t>
-      </w:r>
-    </w:p>
-    <w:p>
-      <w:pPr>
-        <w:shd w:val="clear" w:color="auto" w:fill="FFFFFF"/>
-        <w:rPr>
-          <w:rFonts w:ascii="Arial" w:hAnsi="Arial" w:cs="Arial"/>
-          <w:i/>
-          <w:iCs/>
-          <w:color w:val="EE0000"/>
-          <w:sz w:val="20"/>
-          <w:szCs w:val="20"/>
-          <w:bdr w:val="none" w:sz="0" w:space="0" w:color="auto" w:frame="1"/>
-        </w:rPr>
-      </w:pPr>
-      <w:r>
-        <w:rPr>
-          <w:rFonts w:ascii="Arial" w:hAnsi="Arial" w:cs="Arial"/>
-          <w:i/>
-          <w:iCs/>
-          <w:color w:val="EE0000"/>
-          <w:sz w:val="20"/>
-          <w:szCs w:val="20"/>
-          <w:bdr w:val="none" w:sz="0" w:space="0" w:color="auto" w:frame="1"/>
-        </w:rPr>
-        <w:t>List any assumed factors (as opposed to known facts) that could affect the requirements stated in this document. These could include third-party or commercial components that you plan to use, issues around the development or operating environment, or constraints. The project could be affected if these assumptions are incorrect, are not shared, or change. Also identify any dependencies the project has on external factors, such as software components that you intend to reuse from another project.</w:t>
-      </w:r>
-    </w:p>
-    <w:p>
-      <w:pPr>
-        <w:shd w:val="clear" w:color="auto" w:fill="FFFFFF"/>
-        <w:ind w:left="720"/>
-        <w:rPr>
-          <w:rFonts w:ascii="Arial" w:hAnsi="Arial" w:cs="Arial"/>
-          <w:color w:val="000000"/>
-          <w:sz w:val="20"/>
-          <w:szCs w:val="20"/>
-          <w:bdr w:val="none" w:sz="0" w:space="0" w:color="auto" w:frame="1"/>
-        </w:rPr>
-      </w:pPr>
     </w:p>
     <w:sectPr>
       <w:pgSz w:w="12240" w:h="15840"/>
@@ -5542,6 +4262,118 @@
     </w:lvl>
   </w:abstractNum>
   <w:abstractNum w:abstractNumId="26" w15:restartNumberingAfterBreak="0">
+    <w:nsid w:val="5D351475"/>
+    <w:multiLevelType w:val="hybridMultilevel"/>
+    <w:tmpl w:val="74E624AE"/>
+    <w:lvl w:ilvl="0" w:tplc="287C6CF6">
+      <w:numFmt w:val="bullet"/>
+      <w:lvlText w:val="-"/>
+      <w:lvlJc w:val="left"/>
+      <w:pPr>
+        <w:ind w:left="720" w:hanging="360"/>
+      </w:pPr>
+      <w:rPr>
+        <w:rFonts w:ascii="Arial" w:eastAsiaTheme="minorEastAsia" w:hAnsi="Arial" w:cs="Arial" w:hint="default"/>
+      </w:rPr>
+    </w:lvl>
+    <w:lvl w:ilvl="1" w:tplc="04090003" w:tentative="1">
+      <w:start w:val="1"/>
+      <w:numFmt w:val="bullet"/>
+      <w:lvlText w:val="o"/>
+      <w:lvlJc w:val="left"/>
+      <w:pPr>
+        <w:ind w:left="1440" w:hanging="360"/>
+      </w:pPr>
+      <w:rPr>
+        <w:rFonts w:ascii="Courier New" w:hAnsi="Courier New" w:cs="Courier New" w:hint="default"/>
+      </w:rPr>
+    </w:lvl>
+    <w:lvl w:ilvl="2" w:tplc="04090005" w:tentative="1">
+      <w:start w:val="1"/>
+      <w:numFmt w:val="bullet"/>
+      <w:lvlText w:val=""/>
+      <w:lvlJc w:val="left"/>
+      <w:pPr>
+        <w:ind w:left="2160" w:hanging="360"/>
+      </w:pPr>
+      <w:rPr>
+        <w:rFonts w:ascii="Wingdings" w:hAnsi="Wingdings" w:hint="default"/>
+      </w:rPr>
+    </w:lvl>
+    <w:lvl w:ilvl="3" w:tplc="04090001" w:tentative="1">
+      <w:start w:val="1"/>
+      <w:numFmt w:val="bullet"/>
+      <w:lvlText w:val=""/>
+      <w:lvlJc w:val="left"/>
+      <w:pPr>
+        <w:ind w:left="2880" w:hanging="360"/>
+      </w:pPr>
+      <w:rPr>
+        <w:rFonts w:ascii="Symbol" w:hAnsi="Symbol" w:hint="default"/>
+      </w:rPr>
+    </w:lvl>
+    <w:lvl w:ilvl="4" w:tplc="04090003" w:tentative="1">
+      <w:start w:val="1"/>
+      <w:numFmt w:val="bullet"/>
+      <w:lvlText w:val="o"/>
+      <w:lvlJc w:val="left"/>
+      <w:pPr>
+        <w:ind w:left="3600" w:hanging="360"/>
+      </w:pPr>
+      <w:rPr>
+        <w:rFonts w:ascii="Courier New" w:hAnsi="Courier New" w:cs="Courier New" w:hint="default"/>
+      </w:rPr>
+    </w:lvl>
+    <w:lvl w:ilvl="5" w:tplc="04090005" w:tentative="1">
+      <w:start w:val="1"/>
+      <w:numFmt w:val="bullet"/>
+      <w:lvlText w:val=""/>
+      <w:lvlJc w:val="left"/>
+      <w:pPr>
+        <w:ind w:left="4320" w:hanging="360"/>
+      </w:pPr>
+      <w:rPr>
+        <w:rFonts w:ascii="Wingdings" w:hAnsi="Wingdings" w:hint="default"/>
+      </w:rPr>
+    </w:lvl>
+    <w:lvl w:ilvl="6" w:tplc="04090001" w:tentative="1">
+      <w:start w:val="1"/>
+      <w:numFmt w:val="bullet"/>
+      <w:lvlText w:val=""/>
+      <w:lvlJc w:val="left"/>
+      <w:pPr>
+        <w:ind w:left="5040" w:hanging="360"/>
+      </w:pPr>
+      <w:rPr>
+        <w:rFonts w:ascii="Symbol" w:hAnsi="Symbol" w:hint="default"/>
+      </w:rPr>
+    </w:lvl>
+    <w:lvl w:ilvl="7" w:tplc="04090003" w:tentative="1">
+      <w:start w:val="1"/>
+      <w:numFmt w:val="bullet"/>
+      <w:lvlText w:val="o"/>
+      <w:lvlJc w:val="left"/>
+      <w:pPr>
+        <w:ind w:left="5760" w:hanging="360"/>
+      </w:pPr>
+      <w:rPr>
+        <w:rFonts w:ascii="Courier New" w:hAnsi="Courier New" w:cs="Courier New" w:hint="default"/>
+      </w:rPr>
+    </w:lvl>
+    <w:lvl w:ilvl="8" w:tplc="04090005" w:tentative="1">
+      <w:start w:val="1"/>
+      <w:numFmt w:val="bullet"/>
+      <w:lvlText w:val=""/>
+      <w:lvlJc w:val="left"/>
+      <w:pPr>
+        <w:ind w:left="6480" w:hanging="360"/>
+      </w:pPr>
+      <w:rPr>
+        <w:rFonts w:ascii="Wingdings" w:hAnsi="Wingdings" w:hint="default"/>
+      </w:rPr>
+    </w:lvl>
+  </w:abstractNum>
+  <w:abstractNum w:abstractNumId="27" w15:restartNumberingAfterBreak="0">
     <w:nsid w:val="637B380F"/>
     <w:multiLevelType w:val="multilevel"/>
     <w:tmpl w:val="C93CB296"/>
@@ -5654,7 +4486,119 @@
       </w:pPr>
     </w:lvl>
   </w:abstractNum>
-  <w:abstractNum w:abstractNumId="27" w15:restartNumberingAfterBreak="0">
+  <w:abstractNum w:abstractNumId="28" w15:restartNumberingAfterBreak="0">
+    <w:nsid w:val="654E3C63"/>
+    <w:multiLevelType w:val="hybridMultilevel"/>
+    <w:tmpl w:val="A0D45B6C"/>
+    <w:lvl w:ilvl="0" w:tplc="C186D7A0">
+      <w:numFmt w:val="bullet"/>
+      <w:lvlText w:val="-"/>
+      <w:lvlJc w:val="left"/>
+      <w:pPr>
+        <w:ind w:left="720" w:hanging="360"/>
+      </w:pPr>
+      <w:rPr>
+        <w:rFonts w:ascii="Arial" w:eastAsiaTheme="minorEastAsia" w:hAnsi="Arial" w:cs="Arial" w:hint="default"/>
+      </w:rPr>
+    </w:lvl>
+    <w:lvl w:ilvl="1" w:tplc="04090003" w:tentative="1">
+      <w:start w:val="1"/>
+      <w:numFmt w:val="bullet"/>
+      <w:lvlText w:val="o"/>
+      <w:lvlJc w:val="left"/>
+      <w:pPr>
+        <w:ind w:left="1440" w:hanging="360"/>
+      </w:pPr>
+      <w:rPr>
+        <w:rFonts w:ascii="Courier New" w:hAnsi="Courier New" w:cs="Courier New" w:hint="default"/>
+      </w:rPr>
+    </w:lvl>
+    <w:lvl w:ilvl="2" w:tplc="04090005" w:tentative="1">
+      <w:start w:val="1"/>
+      <w:numFmt w:val="bullet"/>
+      <w:lvlText w:val=""/>
+      <w:lvlJc w:val="left"/>
+      <w:pPr>
+        <w:ind w:left="2160" w:hanging="360"/>
+      </w:pPr>
+      <w:rPr>
+        <w:rFonts w:ascii="Wingdings" w:hAnsi="Wingdings" w:hint="default"/>
+      </w:rPr>
+    </w:lvl>
+    <w:lvl w:ilvl="3" w:tplc="04090001" w:tentative="1">
+      <w:start w:val="1"/>
+      <w:numFmt w:val="bullet"/>
+      <w:lvlText w:val=""/>
+      <w:lvlJc w:val="left"/>
+      <w:pPr>
+        <w:ind w:left="2880" w:hanging="360"/>
+      </w:pPr>
+      <w:rPr>
+        <w:rFonts w:ascii="Symbol" w:hAnsi="Symbol" w:hint="default"/>
+      </w:rPr>
+    </w:lvl>
+    <w:lvl w:ilvl="4" w:tplc="04090003" w:tentative="1">
+      <w:start w:val="1"/>
+      <w:numFmt w:val="bullet"/>
+      <w:lvlText w:val="o"/>
+      <w:lvlJc w:val="left"/>
+      <w:pPr>
+        <w:ind w:left="3600" w:hanging="360"/>
+      </w:pPr>
+      <w:rPr>
+        <w:rFonts w:ascii="Courier New" w:hAnsi="Courier New" w:cs="Courier New" w:hint="default"/>
+      </w:rPr>
+    </w:lvl>
+    <w:lvl w:ilvl="5" w:tplc="04090005" w:tentative="1">
+      <w:start w:val="1"/>
+      <w:numFmt w:val="bullet"/>
+      <w:lvlText w:val=""/>
+      <w:lvlJc w:val="left"/>
+      <w:pPr>
+        <w:ind w:left="4320" w:hanging="360"/>
+      </w:pPr>
+      <w:rPr>
+        <w:rFonts w:ascii="Wingdings" w:hAnsi="Wingdings" w:hint="default"/>
+      </w:rPr>
+    </w:lvl>
+    <w:lvl w:ilvl="6" w:tplc="04090001" w:tentative="1">
+      <w:start w:val="1"/>
+      <w:numFmt w:val="bullet"/>
+      <w:lvlText w:val=""/>
+      <w:lvlJc w:val="left"/>
+      <w:pPr>
+        <w:ind w:left="5040" w:hanging="360"/>
+      </w:pPr>
+      <w:rPr>
+        <w:rFonts w:ascii="Symbol" w:hAnsi="Symbol" w:hint="default"/>
+      </w:rPr>
+    </w:lvl>
+    <w:lvl w:ilvl="7" w:tplc="04090003" w:tentative="1">
+      <w:start w:val="1"/>
+      <w:numFmt w:val="bullet"/>
+      <w:lvlText w:val="o"/>
+      <w:lvlJc w:val="left"/>
+      <w:pPr>
+        <w:ind w:left="5760" w:hanging="360"/>
+      </w:pPr>
+      <w:rPr>
+        <w:rFonts w:ascii="Courier New" w:hAnsi="Courier New" w:cs="Courier New" w:hint="default"/>
+      </w:rPr>
+    </w:lvl>
+    <w:lvl w:ilvl="8" w:tplc="04090005" w:tentative="1">
+      <w:start w:val="1"/>
+      <w:numFmt w:val="bullet"/>
+      <w:lvlText w:val=""/>
+      <w:lvlJc w:val="left"/>
+      <w:pPr>
+        <w:ind w:left="6480" w:hanging="360"/>
+      </w:pPr>
+      <w:rPr>
+        <w:rFonts w:ascii="Wingdings" w:hAnsi="Wingdings" w:hint="default"/>
+      </w:rPr>
+    </w:lvl>
+  </w:abstractNum>
+  <w:abstractNum w:abstractNumId="29" w15:restartNumberingAfterBreak="0">
     <w:nsid w:val="658B560E"/>
     <w:multiLevelType w:val="hybridMultilevel"/>
     <w:tmpl w:val="D55267C8"/>
@@ -5744,7 +4688,7 @@
       </w:pPr>
     </w:lvl>
   </w:abstractNum>
-  <w:abstractNum w:abstractNumId="28" w15:restartNumberingAfterBreak="0">
+  <w:abstractNum w:abstractNumId="30" w15:restartNumberingAfterBreak="0">
     <w:nsid w:val="67F32839"/>
     <w:multiLevelType w:val="multilevel"/>
     <w:tmpl w:val="3A42493A"/>
@@ -5857,7 +4801,7 @@
       </w:rPr>
     </w:lvl>
   </w:abstractNum>
-  <w:abstractNum w:abstractNumId="29" w15:restartNumberingAfterBreak="0">
+  <w:abstractNum w:abstractNumId="31" w15:restartNumberingAfterBreak="0">
     <w:nsid w:val="68014B27"/>
     <w:multiLevelType w:val="multilevel"/>
     <w:tmpl w:val="C636C2FA"/>
@@ -5970,7 +4914,7 @@
       </w:pPr>
     </w:lvl>
   </w:abstractNum>
-  <w:abstractNum w:abstractNumId="30" w15:restartNumberingAfterBreak="0">
+  <w:abstractNum w:abstractNumId="32" w15:restartNumberingAfterBreak="0">
     <w:nsid w:val="6BA20699"/>
     <w:multiLevelType w:val="multilevel"/>
     <w:tmpl w:val="81F2B242"/>
@@ -6083,7 +5027,7 @@
       </w:pPr>
     </w:lvl>
   </w:abstractNum>
-  <w:abstractNum w:abstractNumId="31" w15:restartNumberingAfterBreak="0">
+  <w:abstractNum w:abstractNumId="33" w15:restartNumberingAfterBreak="0">
     <w:nsid w:val="6E0C13CC"/>
     <w:multiLevelType w:val="multilevel"/>
     <w:tmpl w:val="5F5CA9CC"/>
@@ -6196,7 +5140,7 @@
       </w:pPr>
     </w:lvl>
   </w:abstractNum>
-  <w:abstractNum w:abstractNumId="32" w15:restartNumberingAfterBreak="0">
+  <w:abstractNum w:abstractNumId="34" w15:restartNumberingAfterBreak="0">
     <w:nsid w:val="75DD6782"/>
     <w:multiLevelType w:val="multilevel"/>
     <w:tmpl w:val="683E6884"/>
@@ -6309,7 +5253,7 @@
       </w:pPr>
     </w:lvl>
   </w:abstractNum>
-  <w:abstractNum w:abstractNumId="33" w15:restartNumberingAfterBreak="0">
+  <w:abstractNum w:abstractNumId="35" w15:restartNumberingAfterBreak="0">
     <w:nsid w:val="794D4124"/>
     <w:multiLevelType w:val="multilevel"/>
     <w:tmpl w:val="729C3BC6"/>
@@ -6422,7 +5366,7 @@
       </w:rPr>
     </w:lvl>
   </w:abstractNum>
-  <w:abstractNum w:abstractNumId="34" w15:restartNumberingAfterBreak="0">
+  <w:abstractNum w:abstractNumId="36" w15:restartNumberingAfterBreak="0">
     <w:nsid w:val="7A834742"/>
     <w:multiLevelType w:val="multilevel"/>
     <w:tmpl w:val="4D2C2702"/>
@@ -6535,7 +5479,7 @@
       </w:rPr>
     </w:lvl>
   </w:abstractNum>
-  <w:abstractNum w:abstractNumId="35" w15:restartNumberingAfterBreak="0">
+  <w:abstractNum w:abstractNumId="37" w15:restartNumberingAfterBreak="0">
     <w:nsid w:val="7E653631"/>
     <w:multiLevelType w:val="multilevel"/>
     <w:tmpl w:val="8ADED7A8"/>
@@ -6655,16 +5599,16 @@
     <w:abstractNumId w:val="18"/>
   </w:num>
   <w:num w:numId="3" w16cid:durableId="613291827">
-    <w:abstractNumId w:val="35"/>
+    <w:abstractNumId w:val="37"/>
   </w:num>
   <w:num w:numId="4" w16cid:durableId="988943891">
-    <w:abstractNumId w:val="30"/>
+    <w:abstractNumId w:val="32"/>
   </w:num>
   <w:num w:numId="5" w16cid:durableId="539123403">
     <w:abstractNumId w:val="22"/>
   </w:num>
   <w:num w:numId="6" w16cid:durableId="1770083119">
-    <w:abstractNumId w:val="29"/>
+    <w:abstractNumId w:val="31"/>
   </w:num>
   <w:num w:numId="7" w16cid:durableId="1754274787">
     <w:abstractNumId w:val="17"/>
@@ -6679,7 +5623,7 @@
     <w:abstractNumId w:val="8"/>
   </w:num>
   <w:num w:numId="11" w16cid:durableId="528880326">
-    <w:abstractNumId w:val="32"/>
+    <w:abstractNumId w:val="34"/>
   </w:num>
   <w:num w:numId="12" w16cid:durableId="522939466">
     <w:abstractNumId w:val="5"/>
@@ -6700,7 +5644,7 @@
     <w:abstractNumId w:val="19"/>
   </w:num>
   <w:num w:numId="18" w16cid:durableId="206181">
-    <w:abstractNumId w:val="31"/>
+    <w:abstractNumId w:val="33"/>
   </w:num>
   <w:num w:numId="19" w16cid:durableId="555241494">
     <w:abstractNumId w:val="20"/>
@@ -6709,7 +5653,7 @@
     <w:abstractNumId w:val="25"/>
   </w:num>
   <w:num w:numId="21" w16cid:durableId="2064062650">
-    <w:abstractNumId w:val="26"/>
+    <w:abstractNumId w:val="27"/>
   </w:num>
   <w:num w:numId="22" w16cid:durableId="777138926">
     <w:abstractNumId w:val="16"/>
@@ -6721,10 +5665,10 @@
     <w:abstractNumId w:val="7"/>
   </w:num>
   <w:num w:numId="25" w16cid:durableId="1365132017">
-    <w:abstractNumId w:val="27"/>
+    <w:abstractNumId w:val="29"/>
   </w:num>
   <w:num w:numId="26" w16cid:durableId="1301374990">
-    <w:abstractNumId w:val="28"/>
+    <w:abstractNumId w:val="30"/>
   </w:num>
   <w:num w:numId="27" w16cid:durableId="696587204">
     <w:abstractNumId w:val="15"/>
@@ -6733,10 +5677,10 @@
     <w:abstractNumId w:val="13"/>
   </w:num>
   <w:num w:numId="29" w16cid:durableId="1442382491">
-    <w:abstractNumId w:val="33"/>
+    <w:abstractNumId w:val="35"/>
   </w:num>
   <w:num w:numId="30" w16cid:durableId="198397604">
-    <w:abstractNumId w:val="28"/>
+    <w:abstractNumId w:val="30"/>
     <w:lvlOverride w:ilvl="0">
       <w:startOverride w:val="1"/>
     </w:lvlOverride>
@@ -6769,13 +5713,13 @@
     <w:abstractNumId w:val="9"/>
   </w:num>
   <w:num w:numId="32" w16cid:durableId="4331261">
-    <w:abstractNumId w:val="28"/>
+    <w:abstractNumId w:val="30"/>
   </w:num>
   <w:num w:numId="33" w16cid:durableId="1990396856">
     <w:abstractNumId w:val="23"/>
   </w:num>
   <w:num w:numId="34" w16cid:durableId="808284947">
-    <w:abstractNumId w:val="28"/>
+    <w:abstractNumId w:val="30"/>
     <w:lvlOverride w:ilvl="0">
       <w:startOverride w:val="1"/>
     </w:lvlOverride>
@@ -6805,7 +5749,7 @@
     </w:lvlOverride>
   </w:num>
   <w:num w:numId="35" w16cid:durableId="2024043392">
-    <w:abstractNumId w:val="34"/>
+    <w:abstractNumId w:val="36"/>
   </w:num>
   <w:num w:numId="36" w16cid:durableId="774833535">
     <w:abstractNumId w:val="3"/>
@@ -6818,6 +5762,12 @@
   </w:num>
   <w:num w:numId="39" w16cid:durableId="1069156368">
     <w:abstractNumId w:val="21"/>
+  </w:num>
+  <w:num w:numId="40" w16cid:durableId="878710973">
+    <w:abstractNumId w:val="28"/>
+  </w:num>
+  <w:num w:numId="41" w16cid:durableId="381248562">
+    <w:abstractNumId w:val="26"/>
   </w:num>
 </w:numbering>
 </file>

</xml_diff>

<commit_message>
Updated RD doc for increment 2
</commit_message>
<xml_diff>
--- a/Requirements&Design.docx
+++ b/Requirements&Design.docx
@@ -167,7 +167,15 @@
           <w:sz w:val="28"/>
           <w:bdr w:val="none" w:sz="0" w:space="0" w:color="auto" w:frame="1"/>
         </w:rPr>
-        <w:t>Version 1.0</w:t>
+        <w:t xml:space="preserve">Version </w:t>
+      </w:r>
+      <w:r>
+        <w:rPr>
+          <w:rFonts w:ascii="Arial" w:hAnsi="Arial" w:cs="Arial"/>
+          <w:sz w:val="28"/>
+          <w:bdr w:val="none" w:sz="0" w:space="0" w:color="auto" w:frame="1"/>
+        </w:rPr>
+        <w:t>2.0</w:t>
       </w:r>
     </w:p>
     <w:p>
@@ -415,148 +423,204 @@
         <w:t xml:space="preserve"> points)</w:t>
       </w:r>
     </w:p>
+    <w:p/>
     <w:p>
       <w:pPr>
-        <w:rPr>
-          <w:rFonts w:hint="eastAsia"/>
-        </w:rPr>
-      </w:pPr>
+        <w:shd w:val="clear" w:color="auto" w:fill="FFFFFF"/>
+        <w:rPr>
+          <w:rFonts w:ascii="Arial" w:hAnsi="Arial" w:cs="Arial"/>
+          <w:iCs/>
+          <w:color w:val="000000"/>
+          <w:sz w:val="20"/>
+          <w:szCs w:val="20"/>
+          <w:bdr w:val="none" w:sz="0" w:space="0" w:color="auto" w:frame="1"/>
+        </w:rPr>
+      </w:pPr>
+      <w:r>
+        <w:rPr>
+          <w:rFonts w:ascii="Arial" w:hAnsi="Arial" w:cs="Arial"/>
+          <w:i/>
+          <w:color w:val="000000"/>
+          <w:sz w:val="20"/>
+          <w:szCs w:val="20"/>
+          <w:bdr w:val="none" w:sz="0" w:space="0" w:color="auto" w:frame="1"/>
+        </w:rPr>
+        <w:t xml:space="preserve"> </w:t>
+      </w:r>
+      <w:r>
+        <w:rPr>
+          <w:rFonts w:ascii="Arial" w:hAnsi="Arial" w:cs="Arial"/>
+          <w:iCs/>
+          <w:color w:val="000000" w:themeColor="text1"/>
+          <w:sz w:val="20"/>
+          <w:szCs w:val="20"/>
+          <w:bdr w:val="none" w:sz="0" w:space="0" w:color="auto" w:frame="1"/>
+        </w:rPr>
+        <w:t xml:space="preserve">Our application is a Magic: The Gathering card tracker which will allow users </w:t>
+      </w:r>
+      <w:r>
+        <w:rPr>
+          <w:rFonts w:ascii="Arial" w:hAnsi="Arial" w:cs="Arial"/>
+          <w:iCs/>
+          <w:color w:val="000000" w:themeColor="text1"/>
+          <w:sz w:val="20"/>
+          <w:szCs w:val="20"/>
+          <w:bdr w:val="none" w:sz="0" w:space="0" w:color="auto" w:frame="1"/>
+        </w:rPr>
+        <w:t>to be notified when their tracked cards reach a price that goes below a certain threshold.</w:t>
+      </w:r>
+      <w:r>
+        <w:rPr>
+          <w:rFonts w:ascii="Arial" w:hAnsi="Arial" w:cs="Arial"/>
+          <w:iCs/>
+          <w:color w:val="000000" w:themeColor="text1"/>
+          <w:sz w:val="20"/>
+          <w:szCs w:val="20"/>
+          <w:bdr w:val="none" w:sz="0" w:space="0" w:color="auto" w:frame="1"/>
+        </w:rPr>
+        <w:t xml:space="preserve"> Users will be able to sign up, and login using a</w:t>
+      </w:r>
+      <w:r>
+        <w:rPr>
+          <w:rFonts w:ascii="Arial" w:hAnsi="Arial" w:cs="Arial"/>
+          <w:iCs/>
+          <w:color w:val="000000" w:themeColor="text1"/>
+          <w:sz w:val="20"/>
+          <w:szCs w:val="20"/>
+          <w:bdr w:val="none" w:sz="0" w:space="0" w:color="auto" w:frame="1"/>
+        </w:rPr>
+        <w:t xml:space="preserve"> username,</w:t>
+      </w:r>
+      <w:r>
+        <w:rPr>
+          <w:rFonts w:ascii="Arial" w:hAnsi="Arial" w:cs="Arial"/>
+          <w:iCs/>
+          <w:color w:val="000000" w:themeColor="text1"/>
+          <w:sz w:val="20"/>
+          <w:szCs w:val="20"/>
+          <w:bdr w:val="none" w:sz="0" w:space="0" w:color="auto" w:frame="1"/>
+        </w:rPr>
+        <w:t xml:space="preserve"> email and password and then search for cards to track using various search information.</w:t>
+      </w:r>
+      <w:r>
+        <w:rPr>
+          <w:rFonts w:ascii="Arial" w:hAnsi="Arial" w:cs="Arial"/>
+          <w:iCs/>
+          <w:color w:val="000000" w:themeColor="text1"/>
+          <w:sz w:val="20"/>
+          <w:szCs w:val="20"/>
+          <w:bdr w:val="none" w:sz="0" w:space="0" w:color="auto" w:frame="1"/>
+        </w:rPr>
+        <w:t xml:space="preserve"> </w:t>
+      </w:r>
+      <w:r>
+        <w:rPr>
+          <w:rFonts w:ascii="Arial" w:hAnsi="Arial" w:cs="Arial"/>
+          <w:iCs/>
+          <w:color w:val="000000" w:themeColor="text1"/>
+          <w:sz w:val="20"/>
+          <w:szCs w:val="20"/>
+          <w:bdr w:val="none" w:sz="0" w:space="0" w:color="auto" w:frame="1"/>
+        </w:rPr>
+        <w:t>They</w:t>
+      </w:r>
+      <w:r>
+        <w:rPr>
+          <w:rFonts w:ascii="Arial" w:hAnsi="Arial" w:cs="Arial"/>
+          <w:iCs/>
+          <w:color w:val="000000" w:themeColor="text1"/>
+          <w:sz w:val="20"/>
+          <w:szCs w:val="20"/>
+          <w:bdr w:val="none" w:sz="0" w:space="0" w:color="auto" w:frame="1"/>
+        </w:rPr>
+        <w:t xml:space="preserve"> will </w:t>
+      </w:r>
+      <w:proofErr w:type="gramStart"/>
+      <w:r>
+        <w:rPr>
+          <w:rFonts w:ascii="Arial" w:hAnsi="Arial" w:cs="Arial"/>
+          <w:iCs/>
+          <w:color w:val="000000" w:themeColor="text1"/>
+          <w:sz w:val="20"/>
+          <w:szCs w:val="20"/>
+          <w:bdr w:val="none" w:sz="0" w:space="0" w:color="auto" w:frame="1"/>
+        </w:rPr>
+        <w:t>interact</w:t>
+      </w:r>
+      <w:r>
+        <w:rPr>
+          <w:rFonts w:ascii="Arial" w:hAnsi="Arial" w:cs="Arial"/>
+          <w:iCs/>
+          <w:color w:val="000000" w:themeColor="text1"/>
+          <w:sz w:val="20"/>
+          <w:szCs w:val="20"/>
+          <w:bdr w:val="none" w:sz="0" w:space="0" w:color="auto" w:frame="1"/>
+        </w:rPr>
+        <w:t xml:space="preserve"> with</w:t>
+      </w:r>
+      <w:proofErr w:type="gramEnd"/>
+      <w:r>
+        <w:rPr>
+          <w:rFonts w:ascii="Arial" w:hAnsi="Arial" w:cs="Arial"/>
+          <w:iCs/>
+          <w:color w:val="000000" w:themeColor="text1"/>
+          <w:sz w:val="20"/>
+          <w:szCs w:val="20"/>
+          <w:bdr w:val="none" w:sz="0" w:space="0" w:color="auto" w:frame="1"/>
+        </w:rPr>
+        <w:t xml:space="preserve"> using a</w:t>
+      </w:r>
+      <w:r>
+        <w:rPr>
+          <w:rFonts w:ascii="Arial" w:hAnsi="Arial" w:cs="Arial"/>
+          <w:iCs/>
+          <w:color w:val="000000" w:themeColor="text1"/>
+          <w:sz w:val="20"/>
+          <w:szCs w:val="20"/>
+          <w:bdr w:val="none" w:sz="0" w:space="0" w:color="auto" w:frame="1"/>
+        </w:rPr>
+        <w:t xml:space="preserve"> smooth and fast web interface.</w:t>
+      </w:r>
     </w:p>
     <w:p>
       <w:pPr>
-        <w:shd w:val="clear" w:color="auto" w:fill="FFFFFF"/>
-        <w:rPr>
-          <w:rFonts w:ascii="Arial" w:hAnsi="Arial" w:cs="Arial"/>
-          <w:iCs/>
-          <w:color w:val="000000"/>
-          <w:sz w:val="20"/>
-          <w:szCs w:val="20"/>
-          <w:bdr w:val="none" w:sz="0" w:space="0" w:color="auto" w:frame="1"/>
-        </w:rPr>
-      </w:pPr>
-      <w:r>
-        <w:rPr>
-          <w:rFonts w:ascii="Arial" w:hAnsi="Arial" w:cs="Arial"/>
-          <w:i/>
-          <w:color w:val="000000"/>
-          <w:sz w:val="20"/>
-          <w:szCs w:val="20"/>
+        <w:pStyle w:val="Heading1"/>
+        <w:rPr>
+          <w:bdr w:val="none" w:sz="0" w:space="0" w:color="auto" w:frame="1"/>
+        </w:rPr>
+      </w:pPr>
+      <w:r>
+        <w:rPr>
+          <w:bdr w:val="none" w:sz="0" w:space="0" w:color="auto" w:frame="1"/>
+        </w:rPr>
+        <w:t>Functional Requirements</w:t>
+      </w:r>
+      <w:r>
+        <w:rPr>
           <w:bdr w:val="none" w:sz="0" w:space="0" w:color="auto" w:frame="1"/>
         </w:rPr>
         <w:t xml:space="preserve"> </w:t>
       </w:r>
       <w:r>
         <w:rPr>
-          <w:rFonts w:ascii="Arial" w:hAnsi="Arial" w:cs="Arial"/>
-          <w:iCs/>
-          <w:color w:val="000000" w:themeColor="text1"/>
-          <w:sz w:val="20"/>
-          <w:szCs w:val="20"/>
-          <w:bdr w:val="none" w:sz="0" w:space="0" w:color="auto" w:frame="1"/>
-        </w:rPr>
-        <w:t xml:space="preserve">Our application is a Magic: The Gathering card tracker which will allow users </w:t>
-      </w:r>
-      <w:r>
-        <w:rPr>
-          <w:rFonts w:ascii="Arial" w:hAnsi="Arial" w:cs="Arial"/>
-          <w:iCs/>
-          <w:color w:val="000000" w:themeColor="text1"/>
-          <w:sz w:val="20"/>
-          <w:szCs w:val="20"/>
-          <w:bdr w:val="none" w:sz="0" w:space="0" w:color="auto" w:frame="1"/>
-        </w:rPr>
-        <w:t>to be notified when their tracked cards reach a price that goes below a certain threshold.</w:t>
-      </w:r>
-      <w:r>
-        <w:rPr>
-          <w:rFonts w:ascii="Arial" w:hAnsi="Arial" w:cs="Arial"/>
-          <w:iCs/>
-          <w:color w:val="000000" w:themeColor="text1"/>
-          <w:sz w:val="20"/>
-          <w:szCs w:val="20"/>
-          <w:bdr w:val="none" w:sz="0" w:space="0" w:color="auto" w:frame="1"/>
-        </w:rPr>
-        <w:t xml:space="preserve"> Users will be able to sign up, and login using an email and password and then search for cards to track using various search information.</w:t>
-      </w:r>
-      <w:r>
-        <w:rPr>
-          <w:rFonts w:ascii="Arial" w:hAnsi="Arial" w:cs="Arial"/>
-          <w:iCs/>
-          <w:color w:val="000000" w:themeColor="text1"/>
-          <w:sz w:val="20"/>
-          <w:szCs w:val="20"/>
-          <w:bdr w:val="none" w:sz="0" w:space="0" w:color="auto" w:frame="1"/>
-        </w:rPr>
-        <w:t xml:space="preserve"> </w:t>
-      </w:r>
-      <w:r>
-        <w:rPr>
-          <w:rFonts w:ascii="Arial" w:hAnsi="Arial" w:cs="Arial"/>
-          <w:iCs/>
-          <w:color w:val="000000" w:themeColor="text1"/>
-          <w:sz w:val="20"/>
-          <w:szCs w:val="20"/>
-          <w:bdr w:val="none" w:sz="0" w:space="0" w:color="auto" w:frame="1"/>
-        </w:rPr>
-        <w:t xml:space="preserve">It will be interacted with using a web browser interface </w:t>
-      </w:r>
-      <w:r>
-        <w:rPr>
-          <w:rFonts w:ascii="Arial" w:hAnsi="Arial" w:cs="Arial"/>
-          <w:iCs/>
-          <w:color w:val="000000" w:themeColor="text1"/>
-          <w:sz w:val="20"/>
-          <w:szCs w:val="20"/>
-          <w:bdr w:val="none" w:sz="0" w:space="0" w:color="auto" w:frame="1"/>
-        </w:rPr>
-        <w:t>with a supposed smooth and fast feel.</w:t>
+          <w:bdr w:val="none" w:sz="0" w:space="0" w:color="auto" w:frame="1"/>
+        </w:rPr>
+        <w:t>(</w:t>
+      </w:r>
+      <w:r>
+        <w:rPr>
+          <w:bdr w:val="none" w:sz="0" w:space="0" w:color="auto" w:frame="1"/>
+        </w:rPr>
+        <w:t>10</w:t>
+      </w:r>
+      <w:r>
+        <w:rPr>
+          <w:bdr w:val="none" w:sz="0" w:space="0" w:color="auto" w:frame="1"/>
+        </w:rPr>
+        <w:t xml:space="preserve"> points)</w:t>
       </w:r>
     </w:p>
-    <w:p>
-      <w:pPr>
-        <w:pStyle w:val="Heading1"/>
-        <w:rPr>
-          <w:bdr w:val="none" w:sz="0" w:space="0" w:color="auto" w:frame="1"/>
-        </w:rPr>
-      </w:pPr>
-      <w:r>
-        <w:rPr>
-          <w:bdr w:val="none" w:sz="0" w:space="0" w:color="auto" w:frame="1"/>
-        </w:rPr>
-        <w:t>Functional Requirements</w:t>
-      </w:r>
-      <w:r>
-        <w:rPr>
-          <w:bdr w:val="none" w:sz="0" w:space="0" w:color="auto" w:frame="1"/>
-        </w:rPr>
-        <w:t xml:space="preserve"> </w:t>
-      </w:r>
-      <w:r>
-        <w:rPr>
-          <w:bdr w:val="none" w:sz="0" w:space="0" w:color="auto" w:frame="1"/>
-        </w:rPr>
-        <w:t>(</w:t>
-      </w:r>
-      <w:r>
-        <w:rPr>
-          <w:bdr w:val="none" w:sz="0" w:space="0" w:color="auto" w:frame="1"/>
-        </w:rPr>
-        <w:t>10</w:t>
-      </w:r>
-      <w:r>
-        <w:rPr>
-          <w:bdr w:val="none" w:sz="0" w:space="0" w:color="auto" w:frame="1"/>
-        </w:rPr>
-        <w:t xml:space="preserve"> points)</w:t>
-      </w:r>
-    </w:p>
-    <w:p>
-      <w:pPr>
-        <w:rPr>
-          <w:rFonts w:hint="eastAsia"/>
-        </w:rPr>
-      </w:pPr>
-    </w:p>
+    <w:p/>
     <w:p>
       <w:pPr>
         <w:pStyle w:val="ListParagraph"/>
@@ -730,6 +794,11 @@
         </w:numPr>
         <w:shd w:val="clear" w:color="auto" w:fill="FFFFFF"/>
         <w:rPr>
+          <w:bdr w:val="none" w:sz="0" w:space="0" w:color="auto" w:frame="1"/>
+        </w:rPr>
+      </w:pPr>
+      <w:r>
+        <w:rPr>
           <w:rFonts w:ascii="Arial" w:hAnsi="Arial" w:cs="Arial"/>
           <w:iCs/>
           <w:color w:val="000000" w:themeColor="text1"/>
@@ -737,7 +806,8 @@
           <w:szCs w:val="20"/>
           <w:bdr w:val="none" w:sz="0" w:space="0" w:color="auto" w:frame="1"/>
         </w:rPr>
-      </w:pPr>
+        <w:t xml:space="preserve">The time it takes to add or remove a card from the </w:t>
+      </w:r>
       <w:r>
         <w:rPr>
           <w:rFonts w:ascii="Arial" w:hAnsi="Arial" w:cs="Arial"/>
@@ -747,7 +817,7 @@
           <w:szCs w:val="20"/>
           <w:bdr w:val="none" w:sz="0" w:space="0" w:color="auto" w:frame="1"/>
         </w:rPr>
-        <w:t xml:space="preserve">The time it takes to add or remove a card from the </w:t>
+        <w:t>user’s list should feel instant</w:t>
       </w:r>
       <w:r>
         <w:rPr>
@@ -758,7 +828,18 @@
           <w:szCs w:val="20"/>
           <w:bdr w:val="none" w:sz="0" w:space="0" w:color="auto" w:frame="1"/>
         </w:rPr>
-        <w:t>user’s list should feel instant.</w:t>
+        <w:t>, but the actual update on the server does not have to be</w:t>
+      </w:r>
+      <w:r>
+        <w:rPr>
+          <w:rFonts w:ascii="Arial" w:hAnsi="Arial" w:cs="Arial"/>
+          <w:iCs/>
+          <w:color w:val="000000" w:themeColor="text1"/>
+          <w:sz w:val="20"/>
+          <w:szCs w:val="20"/>
+          <w:bdr w:val="none" w:sz="0" w:space="0" w:color="auto" w:frame="1"/>
+        </w:rPr>
+        <w:t>.</w:t>
       </w:r>
     </w:p>
     <w:p>
@@ -772,6 +853,12 @@
         <w:rPr>
           <w:bdr w:val="none" w:sz="0" w:space="0" w:color="auto" w:frame="1"/>
         </w:rPr>
+        <w:t xml:space="preserve"> </w:t>
+      </w:r>
+      <w:r>
+        <w:rPr>
+          <w:bdr w:val="none" w:sz="0" w:space="0" w:color="auto" w:frame="1"/>
+        </w:rPr>
         <w:t>Non-functional Requirements </w:t>
       </w:r>
       <w:r>
@@ -793,13 +880,7 @@
         <w:t xml:space="preserve"> points)</w:t>
       </w:r>
     </w:p>
-    <w:p>
-      <w:pPr>
-        <w:rPr>
-          <w:rFonts w:hint="eastAsia"/>
-        </w:rPr>
-      </w:pPr>
-    </w:p>
+    <w:p/>
     <w:p>
       <w:pPr>
         <w:pStyle w:val="ListParagraph"/>
@@ -970,6 +1051,90 @@
     </w:p>
     <w:p>
       <w:pPr>
+        <w:pStyle w:val="ListParagraph"/>
+        <w:numPr>
+          <w:ilvl w:val="0"/>
+          <w:numId w:val="40"/>
+        </w:numPr>
+        <w:shd w:val="clear" w:color="auto" w:fill="FFFFFF"/>
+        <w:rPr>
+          <w:rFonts w:ascii="Lucida Grande" w:hAnsi="Lucida Grande" w:cs="Lucida Grande"/>
+          <w:iCs/>
+          <w:color w:val="000000" w:themeColor="text1"/>
+        </w:rPr>
+      </w:pPr>
+      <w:r>
+        <w:rPr>
+          <w:rFonts w:ascii="Arial" w:hAnsi="Arial" w:cs="Arial"/>
+          <w:iCs/>
+          <w:color w:val="000000" w:themeColor="text1"/>
+          <w:sz w:val="20"/>
+          <w:szCs w:val="20"/>
+          <w:bdr w:val="none" w:sz="0" w:space="0" w:color="auto" w:frame="1"/>
+        </w:rPr>
+        <w:t>Users’ passwords should be hashed and require a certain minimum character count.</w:t>
+      </w:r>
+    </w:p>
+    <w:p>
+      <w:pPr>
+        <w:pStyle w:val="ListParagraph"/>
+        <w:numPr>
+          <w:ilvl w:val="0"/>
+          <w:numId w:val="40"/>
+        </w:numPr>
+        <w:shd w:val="clear" w:color="auto" w:fill="FFFFFF"/>
+        <w:rPr>
+          <w:rFonts w:ascii="Arial" w:hAnsi="Arial" w:cs="Arial"/>
+          <w:iCs/>
+          <w:color w:val="000000" w:themeColor="text1"/>
+          <w:sz w:val="20"/>
+          <w:szCs w:val="20"/>
+          <w:bdr w:val="none" w:sz="0" w:space="0" w:color="auto" w:frame="1"/>
+        </w:rPr>
+      </w:pPr>
+      <w:r>
+        <w:rPr>
+          <w:rFonts w:ascii="Arial" w:hAnsi="Arial" w:cs="Arial"/>
+          <w:iCs/>
+          <w:color w:val="000000" w:themeColor="text1"/>
+          <w:sz w:val="20"/>
+          <w:szCs w:val="20"/>
+          <w:bdr w:val="none" w:sz="0" w:space="0" w:color="auto" w:frame="1"/>
+        </w:rPr>
+        <w:t>Users should be required to verify their email.</w:t>
+      </w:r>
+    </w:p>
+    <w:p>
+      <w:pPr>
+        <w:pStyle w:val="ListParagraph"/>
+        <w:numPr>
+          <w:ilvl w:val="0"/>
+          <w:numId w:val="40"/>
+        </w:numPr>
+        <w:shd w:val="clear" w:color="auto" w:fill="FFFFFF"/>
+        <w:rPr>
+          <w:rFonts w:ascii="Arial" w:hAnsi="Arial" w:cs="Arial"/>
+          <w:iCs/>
+          <w:color w:val="000000" w:themeColor="text1"/>
+          <w:sz w:val="20"/>
+          <w:szCs w:val="20"/>
+          <w:bdr w:val="none" w:sz="0" w:space="0" w:color="auto" w:frame="1"/>
+        </w:rPr>
+      </w:pPr>
+      <w:r>
+        <w:rPr>
+          <w:rFonts w:ascii="Arial" w:hAnsi="Arial" w:cs="Arial"/>
+          <w:iCs/>
+          <w:color w:val="000000" w:themeColor="text1"/>
+          <w:sz w:val="20"/>
+          <w:szCs w:val="20"/>
+          <w:bdr w:val="none" w:sz="0" w:space="0" w:color="auto" w:frame="1"/>
+        </w:rPr>
+        <w:t>There should be a navigation bar at the top of the screen to make navigation simple and easy to understand.</w:t>
+      </w:r>
+    </w:p>
+    <w:p>
+      <w:pPr>
         <w:pStyle w:val="Heading1"/>
         <w:rPr>
           <w:bdr w:val="none" w:sz="0" w:space="0" w:color="auto" w:frame="1"/>
@@ -1029,11 +1194,13 @@
         <w:rPr>
           <w:rFonts w:ascii="Arial" w:hAnsi="Arial" w:cs="Arial"/>
           <w:i/>
+          <w:noProof/>
           <w:color w:val="EE0000"/>
           <w:sz w:val="20"/>
           <w:szCs w:val="20"/>
           <w:bdr w:val="none" w:sz="0" w:space="0" w:color="auto" w:frame="1"/>
         </w:rPr>
+        <w:lastRenderedPageBreak/>
         <w:drawing>
           <wp:inline distT="0" distB="0" distL="0" distR="0" wp14:anchorId="2AE43620" wp14:editId="0E9B5848">
             <wp:extent cx="3648075" cy="3411626"/>
@@ -1082,7 +1249,6 @@
         <w:rPr>
           <w:bdr w:val="none" w:sz="0" w:space="0" w:color="auto" w:frame="1"/>
         </w:rPr>
-        <w:lastRenderedPageBreak/>
         <w:t>Class Diagram</w:t>
       </w:r>
       <w:r>
@@ -1122,13 +1288,7 @@
         <w:t xml:space="preserve"> (15 points)</w:t>
       </w:r>
     </w:p>
-    <w:p>
-      <w:pPr>
-        <w:rPr>
-          <w:rFonts w:hint="eastAsia"/>
-        </w:rPr>
-      </w:pPr>
-    </w:p>
+    <w:p/>
     <w:p>
       <w:pPr>
         <w:shd w:val="clear" w:color="auto" w:fill="FFFFFF"/>
@@ -1145,16 +1305,17 @@
         <w:rPr>
           <w:rFonts w:ascii="Arial" w:hAnsi="Arial" w:cs="Arial"/>
           <w:i/>
+          <w:noProof/>
           <w:color w:val="EE0000"/>
           <w:sz w:val="20"/>
           <w:szCs w:val="20"/>
           <w:bdr w:val="none" w:sz="0" w:space="0" w:color="auto" w:frame="1"/>
         </w:rPr>
         <w:drawing>
-          <wp:inline distT="0" distB="0" distL="0" distR="0" wp14:anchorId="4A6516AD" wp14:editId="1DA913C2">
-            <wp:extent cx="5486400" cy="2760345"/>
-            <wp:effectExtent l="0" t="0" r="0" b="1905"/>
-            <wp:docPr id="26961240" name="Picture 1"/>
+          <wp:inline distT="0" distB="0" distL="0" distR="0" wp14:anchorId="2994C1B6" wp14:editId="1E6B9885">
+            <wp:extent cx="5486400" cy="2653665"/>
+            <wp:effectExtent l="0" t="0" r="0" b="0"/>
+            <wp:docPr id="34964443" name="Picture 1"/>
             <wp:cNvGraphicFramePr>
               <a:graphicFrameLocks xmlns:a="http://schemas.openxmlformats.org/drawingml/2006/main" noChangeAspect="1"/>
             </wp:cNvGraphicFramePr>
@@ -1162,7 +1323,7 @@
               <a:graphicData uri="http://schemas.openxmlformats.org/drawingml/2006/picture">
                 <pic:pic xmlns:pic="http://schemas.openxmlformats.org/drawingml/2006/picture">
                   <pic:nvPicPr>
-                    <pic:cNvPr id="26961240" name=""/>
+                    <pic:cNvPr id="34964443" name=""/>
                     <pic:cNvPicPr/>
                   </pic:nvPicPr>
                   <pic:blipFill>
@@ -1174,7 +1335,7 @@
                   <pic:spPr>
                     <a:xfrm>
                       <a:off x="0" y="0"/>
-                      <a:ext cx="5486400" cy="2760345"/>
+                      <a:ext cx="5486400" cy="2653665"/>
                     </a:xfrm>
                     <a:prstGeom prst="rect">
                       <a:avLst/>
@@ -1232,37 +1393,117 @@
           <w:szCs w:val="20"/>
           <w:bdr w:val="none" w:sz="0" w:space="0" w:color="auto" w:frame="1"/>
         </w:rPr>
-        <w:t xml:space="preserve">The software is a web application that will most likely be referenceable by any web browser. The front-end setup will mainly be developed for large screen sizes like </w:t>
-      </w:r>
-      <w:r>
-        <w:rPr>
-          <w:rFonts w:ascii="Arial" w:hAnsi="Arial" w:cs="Arial"/>
-          <w:color w:val="000000" w:themeColor="text1"/>
-          <w:sz w:val="20"/>
-          <w:szCs w:val="20"/>
-          <w:bdr w:val="none" w:sz="0" w:space="0" w:color="auto" w:frame="1"/>
-        </w:rPr>
-        <w:t xml:space="preserve">computers and not setup with mobile screens in mind. If we choose to deploy the web </w:t>
-      </w:r>
-      <w:r>
-        <w:rPr>
-          <w:rFonts w:ascii="Arial" w:hAnsi="Arial" w:cs="Arial"/>
-          <w:color w:val="000000" w:themeColor="text1"/>
-          <w:sz w:val="20"/>
-          <w:szCs w:val="20"/>
-          <w:bdr w:val="none" w:sz="0" w:space="0" w:color="auto" w:frame="1"/>
-        </w:rPr>
-        <w:t>application,</w:t>
-      </w:r>
-      <w:r>
-        <w:rPr>
-          <w:rFonts w:ascii="Arial" w:hAnsi="Arial" w:cs="Arial"/>
-          <w:color w:val="000000" w:themeColor="text1"/>
-          <w:sz w:val="20"/>
-          <w:szCs w:val="20"/>
-          <w:bdr w:val="none" w:sz="0" w:space="0" w:color="auto" w:frame="1"/>
-        </w:rPr>
-        <w:t xml:space="preserve"> it will most likely run on a Linux cloud server.</w:t>
+        <w:t>The software is a web application that will</w:t>
+      </w:r>
+      <w:r>
+        <w:rPr>
+          <w:rFonts w:ascii="Arial" w:hAnsi="Arial" w:cs="Arial"/>
+          <w:color w:val="000000" w:themeColor="text1"/>
+          <w:sz w:val="20"/>
+          <w:szCs w:val="20"/>
+          <w:bdr w:val="none" w:sz="0" w:space="0" w:color="auto" w:frame="1"/>
+        </w:rPr>
+        <w:t xml:space="preserve"> be usable by</w:t>
+      </w:r>
+      <w:r>
+        <w:rPr>
+          <w:rFonts w:ascii="Arial" w:hAnsi="Arial" w:cs="Arial"/>
+          <w:color w:val="000000" w:themeColor="text1"/>
+          <w:sz w:val="20"/>
+          <w:szCs w:val="20"/>
+          <w:bdr w:val="none" w:sz="0" w:space="0" w:color="auto" w:frame="1"/>
+        </w:rPr>
+        <w:t xml:space="preserve"> any web browser. </w:t>
+      </w:r>
+      <w:r>
+        <w:rPr>
+          <w:rFonts w:ascii="Arial" w:hAnsi="Arial" w:cs="Arial"/>
+          <w:color w:val="000000" w:themeColor="text1"/>
+          <w:sz w:val="20"/>
+          <w:szCs w:val="20"/>
+          <w:bdr w:val="none" w:sz="0" w:space="0" w:color="auto" w:frame="1"/>
+        </w:rPr>
+        <w:t>The front end is developed for a computer monitor interface</w:t>
+      </w:r>
+      <w:r>
+        <w:rPr>
+          <w:rFonts w:ascii="Arial" w:hAnsi="Arial" w:cs="Arial"/>
+          <w:color w:val="000000" w:themeColor="text1"/>
+          <w:sz w:val="20"/>
+          <w:szCs w:val="20"/>
+          <w:bdr w:val="none" w:sz="0" w:space="0" w:color="auto" w:frame="1"/>
+        </w:rPr>
+        <w:t xml:space="preserve"> and is not meant for devices like phones or tables</w:t>
+      </w:r>
+      <w:r>
+        <w:rPr>
+          <w:rFonts w:ascii="Arial" w:hAnsi="Arial" w:cs="Arial"/>
+          <w:color w:val="000000" w:themeColor="text1"/>
+          <w:sz w:val="20"/>
+          <w:szCs w:val="20"/>
+          <w:bdr w:val="none" w:sz="0" w:space="0" w:color="auto" w:frame="1"/>
+        </w:rPr>
+        <w:t xml:space="preserve">. For development all </w:t>
+      </w:r>
+      <w:r>
+        <w:rPr>
+          <w:rFonts w:ascii="Arial" w:hAnsi="Arial" w:cs="Arial"/>
+          <w:color w:val="000000" w:themeColor="text1"/>
+          <w:sz w:val="20"/>
+          <w:szCs w:val="20"/>
+          <w:bdr w:val="none" w:sz="0" w:space="0" w:color="auto" w:frame="1"/>
+        </w:rPr>
+        <w:t>developers use</w:t>
+      </w:r>
+      <w:r>
+        <w:rPr>
+          <w:rFonts w:ascii="Arial" w:hAnsi="Arial" w:cs="Arial"/>
+          <w:color w:val="000000" w:themeColor="text1"/>
+          <w:sz w:val="20"/>
+          <w:szCs w:val="20"/>
+          <w:bdr w:val="none" w:sz="0" w:space="0" w:color="auto" w:frame="1"/>
+        </w:rPr>
+        <w:t xml:space="preserve"> Windows</w:t>
+      </w:r>
+      <w:r>
+        <w:rPr>
+          <w:rFonts w:ascii="Arial" w:hAnsi="Arial" w:cs="Arial"/>
+          <w:color w:val="000000" w:themeColor="text1"/>
+          <w:sz w:val="20"/>
+          <w:szCs w:val="20"/>
+          <w:bdr w:val="none" w:sz="0" w:space="0" w:color="auto" w:frame="1"/>
+        </w:rPr>
+        <w:t xml:space="preserve"> and require</w:t>
+      </w:r>
+      <w:r>
+        <w:rPr>
+          <w:rFonts w:ascii="Arial" w:hAnsi="Arial" w:cs="Arial"/>
+          <w:color w:val="000000" w:themeColor="text1"/>
+          <w:sz w:val="20"/>
+          <w:szCs w:val="20"/>
+          <w:bdr w:val="none" w:sz="0" w:space="0" w:color="auto" w:frame="1"/>
+        </w:rPr>
+        <w:t xml:space="preserve"> python and NPM for the basic pieces. The automation scripts that are used to develop and set up the environment are </w:t>
+      </w:r>
+      <w:r>
+        <w:rPr>
+          <w:rFonts w:ascii="Arial" w:hAnsi="Arial" w:cs="Arial"/>
+          <w:color w:val="000000" w:themeColor="text1"/>
+          <w:sz w:val="20"/>
+          <w:szCs w:val="20"/>
+          <w:bdr w:val="none" w:sz="0" w:space="0" w:color="auto" w:frame="1"/>
+        </w:rPr>
+        <w:t>set up</w:t>
+      </w:r>
+      <w:r>
+        <w:rPr>
+          <w:rFonts w:ascii="Arial" w:hAnsi="Arial" w:cs="Arial"/>
+          <w:color w:val="000000" w:themeColor="text1"/>
+          <w:sz w:val="20"/>
+          <w:szCs w:val="20"/>
+          <w:bdr w:val="none" w:sz="0" w:space="0" w:color="auto" w:frame="1"/>
+        </w:rPr>
+        <w:t xml:space="preserve"> strictly for Windows, but may be changed later depending on if we plan on deploying the web app.</w:t>
       </w:r>
     </w:p>
     <w:p>
@@ -1276,6 +1517,7 @@
         <w:rPr>
           <w:bdr w:val="none" w:sz="0" w:space="0" w:color="auto" w:frame="1"/>
         </w:rPr>
+        <w:lastRenderedPageBreak/>
         <w:t xml:space="preserve">Assumptions and Dependencies </w:t>
       </w:r>
       <w:r>
@@ -1325,77 +1567,59 @@
           <w:szCs w:val="20"/>
           <w:bdr w:val="none" w:sz="0" w:space="0" w:color="auto" w:frame="1"/>
         </w:rPr>
-        <w:t>only work assuming the required external APIs for card prices stay available. The hosting for the database systems is not determined yet.</w:t>
-      </w:r>
-      <w:r>
-        <w:rPr>
-          <w:rFonts w:ascii="Arial" w:hAnsi="Arial" w:cs="Arial"/>
-          <w:color w:val="000000" w:themeColor="text1"/>
-          <w:sz w:val="20"/>
-          <w:szCs w:val="20"/>
-          <w:bdr w:val="none" w:sz="0" w:space="0" w:color="auto" w:frame="1"/>
-        </w:rPr>
-        <w:t xml:space="preserve"> We will</w:t>
-      </w:r>
-      <w:r>
-        <w:rPr>
-          <w:rFonts w:ascii="Arial" w:hAnsi="Arial" w:cs="Arial"/>
-          <w:color w:val="000000" w:themeColor="text1"/>
-          <w:sz w:val="20"/>
-          <w:szCs w:val="20"/>
-          <w:bdr w:val="none" w:sz="0" w:space="0" w:color="auto" w:frame="1"/>
-        </w:rPr>
-        <w:t xml:space="preserve"> most likely be using Flask with Python and then NodeJS packages for handling </w:t>
-      </w:r>
-      <w:r>
-        <w:rPr>
-          <w:rFonts w:ascii="Arial" w:hAnsi="Arial" w:cs="Arial"/>
-          <w:color w:val="000000" w:themeColor="text1"/>
-          <w:sz w:val="20"/>
-          <w:szCs w:val="20"/>
-          <w:bdr w:val="none" w:sz="0" w:space="0" w:color="auto" w:frame="1"/>
-        </w:rPr>
-        <w:t>communication</w:t>
-      </w:r>
-      <w:r>
-        <w:rPr>
-          <w:rFonts w:ascii="Arial" w:hAnsi="Arial" w:cs="Arial"/>
-          <w:color w:val="000000" w:themeColor="text1"/>
-          <w:sz w:val="20"/>
-          <w:szCs w:val="20"/>
-          <w:bdr w:val="none" w:sz="0" w:space="0" w:color="auto" w:frame="1"/>
-        </w:rPr>
-        <w:t xml:space="preserve"> between the front and back end.</w:t>
-      </w:r>
-      <w:r>
-        <w:rPr>
-          <w:rFonts w:ascii="Arial" w:hAnsi="Arial" w:cs="Arial"/>
-          <w:color w:val="000000" w:themeColor="text1"/>
-          <w:sz w:val="20"/>
-          <w:szCs w:val="20"/>
-          <w:bdr w:val="none" w:sz="0" w:space="0" w:color="auto" w:frame="1"/>
-        </w:rPr>
-        <w:t xml:space="preserve"> If we choose to deploy the app for </w:t>
-      </w:r>
-      <w:r>
-        <w:rPr>
-          <w:rFonts w:ascii="Arial" w:hAnsi="Arial" w:cs="Arial"/>
-          <w:color w:val="000000" w:themeColor="text1"/>
-          <w:sz w:val="20"/>
-          <w:szCs w:val="20"/>
-          <w:bdr w:val="none" w:sz="0" w:space="0" w:color="auto" w:frame="1"/>
-        </w:rPr>
-        <w:t>handling the periodic API price checks we will use a Linux server from a host like AWS, Azure, or DigitalOcean.</w:t>
-      </w:r>
-      <w:r>
-        <w:rPr>
-          <w:rFonts w:ascii="Arial" w:hAnsi="Arial" w:cs="Arial"/>
-          <w:color w:val="000000" w:themeColor="text1"/>
-          <w:sz w:val="20"/>
-          <w:szCs w:val="20"/>
-          <w:bdr w:val="none" w:sz="0" w:space="0" w:color="auto" w:frame="1"/>
-        </w:rPr>
-        <w:t xml:space="preserve"> </w:t>
+        <w:t>only work assuming the required external APIs for card prices stay available</w:t>
+      </w:r>
+      <w:r>
+        <w:rPr>
+          <w:rFonts w:ascii="Arial" w:hAnsi="Arial" w:cs="Arial"/>
+          <w:color w:val="000000" w:themeColor="text1"/>
+          <w:sz w:val="20"/>
+          <w:szCs w:val="20"/>
+          <w:bdr w:val="none" w:sz="0" w:space="0" w:color="auto" w:frame="1"/>
+        </w:rPr>
+        <w:t xml:space="preserve">. Currently we are using the </w:t>
+      </w:r>
+      <w:proofErr w:type="spellStart"/>
+      <w:r>
+        <w:rPr>
+          <w:rFonts w:ascii="Arial" w:hAnsi="Arial" w:cs="Arial"/>
+          <w:color w:val="000000" w:themeColor="text1"/>
+          <w:sz w:val="20"/>
+          <w:szCs w:val="20"/>
+          <w:bdr w:val="none" w:sz="0" w:space="0" w:color="auto" w:frame="1"/>
+        </w:rPr>
+        <w:t>Scryfall</w:t>
+      </w:r>
+      <w:proofErr w:type="spellEnd"/>
+      <w:r>
+        <w:rPr>
+          <w:rFonts w:ascii="Arial" w:hAnsi="Arial" w:cs="Arial"/>
+          <w:color w:val="000000" w:themeColor="text1"/>
+          <w:sz w:val="20"/>
+          <w:szCs w:val="20"/>
+          <w:bdr w:val="none" w:sz="0" w:space="0" w:color="auto" w:frame="1"/>
+        </w:rPr>
+        <w:t xml:space="preserve"> price monitoring API</w:t>
+      </w:r>
+      <w:r>
+        <w:rPr>
+          <w:rFonts w:ascii="Arial" w:hAnsi="Arial" w:cs="Arial"/>
+          <w:color w:val="000000" w:themeColor="text1"/>
+          <w:sz w:val="20"/>
+          <w:szCs w:val="20"/>
+          <w:bdr w:val="none" w:sz="0" w:space="0" w:color="auto" w:frame="1"/>
+        </w:rPr>
+        <w:t xml:space="preserve">. </w:t>
+      </w:r>
+      <w:r>
+        <w:rPr>
+          <w:rFonts w:ascii="Arial" w:hAnsi="Arial" w:cs="Arial"/>
+          <w:color w:val="000000" w:themeColor="text1"/>
+          <w:sz w:val="20"/>
+          <w:szCs w:val="20"/>
+          <w:bdr w:val="none" w:sz="0" w:space="0" w:color="auto" w:frame="1"/>
+        </w:rPr>
+        <w:t>We decided to use Neon for hosting the database and we are developing the app using ReactJS front-end and a Python Flask back end. Because Neon is a dependency we are assuming there would be no issues or outages on their part.</w:t>
       </w:r>
     </w:p>
     <w:sectPr>

</xml_diff>

<commit_message>
Added a placeholder yt link and added RD stuff
</commit_message>
<xml_diff>
--- a/Requirements&Design.docx
+++ b/Requirements&Design.docx
@@ -535,7 +535,6 @@
         </w:rPr>
         <w:t xml:space="preserve"> will </w:t>
       </w:r>
-      <w:proofErr w:type="gramStart"/>
       <w:r>
         <w:rPr>
           <w:rFonts w:ascii="Arial" w:hAnsi="Arial" w:cs="Arial"/>
@@ -556,19 +555,7 @@
           <w:szCs w:val="20"/>
           <w:bdr w:val="none" w:sz="0" w:space="0" w:color="auto" w:frame="1"/>
         </w:rPr>
-        <w:t xml:space="preserve"> with</w:t>
-      </w:r>
-      <w:proofErr w:type="gramEnd"/>
-      <w:r>
-        <w:rPr>
-          <w:rFonts w:ascii="Arial" w:hAnsi="Arial" w:cs="Arial"/>
-          <w:iCs/>
-          <w:color w:val="000000" w:themeColor="text1"/>
-          <w:sz w:val="20"/>
-          <w:szCs w:val="20"/>
-          <w:bdr w:val="none" w:sz="0" w:space="0" w:color="auto" w:frame="1"/>
-        </w:rPr>
-        <w:t xml:space="preserve"> using a</w:t>
+        <w:t xml:space="preserve"> with using a</w:t>
       </w:r>
       <w:r>
         <w:rPr>
@@ -1132,6 +1119,53 @@
         </w:rPr>
         <w:t>There should be a navigation bar at the top of the screen to make navigation simple and easy to understand.</w:t>
       </w:r>
+    </w:p>
+    <w:p>
+      <w:pPr>
+        <w:pStyle w:val="ListParagraph"/>
+        <w:numPr>
+          <w:ilvl w:val="0"/>
+          <w:numId w:val="40"/>
+        </w:numPr>
+        <w:shd w:val="clear" w:color="auto" w:fill="FFFFFF"/>
+        <w:rPr>
+          <w:rFonts w:ascii="Arial" w:hAnsi="Arial" w:cs="Arial"/>
+          <w:iCs/>
+          <w:color w:val="000000" w:themeColor="text1"/>
+          <w:sz w:val="20"/>
+          <w:szCs w:val="20"/>
+          <w:bdr w:val="none" w:sz="0" w:space="0" w:color="auto" w:frame="1"/>
+        </w:rPr>
+      </w:pPr>
+      <w:r>
+        <w:rPr>
+          <w:rFonts w:ascii="Arial" w:hAnsi="Arial" w:cs="Arial"/>
+          <w:iCs/>
+          <w:color w:val="000000" w:themeColor="text1"/>
+          <w:sz w:val="20"/>
+          <w:szCs w:val="20"/>
+          <w:bdr w:val="none" w:sz="0" w:space="0" w:color="auto" w:frame="1"/>
+        </w:rPr>
+        <w:t>Logged in users should not be able to go to login and signup page while non-signed in users should not be able to go to login pages like dashboard and account.</w:t>
+      </w:r>
+    </w:p>
+    <w:p>
+      <w:pPr>
+        <w:pStyle w:val="ListParagraph"/>
+        <w:numPr>
+          <w:ilvl w:val="0"/>
+          <w:numId w:val="40"/>
+        </w:numPr>
+        <w:shd w:val="clear" w:color="auto" w:fill="FFFFFF"/>
+        <w:rPr>
+          <w:rFonts w:ascii="Arial" w:hAnsi="Arial" w:cs="Arial"/>
+          <w:iCs/>
+          <w:color w:val="000000" w:themeColor="text1"/>
+          <w:sz w:val="20"/>
+          <w:szCs w:val="20"/>
+          <w:bdr w:val="none" w:sz="0" w:space="0" w:color="auto" w:frame="1"/>
+        </w:rPr>
+      </w:pPr>
     </w:p>
     <w:p>
       <w:pPr>

</xml_diff>

<commit_message>
Made changes to RD doc for inc 3.
Added new use case diagram.
Updated running environment section.
</commit_message>
<xml_diff>
--- a/Requirements&Design.docx
+++ b/Requirements&Design.docx
@@ -555,7 +555,7 @@
           <w:szCs w:val="20"/>
           <w:bdr w:val="none" w:sz="0" w:space="0" w:color="auto" w:frame="1"/>
         </w:rPr>
-        <w:t xml:space="preserve"> with using a</w:t>
+        <w:t xml:space="preserve"> using a</w:t>
       </w:r>
       <w:r>
         <w:rPr>
@@ -831,6 +831,30 @@
     </w:p>
     <w:p>
       <w:pPr>
+        <w:pStyle w:val="ListParagraph"/>
+        <w:numPr>
+          <w:ilvl w:val="0"/>
+          <w:numId w:val="41"/>
+        </w:numPr>
+        <w:shd w:val="clear" w:color="auto" w:fill="FFFFFF"/>
+        <w:rPr>
+          <w:bdr w:val="none" w:sz="0" w:space="0" w:color="auto" w:frame="1"/>
+        </w:rPr>
+      </w:pPr>
+      <w:r>
+        <w:rPr>
+          <w:rFonts w:ascii="Arial" w:hAnsi="Arial" w:cs="Arial"/>
+          <w:iCs/>
+          <w:color w:val="000000" w:themeColor="text1"/>
+          <w:sz w:val="20"/>
+          <w:szCs w:val="20"/>
+          <w:bdr w:val="none" w:sz="0" w:space="0" w:color="auto" w:frame="1"/>
+        </w:rPr>
+        <w:t>Changing user information should take no longer than 3 seconds.</w:t>
+      </w:r>
+    </w:p>
+    <w:p>
+      <w:pPr>
         <w:pStyle w:val="Heading1"/>
         <w:rPr>
           <w:bdr w:val="none" w:sz="0" w:space="0" w:color="auto" w:frame="1"/>
@@ -934,8 +958,9 @@
           <w:szCs w:val="20"/>
           <w:bdr w:val="none" w:sz="0" w:space="0" w:color="auto" w:frame="1"/>
         </w:rPr>
-        <w:t xml:space="preserve">Users should be able to search for cards </w:t>
-      </w:r>
+        <w:t xml:space="preserve">Users should be required to verify their </w:t>
+      </w:r>
+      <w:proofErr w:type="gramStart"/>
       <w:r>
         <w:rPr>
           <w:rFonts w:ascii="Arial" w:hAnsi="Arial" w:cs="Arial"/>
@@ -945,7 +970,43 @@
           <w:szCs w:val="20"/>
           <w:bdr w:val="none" w:sz="0" w:space="0" w:color="auto" w:frame="1"/>
         </w:rPr>
-        <w:t>to add to their list of tracked cards by using certain information like name.</w:t>
+        <w:t>email</w:t>
+      </w:r>
+      <w:proofErr w:type="gramEnd"/>
+      <w:r>
+        <w:rPr>
+          <w:rFonts w:ascii="Arial" w:hAnsi="Arial" w:cs="Arial"/>
+          <w:iCs/>
+          <w:color w:val="000000" w:themeColor="text1"/>
+          <w:sz w:val="20"/>
+          <w:szCs w:val="20"/>
+          <w:bdr w:val="none" w:sz="0" w:space="0" w:color="auto" w:frame="1"/>
+        </w:rPr>
+        <w:t xml:space="preserve"> and the verification process must be secure from cross-site script injection </w:t>
+      </w:r>
+      <w:proofErr w:type="gramStart"/>
+      <w:r>
+        <w:rPr>
+          <w:rFonts w:ascii="Arial" w:hAnsi="Arial" w:cs="Arial"/>
+          <w:iCs/>
+          <w:color w:val="000000" w:themeColor="text1"/>
+          <w:sz w:val="20"/>
+          <w:szCs w:val="20"/>
+          <w:bdr w:val="none" w:sz="0" w:space="0" w:color="auto" w:frame="1"/>
+        </w:rPr>
+        <w:t>and also</w:t>
+      </w:r>
+      <w:proofErr w:type="gramEnd"/>
+      <w:r>
+        <w:rPr>
+          <w:rFonts w:ascii="Arial" w:hAnsi="Arial" w:cs="Arial"/>
+          <w:iCs/>
+          <w:color w:val="000000" w:themeColor="text1"/>
+          <w:sz w:val="20"/>
+          <w:szCs w:val="20"/>
+          <w:bdr w:val="none" w:sz="0" w:space="0" w:color="auto" w:frame="1"/>
+        </w:rPr>
+        <w:t xml:space="preserve"> use no cookies.</w:t>
       </w:r>
     </w:p>
     <w:p>
@@ -974,40 +1035,7 @@
           <w:szCs w:val="20"/>
           <w:bdr w:val="none" w:sz="0" w:space="0" w:color="auto" w:frame="1"/>
         </w:rPr>
-        <w:t xml:space="preserve">Card price data should periodically be refreshed </w:t>
-      </w:r>
-      <w:r>
-        <w:rPr>
-          <w:rFonts w:ascii="Arial" w:hAnsi="Arial" w:cs="Arial"/>
-          <w:iCs/>
-          <w:color w:val="000000" w:themeColor="text1"/>
-          <w:sz w:val="20"/>
-          <w:szCs w:val="20"/>
-          <w:bdr w:val="none" w:sz="0" w:space="0" w:color="auto" w:frame="1"/>
-        </w:rPr>
-        <w:t>to allow</w:t>
-      </w:r>
-      <w:r>
-        <w:rPr>
-          <w:rFonts w:ascii="Arial" w:hAnsi="Arial" w:cs="Arial"/>
-          <w:iCs/>
-          <w:color w:val="000000" w:themeColor="text1"/>
-          <w:sz w:val="20"/>
-          <w:szCs w:val="20"/>
-          <w:bdr w:val="none" w:sz="0" w:space="0" w:color="auto" w:frame="1"/>
-        </w:rPr>
-        <w:t xml:space="preserve"> users to receive alerts without requiring </w:t>
-      </w:r>
-      <w:r>
-        <w:rPr>
-          <w:rFonts w:ascii="Arial" w:hAnsi="Arial" w:cs="Arial"/>
-          <w:iCs/>
-          <w:color w:val="000000" w:themeColor="text1"/>
-          <w:sz w:val="20"/>
-          <w:szCs w:val="20"/>
-          <w:bdr w:val="none" w:sz="0" w:space="0" w:color="auto" w:frame="1"/>
-        </w:rPr>
-        <w:t>manual querying.</w:t>
+        <w:t>There should be a navigation bar at the top of the screen to make navigation simple and easy to understand.</w:t>
       </w:r>
     </w:p>
     <w:p>
@@ -1019,9 +1047,12 @@
         </w:numPr>
         <w:shd w:val="clear" w:color="auto" w:fill="FFFFFF"/>
         <w:rPr>
-          <w:rFonts w:ascii="Lucida Grande" w:hAnsi="Lucida Grande" w:cs="Lucida Grande"/>
+          <w:rFonts w:ascii="Arial" w:hAnsi="Arial" w:cs="Arial"/>
           <w:iCs/>
           <w:color w:val="000000" w:themeColor="text1"/>
+          <w:sz w:val="20"/>
+          <w:szCs w:val="20"/>
+          <w:bdr w:val="none" w:sz="0" w:space="0" w:color="auto" w:frame="1"/>
         </w:rPr>
       </w:pPr>
       <w:r>
@@ -1033,7 +1064,7 @@
           <w:szCs w:val="20"/>
           <w:bdr w:val="none" w:sz="0" w:space="0" w:color="auto" w:frame="1"/>
         </w:rPr>
-        <w:t>Users should be able to easily remove cards from their list.</w:t>
+        <w:t>Logged in users should not be able to go to login and signup page while non-signed in users should not be able to go to login pages like dashboard and account.</w:t>
       </w:r>
     </w:p>
     <w:p>
@@ -1045,9 +1076,12 @@
         </w:numPr>
         <w:shd w:val="clear" w:color="auto" w:fill="FFFFFF"/>
         <w:rPr>
-          <w:rFonts w:ascii="Lucida Grande" w:hAnsi="Lucida Grande" w:cs="Lucida Grande"/>
+          <w:rFonts w:ascii="Arial" w:hAnsi="Arial" w:cs="Arial"/>
           <w:iCs/>
           <w:color w:val="000000" w:themeColor="text1"/>
+          <w:sz w:val="20"/>
+          <w:szCs w:val="20"/>
+          <w:bdr w:val="none" w:sz="0" w:space="0" w:color="auto" w:frame="1"/>
         </w:rPr>
       </w:pPr>
       <w:r>
@@ -1059,7 +1093,7 @@
           <w:szCs w:val="20"/>
           <w:bdr w:val="none" w:sz="0" w:space="0" w:color="auto" w:frame="1"/>
         </w:rPr>
-        <w:t>Users’ passwords should be hashed and require a certain minimum character count.</w:t>
+        <w:t>The website routes should be strict depending on if the user is logged in (logged in users should not be able to go to the login or signup pages and vice versa).</w:t>
       </w:r>
     </w:p>
     <w:p>
@@ -1088,7 +1122,40 @@
           <w:szCs w:val="20"/>
           <w:bdr w:val="none" w:sz="0" w:space="0" w:color="auto" w:frame="1"/>
         </w:rPr>
-        <w:t>Users should be required to verify their email.</w:t>
+        <w:t xml:space="preserve">Card price data should periodically be refreshed </w:t>
+      </w:r>
+      <w:r>
+        <w:rPr>
+          <w:rFonts w:ascii="Arial" w:hAnsi="Arial" w:cs="Arial"/>
+          <w:iCs/>
+          <w:color w:val="000000" w:themeColor="text1"/>
+          <w:sz w:val="20"/>
+          <w:szCs w:val="20"/>
+          <w:bdr w:val="none" w:sz="0" w:space="0" w:color="auto" w:frame="1"/>
+        </w:rPr>
+        <w:t>to allow</w:t>
+      </w:r>
+      <w:r>
+        <w:rPr>
+          <w:rFonts w:ascii="Arial" w:hAnsi="Arial" w:cs="Arial"/>
+          <w:iCs/>
+          <w:color w:val="000000" w:themeColor="text1"/>
+          <w:sz w:val="20"/>
+          <w:szCs w:val="20"/>
+          <w:bdr w:val="none" w:sz="0" w:space="0" w:color="auto" w:frame="1"/>
+        </w:rPr>
+        <w:t xml:space="preserve"> users to receive alerts without requiring </w:t>
+      </w:r>
+      <w:r>
+        <w:rPr>
+          <w:rFonts w:ascii="Arial" w:hAnsi="Arial" w:cs="Arial"/>
+          <w:iCs/>
+          <w:color w:val="000000" w:themeColor="text1"/>
+          <w:sz w:val="20"/>
+          <w:szCs w:val="20"/>
+          <w:bdr w:val="none" w:sz="0" w:space="0" w:color="auto" w:frame="1"/>
+        </w:rPr>
+        <w:t>manual querying.</w:t>
       </w:r>
     </w:p>
     <w:p>
@@ -1100,12 +1167,9 @@
         </w:numPr>
         <w:shd w:val="clear" w:color="auto" w:fill="FFFFFF"/>
         <w:rPr>
-          <w:rFonts w:ascii="Arial" w:hAnsi="Arial" w:cs="Arial"/>
+          <w:rFonts w:ascii="Lucida Grande" w:hAnsi="Lucida Grande" w:cs="Lucida Grande"/>
           <w:iCs/>
           <w:color w:val="000000" w:themeColor="text1"/>
-          <w:sz w:val="20"/>
-          <w:szCs w:val="20"/>
-          <w:bdr w:val="none" w:sz="0" w:space="0" w:color="auto" w:frame="1"/>
         </w:rPr>
       </w:pPr>
       <w:r>
@@ -1117,7 +1181,7 @@
           <w:szCs w:val="20"/>
           <w:bdr w:val="none" w:sz="0" w:space="0" w:color="auto" w:frame="1"/>
         </w:rPr>
-        <w:t>There should be a navigation bar at the top of the screen to make navigation simple and easy to understand.</w:t>
+        <w:t>Users should be able to easily remove cards from their list.</w:t>
       </w:r>
     </w:p>
     <w:p>
@@ -1129,12 +1193,9 @@
         </w:numPr>
         <w:shd w:val="clear" w:color="auto" w:fill="FFFFFF"/>
         <w:rPr>
-          <w:rFonts w:ascii="Arial" w:hAnsi="Arial" w:cs="Arial"/>
+          <w:rFonts w:ascii="Lucida Grande" w:hAnsi="Lucida Grande" w:cs="Lucida Grande"/>
           <w:iCs/>
           <w:color w:val="000000" w:themeColor="text1"/>
-          <w:sz w:val="20"/>
-          <w:szCs w:val="20"/>
-          <w:bdr w:val="none" w:sz="0" w:space="0" w:color="auto" w:frame="1"/>
         </w:rPr>
       </w:pPr>
       <w:r>
@@ -1146,7 +1207,7 @@
           <w:szCs w:val="20"/>
           <w:bdr w:val="none" w:sz="0" w:space="0" w:color="auto" w:frame="1"/>
         </w:rPr>
-        <w:t>Logged in users should not be able to go to login and signup page while non-signed in users should not be able to go to login pages like dashboard and account.</w:t>
+        <w:t>Users’ passwords should be hashed and require a certain minimum character count.</w:t>
       </w:r>
     </w:p>
     <w:p>
@@ -1166,6 +1227,75 @@
           <w:bdr w:val="none" w:sz="0" w:space="0" w:color="auto" w:frame="1"/>
         </w:rPr>
       </w:pPr>
+      <w:r>
+        <w:rPr>
+          <w:rFonts w:ascii="Arial" w:hAnsi="Arial" w:cs="Arial"/>
+          <w:iCs/>
+          <w:color w:val="000000" w:themeColor="text1"/>
+          <w:sz w:val="20"/>
+          <w:szCs w:val="20"/>
+          <w:bdr w:val="none" w:sz="0" w:space="0" w:color="auto" w:frame="1"/>
+        </w:rPr>
+        <w:t>Users should be able to change their email and password.</w:t>
+      </w:r>
+    </w:p>
+    <w:p>
+      <w:pPr>
+        <w:pStyle w:val="ListParagraph"/>
+        <w:numPr>
+          <w:ilvl w:val="0"/>
+          <w:numId w:val="40"/>
+        </w:numPr>
+        <w:shd w:val="clear" w:color="auto" w:fill="FFFFFF"/>
+        <w:rPr>
+          <w:rFonts w:ascii="Arial" w:hAnsi="Arial" w:cs="Arial"/>
+          <w:iCs/>
+          <w:color w:val="000000" w:themeColor="text1"/>
+          <w:sz w:val="20"/>
+          <w:szCs w:val="20"/>
+          <w:bdr w:val="none" w:sz="0" w:space="0" w:color="auto" w:frame="1"/>
+        </w:rPr>
+      </w:pPr>
+      <w:r>
+        <w:rPr>
+          <w:rFonts w:ascii="Arial" w:hAnsi="Arial" w:cs="Arial"/>
+          <w:iCs/>
+          <w:color w:val="000000" w:themeColor="text1"/>
+          <w:sz w:val="20"/>
+          <w:szCs w:val="20"/>
+          <w:bdr w:val="none" w:sz="0" w:space="0" w:color="auto" w:frame="1"/>
+        </w:rPr>
+        <w:t>Users should be able to delete their account.</w:t>
+      </w:r>
+    </w:p>
+    <w:p>
+      <w:pPr>
+        <w:pStyle w:val="ListParagraph"/>
+        <w:numPr>
+          <w:ilvl w:val="0"/>
+          <w:numId w:val="40"/>
+        </w:numPr>
+        <w:shd w:val="clear" w:color="auto" w:fill="FFFFFF"/>
+        <w:rPr>
+          <w:rFonts w:ascii="Arial" w:hAnsi="Arial" w:cs="Arial"/>
+          <w:iCs/>
+          <w:color w:val="000000" w:themeColor="text1"/>
+          <w:sz w:val="20"/>
+          <w:szCs w:val="20"/>
+          <w:bdr w:val="none" w:sz="0" w:space="0" w:color="auto" w:frame="1"/>
+        </w:rPr>
+      </w:pPr>
+      <w:r>
+        <w:rPr>
+          <w:rFonts w:ascii="Arial" w:hAnsi="Arial" w:cs="Arial"/>
+          <w:iCs/>
+          <w:color w:val="000000" w:themeColor="text1"/>
+          <w:sz w:val="20"/>
+          <w:szCs w:val="20"/>
+          <w:bdr w:val="none" w:sz="0" w:space="0" w:color="auto" w:frame="1"/>
+        </w:rPr>
+        <w:t>Users should be able to track a card with optional thresholds that will email the user if those thresholds are reached.</w:t>
+      </w:r>
     </w:p>
     <w:p>
       <w:pPr>
@@ -1517,27 +1647,61 @@
           <w:szCs w:val="20"/>
           <w:bdr w:val="none" w:sz="0" w:space="0" w:color="auto" w:frame="1"/>
         </w:rPr>
-        <w:t xml:space="preserve"> python and NPM for the basic pieces. The automation scripts that are used to develop and set up the environment are </w:t>
-      </w:r>
-      <w:r>
-        <w:rPr>
-          <w:rFonts w:ascii="Arial" w:hAnsi="Arial" w:cs="Arial"/>
-          <w:color w:val="000000" w:themeColor="text1"/>
-          <w:sz w:val="20"/>
-          <w:szCs w:val="20"/>
-          <w:bdr w:val="none" w:sz="0" w:space="0" w:color="auto" w:frame="1"/>
-        </w:rPr>
-        <w:t>set up</w:t>
-      </w:r>
-      <w:r>
-        <w:rPr>
-          <w:rFonts w:ascii="Arial" w:hAnsi="Arial" w:cs="Arial"/>
-          <w:color w:val="000000" w:themeColor="text1"/>
-          <w:sz w:val="20"/>
-          <w:szCs w:val="20"/>
-          <w:bdr w:val="none" w:sz="0" w:space="0" w:color="auto" w:frame="1"/>
-        </w:rPr>
-        <w:t xml:space="preserve"> strictly for Windows, but may be changed later depending on if we plan on deploying the web app.</w:t>
+        <w:t xml:space="preserve"> python and NPM for the basic pieces. </w:t>
+      </w:r>
+      <w:r>
+        <w:rPr>
+          <w:rFonts w:ascii="Arial" w:hAnsi="Arial" w:cs="Arial"/>
+          <w:color w:val="000000" w:themeColor="text1"/>
+          <w:sz w:val="20"/>
+          <w:szCs w:val="20"/>
+          <w:bdr w:val="none" w:sz="0" w:space="0" w:color="auto" w:frame="1"/>
+        </w:rPr>
+        <w:t xml:space="preserve">Some of the automation scripts that we wrote to develop the project are still built strictly as .ps1 files for </w:t>
+      </w:r>
+      <w:proofErr w:type="gramStart"/>
+      <w:r>
+        <w:rPr>
+          <w:rFonts w:ascii="Arial" w:hAnsi="Arial" w:cs="Arial"/>
+          <w:color w:val="000000" w:themeColor="text1"/>
+          <w:sz w:val="20"/>
+          <w:szCs w:val="20"/>
+          <w:bdr w:val="none" w:sz="0" w:space="0" w:color="auto" w:frame="1"/>
+        </w:rPr>
+        <w:t>Windows, but</w:t>
+      </w:r>
+      <w:proofErr w:type="gramEnd"/>
+      <w:r>
+        <w:rPr>
+          <w:rFonts w:ascii="Arial" w:hAnsi="Arial" w:cs="Arial"/>
+          <w:color w:val="000000" w:themeColor="text1"/>
+          <w:sz w:val="20"/>
+          <w:szCs w:val="20"/>
+          <w:bdr w:val="none" w:sz="0" w:space="0" w:color="auto" w:frame="1"/>
+        </w:rPr>
+        <w:t xml:space="preserve"> running and downloading dependencies </w:t>
+      </w:r>
+      <w:proofErr w:type="gramStart"/>
+      <w:r>
+        <w:rPr>
+          <w:rFonts w:ascii="Arial" w:hAnsi="Arial" w:cs="Arial"/>
+          <w:color w:val="000000" w:themeColor="text1"/>
+          <w:sz w:val="20"/>
+          <w:szCs w:val="20"/>
+          <w:bdr w:val="none" w:sz="0" w:space="0" w:color="auto" w:frame="1"/>
+        </w:rPr>
+        <w:t>is</w:t>
+      </w:r>
+      <w:proofErr w:type="gramEnd"/>
+      <w:r>
+        <w:rPr>
+          <w:rFonts w:ascii="Arial" w:hAnsi="Arial" w:cs="Arial"/>
+          <w:color w:val="000000" w:themeColor="text1"/>
+          <w:sz w:val="20"/>
+          <w:szCs w:val="20"/>
+          <w:bdr w:val="none" w:sz="0" w:space="0" w:color="auto" w:frame="1"/>
+        </w:rPr>
+        <w:t xml:space="preserve"> now designated to python scripts allowing developers to develop on other machine types.</w:t>
       </w:r>
     </w:p>
     <w:p>

</xml_diff>